<commit_message>
Begun work on camera
</commit_message>
<xml_diff>
--- a/Documentation/Project Technical Report WIP.docx
+++ b/Documentation/Project Technical Report WIP.docx
@@ -2634,37 +2634,6 @@
     </w:p>
     <w:p>
       <w:pPr>
-        <w:spacing w:after="0" w:line="360" w:lineRule="auto"/>
-        <w:jc w:val="both"/>
-        <w:rPr>
-          <w:sz w:val="24"/>
-          <w:szCs w:val="24"/>
-        </w:rPr>
-      </w:pPr>
-      <w:r>
-        <w:rPr>
-          <w:sz w:val="24"/>
-          <w:szCs w:val="24"/>
-        </w:rPr>
-        <w:t>The text for each section should begin exactly under the section title. The text should wrap around at that same point as can be seen fr</w:t>
-      </w:r>
-      <w:r>
-        <w:rPr>
-          <w:sz w:val="24"/>
-          <w:szCs w:val="24"/>
-        </w:rPr>
-        <w:t>om this sample paragraph. A blan</w:t>
-      </w:r>
-      <w:r>
-        <w:rPr>
-          <w:sz w:val="24"/>
-          <w:szCs w:val="24"/>
-        </w:rPr>
-        <w:t>k line should follow every paragraph.</w:t>
-      </w:r>
-    </w:p>
-    <w:p>
-      <w:pPr>
         <w:pStyle w:val="ListParagraph"/>
         <w:spacing w:after="0" w:line="360" w:lineRule="auto"/>
         <w:ind w:left="1134"/>
@@ -2674,6 +2643,13 @@
           <w:szCs w:val="24"/>
         </w:rPr>
       </w:pPr>
+      <w:r>
+        <w:rPr>
+          <w:sz w:val="24"/>
+          <w:szCs w:val="24"/>
+        </w:rPr>
+        <w:t>-compare two methodologies</w:t>
+      </w:r>
     </w:p>
     <w:p>
       <w:pPr>
@@ -2692,23 +2668,6 @@
     </w:p>
     <w:p>
       <w:pPr>
-        <w:spacing w:after="0" w:line="360" w:lineRule="auto"/>
-        <w:jc w:val="both"/>
-        <w:rPr>
-          <w:sz w:val="24"/>
-          <w:szCs w:val="24"/>
-        </w:rPr>
-      </w:pPr>
-      <w:r>
-        <w:rPr>
-          <w:sz w:val="24"/>
-          <w:szCs w:val="24"/>
-        </w:rPr>
-        <w:t xml:space="preserve">This document is provided to demonstrate the layout for headings, image captions, etc. Where third level headings are required a further numbered list may be used providing that the items constitute more than one line per section. </w:t>
-      </w:r>
-    </w:p>
-    <w:p>
-      <w:pPr>
         <w:pStyle w:val="ListParagraph"/>
         <w:spacing w:after="0" w:line="360" w:lineRule="auto"/>
         <w:ind w:left="1134"/>
@@ -2718,6 +2677,51 @@
           <w:szCs w:val="24"/>
         </w:rPr>
       </w:pPr>
+      <w:r>
+        <w:rPr>
+          <w:sz w:val="24"/>
+          <w:szCs w:val="24"/>
+        </w:rPr>
+        <w:t>-build 2 game demos</w:t>
+      </w:r>
+    </w:p>
+    <w:p>
+      <w:pPr>
+        <w:pStyle w:val="ListParagraph"/>
+        <w:spacing w:after="0" w:line="360" w:lineRule="auto"/>
+        <w:ind w:left="1134"/>
+        <w:jc w:val="both"/>
+        <w:rPr>
+          <w:sz w:val="24"/>
+          <w:szCs w:val="24"/>
+        </w:rPr>
+      </w:pPr>
+      <w:r>
+        <w:rPr>
+          <w:sz w:val="24"/>
+          <w:szCs w:val="24"/>
+        </w:rPr>
+        <w:t>-test</w:t>
+      </w:r>
+    </w:p>
+    <w:p>
+      <w:pPr>
+        <w:pStyle w:val="ListParagraph"/>
+        <w:spacing w:after="0" w:line="360" w:lineRule="auto"/>
+        <w:ind w:left="1134"/>
+        <w:jc w:val="both"/>
+        <w:rPr>
+          <w:sz w:val="24"/>
+          <w:szCs w:val="24"/>
+        </w:rPr>
+      </w:pPr>
+      <w:r>
+        <w:rPr>
+          <w:sz w:val="24"/>
+          <w:szCs w:val="24"/>
+        </w:rPr>
+        <w:t>-analyse results</w:t>
+      </w:r>
     </w:p>
     <w:p>
       <w:pPr>
@@ -2750,23 +2754,7 @@
           <w:sz w:val="24"/>
           <w:szCs w:val="24"/>
         </w:rPr>
-        <w:t xml:space="preserve">Where one line of text is </w:t>
-      </w:r>
-      <w:proofErr w:type="gramStart"/>
-      <w:r>
-        <w:rPr>
-          <w:sz w:val="24"/>
-          <w:szCs w:val="24"/>
-        </w:rPr>
-        <w:t>required</w:t>
-      </w:r>
-      <w:proofErr w:type="gramEnd"/>
-      <w:r>
-        <w:rPr>
-          <w:sz w:val="24"/>
-          <w:szCs w:val="24"/>
-        </w:rPr>
-        <w:t xml:space="preserve"> a bulleted list should replace the heading. This is done to aid the legibility of the final document.</w:t>
+        <w:t>Where one line of text is required a bulleted list should replace the heading. This is done to aid the legibility of the final document.</w:t>
       </w:r>
     </w:p>
     <w:p>
@@ -2828,13 +2816,8 @@
         <w:pStyle w:val="Heading4"/>
       </w:pPr>
       <w:r>
-        <w:t xml:space="preserve">1.2.2.1 Fourth </w:t>
-      </w:r>
-      <w:proofErr w:type="gramStart"/>
-      <w:r>
-        <w:t>sub heading</w:t>
-      </w:r>
-      <w:proofErr w:type="gramEnd"/>
+        <w:t>1.2.2.1 Fourth sub heading</w:t>
+      </w:r>
     </w:p>
     <w:p>
       <w:pPr>
@@ -2882,6 +2865,11 @@
     </w:p>
     <w:p>
       <w:pPr>
+        <w:pStyle w:val="ListParagraph"/>
+        <w:numPr>
+          <w:ilvl w:val="0"/>
+          <w:numId w:val="22"/>
+        </w:numPr>
         <w:spacing w:after="0" w:line="360" w:lineRule="auto"/>
         <w:jc w:val="both"/>
         <w:rPr>
@@ -2894,7 +2882,51 @@
           <w:sz w:val="24"/>
           <w:szCs w:val="24"/>
         </w:rPr>
-        <w:t>Remember that the headings presented here are exemplars only. Select the most appropriate heading for the given data being presented.</w:t>
+        <w:t>Limited methodologies</w:t>
+      </w:r>
+    </w:p>
+    <w:p>
+      <w:pPr>
+        <w:pStyle w:val="ListParagraph"/>
+        <w:numPr>
+          <w:ilvl w:val="0"/>
+          <w:numId w:val="22"/>
+        </w:numPr>
+        <w:spacing w:after="0" w:line="360" w:lineRule="auto"/>
+        <w:jc w:val="both"/>
+        <w:rPr>
+          <w:sz w:val="24"/>
+          <w:szCs w:val="24"/>
+        </w:rPr>
+      </w:pPr>
+      <w:r>
+        <w:rPr>
+          <w:sz w:val="24"/>
+          <w:szCs w:val="24"/>
+        </w:rPr>
+        <w:t>Limited length</w:t>
+      </w:r>
+    </w:p>
+    <w:p>
+      <w:pPr>
+        <w:pStyle w:val="ListParagraph"/>
+        <w:numPr>
+          <w:ilvl w:val="0"/>
+          <w:numId w:val="22"/>
+        </w:numPr>
+        <w:spacing w:after="0" w:line="360" w:lineRule="auto"/>
+        <w:jc w:val="both"/>
+        <w:rPr>
+          <w:sz w:val="24"/>
+          <w:szCs w:val="24"/>
+        </w:rPr>
+      </w:pPr>
+      <w:r>
+        <w:rPr>
+          <w:sz w:val="24"/>
+          <w:szCs w:val="24"/>
+        </w:rPr>
+        <w:t>Limited complexity</w:t>
       </w:r>
     </w:p>
     <w:p>
@@ -2908,7 +2940,6 @@
       </w:pPr>
       <w:bookmarkStart w:id="10" w:name="_Toc193990926"/>
       <w:r>
-        <w:lastRenderedPageBreak/>
         <w:t>Definitions and Acronyms</w:t>
       </w:r>
       <w:bookmarkEnd w:id="10"/>
@@ -2981,78 +3012,6 @@
           <w:szCs w:val="24"/>
         </w:rPr>
       </w:pPr>
-      <w:r>
-        <w:rPr>
-          <w:noProof/>
-          <w:sz w:val="24"/>
-          <w:szCs w:val="24"/>
-          <w:lang w:eastAsia="en-IE"/>
-        </w:rPr>
-        <w:drawing>
-          <wp:inline distT="0" distB="0" distL="0" distR="0" wp14:anchorId="3D001103" wp14:editId="469970B6">
-            <wp:extent cx="3154750" cy="1158334"/>
-            <wp:effectExtent l="0" t="0" r="7620" b="3810"/>
-            <wp:docPr id="4" name="Picture 4"/>
-            <wp:cNvGraphicFramePr>
-              <a:graphicFrameLocks xmlns:a="http://schemas.openxmlformats.org/drawingml/2006/main" noChangeAspect="1"/>
-            </wp:cNvGraphicFramePr>
-            <a:graphic xmlns:a="http://schemas.openxmlformats.org/drawingml/2006/main">
-              <a:graphicData uri="http://schemas.openxmlformats.org/drawingml/2006/picture">
-                <pic:pic xmlns:pic="http://schemas.openxmlformats.org/drawingml/2006/picture">
-                  <pic:nvPicPr>
-                    <pic:cNvPr id="4" name="ATU-LOGO-DONEGAL.png"/>
-                    <pic:cNvPicPr/>
-                  </pic:nvPicPr>
-                  <pic:blipFill>
-                    <a:blip r:embed="rId10">
-                      <a:extLst>
-                        <a:ext uri="{28A0092B-C50C-407E-A947-70E740481C1C}">
-                          <a14:useLocalDpi xmlns:a14="http://schemas.microsoft.com/office/drawing/2010/main" val="0"/>
-                        </a:ext>
-                      </a:extLst>
-                    </a:blip>
-                    <a:stretch>
-                      <a:fillRect/>
-                    </a:stretch>
-                  </pic:blipFill>
-                  <pic:spPr>
-                    <a:xfrm>
-                      <a:off x="0" y="0"/>
-                      <a:ext cx="3177643" cy="1166740"/>
-                    </a:xfrm>
-                    <a:prstGeom prst="rect">
-                      <a:avLst/>
-                    </a:prstGeom>
-                  </pic:spPr>
-                </pic:pic>
-              </a:graphicData>
-            </a:graphic>
-          </wp:inline>
-        </w:drawing>
-      </w:r>
-    </w:p>
-    <w:p>
-      <w:pPr>
-        <w:pStyle w:val="Caption"/>
-      </w:pPr>
-      <w:bookmarkStart w:id="11" w:name="_Toc193456586"/>
-      <w:bookmarkStart w:id="12" w:name="_Toc193456844"/>
-      <w:r>
-        <w:t xml:space="preserve">Figure </w:t>
-      </w:r>
-      <w:fldSimple w:instr=" SEQ Figure \* ARABIC ">
-        <w:r>
-          <w:t>1</w:t>
-        </w:r>
-      </w:fldSimple>
-      <w:r>
-        <w:t xml:space="preserve"> </w:t>
-      </w:r>
-      <w:r>
-        <w:t>Atlantic Technological University Donegal Logo</w:t>
-      </w:r>
-      <w:bookmarkEnd w:id="11"/>
-      <w:bookmarkEnd w:id="12"/>
     </w:p>
     <w:p>
       <w:pPr>
@@ -3066,149 +3025,8 @@
     </w:p>
     <w:p>
       <w:pPr>
-        <w:spacing w:after="0" w:line="360" w:lineRule="auto"/>
-        <w:jc w:val="both"/>
-        <w:rPr>
-          <w:sz w:val="24"/>
-          <w:szCs w:val="24"/>
-        </w:rPr>
-      </w:pPr>
-      <w:proofErr w:type="gramStart"/>
-      <w:r>
-        <w:rPr>
-          <w:sz w:val="24"/>
-          <w:szCs w:val="24"/>
-        </w:rPr>
-        <w:t>In order to</w:t>
-      </w:r>
-      <w:proofErr w:type="gramEnd"/>
-      <w:r>
-        <w:rPr>
-          <w:sz w:val="24"/>
-          <w:szCs w:val="24"/>
-        </w:rPr>
-        <w:t xml:space="preserve"> provide a caption for an image, table or equation the item should be selected. The Microsoft References ribbon should be selected. From there the Insert Caption button should be selected. The label should be set to the most appropriate one. In this example the Figure label was selected. New labels can be created as necessary. Remember not to simply copy and paste from above. Instead insert the image into the file and select it. Add the caption as described.</w:t>
-      </w:r>
-    </w:p>
-    <w:p>
-      <w:pPr>
-        <w:spacing w:after="0" w:line="360" w:lineRule="auto"/>
-        <w:jc w:val="both"/>
-        <w:rPr>
-          <w:sz w:val="24"/>
-          <w:szCs w:val="24"/>
-        </w:rPr>
-      </w:pPr>
-      <w:r>
-        <w:rPr>
-          <w:sz w:val="24"/>
-          <w:szCs w:val="24"/>
-        </w:rPr>
-        <w:t>Where an image does not have a clearly defined border, one should be added. Care should be taken to ensure that all details of images are clearly visible both when in print and when in electronic format. Careful selection of colours should be considered for this purpose. Images as shown in Figure 2 should always be referred to from the main text.</w:t>
-      </w:r>
-    </w:p>
-    <w:p>
-      <w:pPr>
-        <w:spacing w:after="0" w:line="360" w:lineRule="auto"/>
-        <w:jc w:val="both"/>
-        <w:rPr>
-          <w:sz w:val="24"/>
-          <w:szCs w:val="24"/>
-        </w:rPr>
-      </w:pPr>
-    </w:p>
-    <w:p>
-      <w:pPr>
-        <w:spacing w:after="0" w:line="360" w:lineRule="auto"/>
-        <w:jc w:val="center"/>
-        <w:rPr>
-          <w:sz w:val="24"/>
-          <w:szCs w:val="24"/>
-        </w:rPr>
-      </w:pPr>
-      <w:r>
-        <w:rPr>
-          <w:noProof/>
-          <w:bdr w:val="single" w:sz="4" w:space="0" w:color="auto"/>
-          <w:lang w:eastAsia="en-IE"/>
-        </w:rPr>
-        <w:drawing>
-          <wp:inline distT="0" distB="0" distL="0" distR="0" wp14:anchorId="0785E10B" wp14:editId="36171E31">
-            <wp:extent cx="2859405" cy="1146810"/>
-            <wp:effectExtent l="0" t="0" r="0" b="0"/>
-            <wp:docPr id="1" name="Picture 1" descr="https://upload.wikimedia.org/wikipedia/commons/thumb/e/e4/LYIT.jpg/300px-LYIT.jpg"/>
-            <wp:cNvGraphicFramePr>
-              <a:graphicFrameLocks xmlns:a="http://schemas.openxmlformats.org/drawingml/2006/main" noChangeAspect="1"/>
-            </wp:cNvGraphicFramePr>
-            <a:graphic xmlns:a="http://schemas.openxmlformats.org/drawingml/2006/main">
-              <a:graphicData uri="http://schemas.openxmlformats.org/drawingml/2006/picture">
-                <pic:pic xmlns:pic="http://schemas.openxmlformats.org/drawingml/2006/picture">
-                  <pic:nvPicPr>
-                    <pic:cNvPr id="0" name="Picture 1" descr="https://upload.wikimedia.org/wikipedia/commons/thumb/e/e4/LYIT.jpg/300px-LYIT.jpg"/>
-                    <pic:cNvPicPr>
-                      <a:picLocks noChangeAspect="1" noChangeArrowheads="1"/>
-                    </pic:cNvPicPr>
-                  </pic:nvPicPr>
-                  <pic:blipFill>
-                    <a:blip r:embed="rId11">
-                      <a:extLst>
-                        <a:ext uri="{28A0092B-C50C-407E-A947-70E740481C1C}">
-                          <a14:useLocalDpi xmlns:a14="http://schemas.microsoft.com/office/drawing/2010/main" val="0"/>
-                        </a:ext>
-                      </a:extLst>
-                    </a:blip>
-                    <a:srcRect/>
-                    <a:stretch>
-                      <a:fillRect/>
-                    </a:stretch>
-                  </pic:blipFill>
-                  <pic:spPr bwMode="auto">
-                    <a:xfrm>
-                      <a:off x="0" y="0"/>
-                      <a:ext cx="2859405" cy="1146810"/>
-                    </a:xfrm>
-                    <a:prstGeom prst="rect">
-                      <a:avLst/>
-                    </a:prstGeom>
-                    <a:noFill/>
-                    <a:ln>
-                      <a:noFill/>
-                    </a:ln>
-                  </pic:spPr>
-                </pic:pic>
-              </a:graphicData>
-            </a:graphic>
-          </wp:inline>
-        </w:drawing>
-      </w:r>
-    </w:p>
-    <w:p>
-      <w:pPr>
         <w:pStyle w:val="Caption"/>
       </w:pPr>
-    </w:p>
-    <w:p>
-      <w:pPr>
-        <w:pStyle w:val="Caption"/>
-      </w:pPr>
-      <w:bookmarkStart w:id="13" w:name="_Toc193456587"/>
-      <w:bookmarkStart w:id="14" w:name="_Toc193456845"/>
-      <w:r>
-        <w:t xml:space="preserve">Figure </w:t>
-      </w:r>
-      <w:fldSimple w:instr=" SEQ Figure \* ARABIC ">
-        <w:r>
-          <w:t>2</w:t>
-        </w:r>
-      </w:fldSimple>
-      <w:r>
-        <w:t xml:space="preserve"> </w:t>
-      </w:r>
-      <w:r>
-        <w:t>ATU Donegal, Letterkenny</w:t>
-      </w:r>
-      <w:bookmarkEnd w:id="13"/>
-      <w:bookmarkEnd w:id="14"/>
     </w:p>
     <w:p>
       <w:pPr>
@@ -3243,12 +3061,12 @@
         </w:numPr>
         <w:ind w:left="567" w:hanging="567"/>
       </w:pPr>
-      <w:bookmarkStart w:id="15" w:name="_Toc193990927"/>
+      <w:bookmarkStart w:id="11" w:name="_Toc193990927"/>
       <w:r>
         <w:lastRenderedPageBreak/>
         <w:t>Requirements</w:t>
       </w:r>
-      <w:bookmarkEnd w:id="15"/>
+      <w:bookmarkEnd w:id="11"/>
     </w:p>
     <w:p>
       <w:pPr>
@@ -3411,11 +3229,11 @@
         </w:numPr>
         <w:ind w:left="851" w:hanging="851"/>
       </w:pPr>
-      <w:bookmarkStart w:id="16" w:name="_Toc193990928"/>
+      <w:bookmarkStart w:id="12" w:name="_Toc193990928"/>
       <w:r>
         <w:t>Functional Requirements</w:t>
       </w:r>
-      <w:bookmarkEnd w:id="16"/>
+      <w:bookmarkEnd w:id="12"/>
     </w:p>
     <w:p>
       <w:pPr>
@@ -3453,11 +3271,11 @@
         </w:numPr>
         <w:ind w:hanging="792"/>
       </w:pPr>
-      <w:bookmarkStart w:id="17" w:name="_Toc193990929"/>
+      <w:bookmarkStart w:id="13" w:name="_Toc193990929"/>
       <w:r>
         <w:t>Non-Functional Requirements</w:t>
       </w:r>
-      <w:bookmarkEnd w:id="17"/>
+      <w:bookmarkEnd w:id="13"/>
     </w:p>
     <w:p>
       <w:pPr>
@@ -3485,409 +3303,6 @@
           <w:szCs w:val="24"/>
         </w:rPr>
       </w:pPr>
-    </w:p>
-    <w:p>
-      <w:pPr>
-        <w:pStyle w:val="Heading2"/>
-        <w:numPr>
-          <w:ilvl w:val="1"/>
-          <w:numId w:val="3"/>
-        </w:numPr>
-        <w:ind w:left="851" w:hanging="851"/>
-      </w:pPr>
-      <w:bookmarkStart w:id="18" w:name="_Toc193990930"/>
-      <w:r>
-        <w:t>Table Section</w:t>
-      </w:r>
-      <w:bookmarkEnd w:id="18"/>
-    </w:p>
-    <w:p>
-      <w:pPr>
-        <w:spacing w:after="0" w:line="360" w:lineRule="auto"/>
-        <w:jc w:val="both"/>
-        <w:rPr>
-          <w:sz w:val="24"/>
-          <w:szCs w:val="24"/>
-        </w:rPr>
-      </w:pPr>
-      <w:r>
-        <w:rPr>
-          <w:sz w:val="24"/>
-          <w:szCs w:val="24"/>
-        </w:rPr>
-        <w:t xml:space="preserve">The text of any chapter may include tabular data. </w:t>
-      </w:r>
-      <w:proofErr w:type="gramStart"/>
-      <w:r>
-        <w:rPr>
-          <w:sz w:val="24"/>
-          <w:szCs w:val="24"/>
-        </w:rPr>
-        <w:t>In order to</w:t>
-      </w:r>
-      <w:proofErr w:type="gramEnd"/>
-      <w:r>
-        <w:rPr>
-          <w:sz w:val="24"/>
-          <w:szCs w:val="24"/>
-        </w:rPr>
-        <w:t xml:space="preserve"> aid legibility some simple guidelines should be adhered to. Refer to Table 1.</w:t>
-      </w:r>
-    </w:p>
-    <w:p>
-      <w:pPr>
-        <w:spacing w:after="0" w:line="360" w:lineRule="auto"/>
-        <w:ind w:left="851"/>
-        <w:jc w:val="both"/>
-        <w:rPr>
-          <w:sz w:val="24"/>
-          <w:szCs w:val="24"/>
-        </w:rPr>
-      </w:pPr>
-    </w:p>
-    <w:p>
-      <w:pPr>
-        <w:pStyle w:val="Caption"/>
-      </w:pPr>
-      <w:bookmarkStart w:id="19" w:name="_Toc429429027"/>
-      <w:r>
-        <w:t xml:space="preserve">Table </w:t>
-      </w:r>
-      <w:r>
-        <w:rPr>
-          <w:noProof/>
-        </w:rPr>
-        <w:fldChar w:fldCharType="begin"/>
-      </w:r>
-      <w:r>
-        <w:rPr>
-          <w:noProof/>
-        </w:rPr>
-        <w:instrText xml:space="preserve"> SEQ Table \* ARABIC </w:instrText>
-      </w:r>
-      <w:r>
-        <w:rPr>
-          <w:noProof/>
-        </w:rPr>
-        <w:fldChar w:fldCharType="separate"/>
-      </w:r>
-      <w:r>
-        <w:rPr>
-          <w:noProof/>
-        </w:rPr>
-        <w:t>1</w:t>
-      </w:r>
-      <w:r>
-        <w:rPr>
-          <w:noProof/>
-        </w:rPr>
-        <w:fldChar w:fldCharType="end"/>
-      </w:r>
-      <w:r>
-        <w:t>. Table Formatting Guidelines</w:t>
-      </w:r>
-      <w:bookmarkEnd w:id="19"/>
-    </w:p>
-    <w:tbl>
-      <w:tblPr>
-        <w:tblStyle w:val="TableGrid"/>
-        <w:tblW w:w="0" w:type="auto"/>
-        <w:tblInd w:w="-5" w:type="dxa"/>
-        <w:tblLook w:val="04A0" w:firstRow="1" w:lastRow="0" w:firstColumn="1" w:lastColumn="0" w:noHBand="0" w:noVBand="1"/>
-      </w:tblPr>
-      <w:tblGrid>
-        <w:gridCol w:w="1786"/>
-        <w:gridCol w:w="7145"/>
-      </w:tblGrid>
-      <w:tr>
-        <w:tc>
-          <w:tcPr>
-            <w:tcW w:w="1786" w:type="dxa"/>
-          </w:tcPr>
-          <w:p>
-            <w:pPr>
-              <w:spacing w:line="360" w:lineRule="auto"/>
-              <w:jc w:val="both"/>
-              <w:rPr>
-                <w:b/>
-                <w:sz w:val="24"/>
-                <w:szCs w:val="24"/>
-              </w:rPr>
-            </w:pPr>
-            <w:r>
-              <w:rPr>
-                <w:b/>
-                <w:sz w:val="24"/>
-                <w:szCs w:val="24"/>
-              </w:rPr>
-              <w:t>Format</w:t>
-            </w:r>
-          </w:p>
-        </w:tc>
-        <w:tc>
-          <w:tcPr>
-            <w:tcW w:w="7145" w:type="dxa"/>
-          </w:tcPr>
-          <w:p>
-            <w:pPr>
-              <w:spacing w:line="360" w:lineRule="auto"/>
-              <w:jc w:val="both"/>
-              <w:rPr>
-                <w:b/>
-                <w:sz w:val="24"/>
-                <w:szCs w:val="24"/>
-              </w:rPr>
-            </w:pPr>
-            <w:r>
-              <w:rPr>
-                <w:b/>
-                <w:sz w:val="24"/>
-                <w:szCs w:val="24"/>
-              </w:rPr>
-              <w:t>Description</w:t>
-            </w:r>
-          </w:p>
-        </w:tc>
-      </w:tr>
-      <w:tr>
-        <w:tc>
-          <w:tcPr>
-            <w:tcW w:w="1786" w:type="dxa"/>
-          </w:tcPr>
-          <w:p>
-            <w:pPr>
-              <w:spacing w:line="360" w:lineRule="auto"/>
-              <w:jc w:val="both"/>
-              <w:rPr>
-                <w:sz w:val="24"/>
-                <w:szCs w:val="24"/>
-              </w:rPr>
-            </w:pPr>
-            <w:r>
-              <w:rPr>
-                <w:sz w:val="24"/>
-                <w:szCs w:val="24"/>
-              </w:rPr>
-              <w:t>Size</w:t>
-            </w:r>
-          </w:p>
-        </w:tc>
-        <w:tc>
-          <w:tcPr>
-            <w:tcW w:w="7145" w:type="dxa"/>
-          </w:tcPr>
-          <w:p>
-            <w:pPr>
-              <w:spacing w:line="360" w:lineRule="auto"/>
-              <w:jc w:val="both"/>
-              <w:rPr>
-                <w:sz w:val="24"/>
-                <w:szCs w:val="24"/>
-              </w:rPr>
-            </w:pPr>
-            <w:r>
-              <w:rPr>
-                <w:sz w:val="24"/>
-                <w:szCs w:val="24"/>
-              </w:rPr>
-              <w:t>The table should be able to fit into one page and should not overrun.</w:t>
-            </w:r>
-          </w:p>
-        </w:tc>
-      </w:tr>
-      <w:tr>
-        <w:tc>
-          <w:tcPr>
-            <w:tcW w:w="1786" w:type="dxa"/>
-          </w:tcPr>
-          <w:p>
-            <w:pPr>
-              <w:spacing w:line="360" w:lineRule="auto"/>
-              <w:jc w:val="both"/>
-              <w:rPr>
-                <w:sz w:val="24"/>
-                <w:szCs w:val="24"/>
-              </w:rPr>
-            </w:pPr>
-            <w:r>
-              <w:rPr>
-                <w:sz w:val="24"/>
-                <w:szCs w:val="24"/>
-              </w:rPr>
-              <w:t>Margins</w:t>
-            </w:r>
-          </w:p>
-        </w:tc>
-        <w:tc>
-          <w:tcPr>
-            <w:tcW w:w="7145" w:type="dxa"/>
-          </w:tcPr>
-          <w:p>
-            <w:pPr>
-              <w:spacing w:line="360" w:lineRule="auto"/>
-              <w:jc w:val="both"/>
-              <w:rPr>
-                <w:sz w:val="24"/>
-                <w:szCs w:val="24"/>
-              </w:rPr>
-            </w:pPr>
-            <w:r>
-              <w:rPr>
-                <w:sz w:val="24"/>
-                <w:szCs w:val="24"/>
-              </w:rPr>
-              <w:t>The table should not extend past the normal margins of the page</w:t>
-            </w:r>
-          </w:p>
-        </w:tc>
-      </w:tr>
-      <w:tr>
-        <w:tc>
-          <w:tcPr>
-            <w:tcW w:w="1786" w:type="dxa"/>
-          </w:tcPr>
-          <w:p>
-            <w:pPr>
-              <w:spacing w:line="360" w:lineRule="auto"/>
-              <w:jc w:val="both"/>
-              <w:rPr>
-                <w:sz w:val="24"/>
-                <w:szCs w:val="24"/>
-              </w:rPr>
-            </w:pPr>
-            <w:r>
-              <w:rPr>
-                <w:sz w:val="24"/>
-                <w:szCs w:val="24"/>
-              </w:rPr>
-              <w:lastRenderedPageBreak/>
-              <w:t>Colour</w:t>
-            </w:r>
-          </w:p>
-        </w:tc>
-        <w:tc>
-          <w:tcPr>
-            <w:tcW w:w="7145" w:type="dxa"/>
-          </w:tcPr>
-          <w:p>
-            <w:pPr>
-              <w:spacing w:line="360" w:lineRule="auto"/>
-              <w:jc w:val="both"/>
-              <w:rPr>
-                <w:sz w:val="24"/>
-                <w:szCs w:val="24"/>
-              </w:rPr>
-            </w:pPr>
-            <w:r>
-              <w:rPr>
-                <w:sz w:val="24"/>
-                <w:szCs w:val="24"/>
-              </w:rPr>
-              <w:t>Colour may be used but consideration should be given to both on screen display and printed display.</w:t>
-            </w:r>
-          </w:p>
-        </w:tc>
-      </w:tr>
-      <w:tr>
-        <w:tc>
-          <w:tcPr>
-            <w:tcW w:w="1786" w:type="dxa"/>
-          </w:tcPr>
-          <w:p>
-            <w:pPr>
-              <w:spacing w:line="360" w:lineRule="auto"/>
-              <w:jc w:val="both"/>
-              <w:rPr>
-                <w:sz w:val="24"/>
-                <w:szCs w:val="24"/>
-              </w:rPr>
-            </w:pPr>
-            <w:r>
-              <w:rPr>
-                <w:sz w:val="24"/>
-                <w:szCs w:val="24"/>
-              </w:rPr>
-              <w:t>Design</w:t>
-            </w:r>
-          </w:p>
-        </w:tc>
-        <w:tc>
-          <w:tcPr>
-            <w:tcW w:w="7145" w:type="dxa"/>
-          </w:tcPr>
-          <w:p>
-            <w:pPr>
-              <w:spacing w:line="360" w:lineRule="auto"/>
-              <w:jc w:val="both"/>
-              <w:rPr>
-                <w:sz w:val="24"/>
-                <w:szCs w:val="24"/>
-              </w:rPr>
-            </w:pPr>
-            <w:r>
-              <w:rPr>
-                <w:sz w:val="24"/>
-                <w:szCs w:val="24"/>
-              </w:rPr>
-              <w:t>Simple designs are best. At all times consider that the information in the table is more important than the ‘flashy’ design.</w:t>
-            </w:r>
-          </w:p>
-        </w:tc>
-      </w:tr>
-    </w:tbl>
-    <w:p>
-      <w:pPr>
-        <w:spacing w:after="0" w:line="360" w:lineRule="auto"/>
-        <w:ind w:left="851"/>
-        <w:jc w:val="both"/>
-        <w:rPr>
-          <w:sz w:val="24"/>
-          <w:szCs w:val="24"/>
-        </w:rPr>
-      </w:pPr>
-    </w:p>
-    <w:p>
-      <w:pPr>
-        <w:pStyle w:val="ListParagraph"/>
-        <w:spacing w:after="0" w:line="360" w:lineRule="auto"/>
-        <w:ind w:left="1134"/>
-        <w:jc w:val="both"/>
-        <w:rPr>
-          <w:sz w:val="24"/>
-          <w:szCs w:val="24"/>
-        </w:rPr>
-      </w:pPr>
-    </w:p>
-    <w:p>
-      <w:pPr>
-        <w:spacing w:after="0" w:line="360" w:lineRule="auto"/>
-        <w:jc w:val="both"/>
-        <w:rPr>
-          <w:sz w:val="24"/>
-          <w:szCs w:val="24"/>
-        </w:rPr>
-      </w:pPr>
-      <w:r>
-        <w:rPr>
-          <w:sz w:val="24"/>
-          <w:szCs w:val="24"/>
-        </w:rPr>
-        <w:t xml:space="preserve">The title for an image </w:t>
-      </w:r>
-      <w:r>
-        <w:rPr>
-          <w:sz w:val="24"/>
-          <w:szCs w:val="24"/>
-        </w:rPr>
-        <w:t>or code must appear directly underneath and on the same page. If this is not possible then move the item within the text to ensure that the caption remains with the item.</w:t>
-      </w:r>
-      <w:r>
-        <w:rPr>
-          <w:sz w:val="24"/>
-          <w:szCs w:val="24"/>
-        </w:rPr>
-        <w:t xml:space="preserve"> The title for a table must appear directly above the table.</w:t>
-      </w:r>
     </w:p>
     <w:p>
       <w:pPr>
@@ -3921,1096 +3336,6 @@
       <w:pPr>
         <w:pStyle w:val="Caption"/>
       </w:pPr>
-    </w:p>
-    <w:p>
-      <w:pPr>
-        <w:pStyle w:val="Caption"/>
-      </w:pPr>
-      <w:bookmarkStart w:id="20" w:name="_Toc429429028"/>
-      <w:r>
-        <w:t xml:space="preserve">Table </w:t>
-      </w:r>
-      <w:r>
-        <w:rPr>
-          <w:noProof/>
-        </w:rPr>
-        <w:fldChar w:fldCharType="begin"/>
-      </w:r>
-      <w:r>
-        <w:rPr>
-          <w:noProof/>
-        </w:rPr>
-        <w:instrText xml:space="preserve"> SEQ Table \* ARABIC </w:instrText>
-      </w:r>
-      <w:r>
-        <w:rPr>
-          <w:noProof/>
-        </w:rPr>
-        <w:fldChar w:fldCharType="separate"/>
-      </w:r>
-      <w:r>
-        <w:rPr>
-          <w:noProof/>
-        </w:rPr>
-        <w:t>2</w:t>
-      </w:r>
-      <w:r>
-        <w:rPr>
-          <w:noProof/>
-        </w:rPr>
-        <w:fldChar w:fldCharType="end"/>
-      </w:r>
-      <w:r>
-        <w:t xml:space="preserve"> Second Sample Table</w:t>
-      </w:r>
-      <w:bookmarkEnd w:id="20"/>
-    </w:p>
-    <w:tbl>
-      <w:tblPr>
-        <w:tblStyle w:val="TableGrid"/>
-        <w:tblW w:w="0" w:type="auto"/>
-        <w:tblInd w:w="-5" w:type="dxa"/>
-        <w:tblLook w:val="04A0" w:firstRow="1" w:lastRow="0" w:firstColumn="1" w:lastColumn="0" w:noHBand="0" w:noVBand="1"/>
-      </w:tblPr>
-      <w:tblGrid>
-        <w:gridCol w:w="1786"/>
-        <w:gridCol w:w="7145"/>
-      </w:tblGrid>
-      <w:tr>
-        <w:tc>
-          <w:tcPr>
-            <w:tcW w:w="1786" w:type="dxa"/>
-          </w:tcPr>
-          <w:p>
-            <w:pPr>
-              <w:spacing w:line="360" w:lineRule="auto"/>
-              <w:jc w:val="both"/>
-              <w:rPr>
-                <w:b/>
-                <w:sz w:val="24"/>
-                <w:szCs w:val="24"/>
-              </w:rPr>
-            </w:pPr>
-            <w:r>
-              <w:rPr>
-                <w:b/>
-                <w:sz w:val="24"/>
-                <w:szCs w:val="24"/>
-              </w:rPr>
-              <w:t>Format</w:t>
-            </w:r>
-          </w:p>
-        </w:tc>
-        <w:tc>
-          <w:tcPr>
-            <w:tcW w:w="7145" w:type="dxa"/>
-          </w:tcPr>
-          <w:p>
-            <w:pPr>
-              <w:spacing w:line="360" w:lineRule="auto"/>
-              <w:jc w:val="both"/>
-              <w:rPr>
-                <w:b/>
-                <w:sz w:val="24"/>
-                <w:szCs w:val="24"/>
-              </w:rPr>
-            </w:pPr>
-            <w:r>
-              <w:rPr>
-                <w:b/>
-                <w:sz w:val="24"/>
-                <w:szCs w:val="24"/>
-              </w:rPr>
-              <w:t>Description</w:t>
-            </w:r>
-          </w:p>
-        </w:tc>
-      </w:tr>
-      <w:tr>
-        <w:tc>
-          <w:tcPr>
-            <w:tcW w:w="1786" w:type="dxa"/>
-          </w:tcPr>
-          <w:p>
-            <w:pPr>
-              <w:spacing w:line="360" w:lineRule="auto"/>
-              <w:jc w:val="both"/>
-              <w:rPr>
-                <w:sz w:val="24"/>
-                <w:szCs w:val="24"/>
-              </w:rPr>
-            </w:pPr>
-            <w:r>
-              <w:rPr>
-                <w:sz w:val="24"/>
-                <w:szCs w:val="24"/>
-              </w:rPr>
-              <w:t>Size</w:t>
-            </w:r>
-          </w:p>
-        </w:tc>
-        <w:tc>
-          <w:tcPr>
-            <w:tcW w:w="7145" w:type="dxa"/>
-          </w:tcPr>
-          <w:p>
-            <w:pPr>
-              <w:spacing w:line="360" w:lineRule="auto"/>
-              <w:jc w:val="both"/>
-              <w:rPr>
-                <w:sz w:val="24"/>
-                <w:szCs w:val="24"/>
-              </w:rPr>
-            </w:pPr>
-            <w:r>
-              <w:rPr>
-                <w:sz w:val="24"/>
-                <w:szCs w:val="24"/>
-              </w:rPr>
-              <w:t>The table should be able to fit into one page and should not overrun.</w:t>
-            </w:r>
-          </w:p>
-        </w:tc>
-      </w:tr>
-    </w:tbl>
-    <w:p>
-      <w:pPr>
-        <w:spacing w:after="0" w:line="360" w:lineRule="auto"/>
-        <w:ind w:left="720"/>
-        <w:jc w:val="both"/>
-        <w:rPr>
-          <w:sz w:val="24"/>
-          <w:szCs w:val="24"/>
-        </w:rPr>
-      </w:pPr>
-    </w:p>
-    <w:p>
-      <w:pPr>
-        <w:pStyle w:val="Heading2"/>
-        <w:numPr>
-          <w:ilvl w:val="1"/>
-          <w:numId w:val="3"/>
-        </w:numPr>
-        <w:ind w:left="851" w:hanging="851"/>
-      </w:pPr>
-      <w:bookmarkStart w:id="21" w:name="_Toc101374252"/>
-      <w:bookmarkStart w:id="22" w:name="_Toc193990931"/>
-      <w:r>
-        <w:t>Code and Formulae</w:t>
-      </w:r>
-      <w:bookmarkEnd w:id="21"/>
-      <w:bookmarkEnd w:id="22"/>
-    </w:p>
-    <w:p>
-      <w:pPr>
-        <w:spacing w:after="0" w:line="360" w:lineRule="auto"/>
-        <w:jc w:val="both"/>
-        <w:rPr>
-          <w:sz w:val="24"/>
-          <w:szCs w:val="24"/>
-        </w:rPr>
-      </w:pPr>
-      <w:r>
-        <w:rPr>
-          <w:sz w:val="24"/>
-          <w:szCs w:val="24"/>
-        </w:rPr>
-        <w:t>Where code requires listing within the text it should be treated as an image in that it is sectioned off with a border and has a caption directly underneath. Refer to Code Listing 1.1 below.</w:t>
-      </w:r>
-    </w:p>
-    <w:p>
-      <w:pPr>
-        <w:pStyle w:val="ListParagraph"/>
-        <w:spacing w:after="0" w:line="360" w:lineRule="auto"/>
-        <w:ind w:left="851"/>
-        <w:jc w:val="both"/>
-        <w:rPr>
-          <w:sz w:val="24"/>
-          <w:szCs w:val="24"/>
-        </w:rPr>
-      </w:pPr>
-    </w:p>
-    <w:p>
-      <w:pPr>
-        <w:pStyle w:val="ListParagraph"/>
-        <w:pBdr>
-          <w:top w:val="single" w:sz="4" w:space="1" w:color="auto"/>
-          <w:left w:val="single" w:sz="4" w:space="4" w:color="auto"/>
-          <w:bottom w:val="single" w:sz="4" w:space="1" w:color="auto"/>
-          <w:right w:val="single" w:sz="4" w:space="4" w:color="auto"/>
-        </w:pBdr>
-        <w:spacing w:after="0" w:line="360" w:lineRule="auto"/>
-        <w:ind w:left="792"/>
-        <w:jc w:val="both"/>
-        <w:rPr>
-          <w:rFonts w:asciiTheme="majorHAnsi" w:hAnsiTheme="majorHAnsi"/>
-          <w:sz w:val="20"/>
-          <w:szCs w:val="24"/>
-        </w:rPr>
-      </w:pPr>
-      <w:r>
-        <w:rPr>
-          <w:rFonts w:asciiTheme="majorHAnsi" w:hAnsiTheme="majorHAnsi"/>
-          <w:sz w:val="20"/>
-          <w:szCs w:val="24"/>
-        </w:rPr>
-        <w:t>…</w:t>
-      </w:r>
-    </w:p>
-    <w:p>
-      <w:pPr>
-        <w:pStyle w:val="ListParagraph"/>
-        <w:pBdr>
-          <w:top w:val="single" w:sz="4" w:space="1" w:color="auto"/>
-          <w:left w:val="single" w:sz="4" w:space="4" w:color="auto"/>
-          <w:bottom w:val="single" w:sz="4" w:space="1" w:color="auto"/>
-          <w:right w:val="single" w:sz="4" w:space="4" w:color="auto"/>
-        </w:pBdr>
-        <w:spacing w:after="0" w:line="360" w:lineRule="auto"/>
-        <w:ind w:left="792"/>
-        <w:jc w:val="both"/>
-        <w:rPr>
-          <w:rFonts w:asciiTheme="majorHAnsi" w:hAnsiTheme="majorHAnsi"/>
-          <w:sz w:val="20"/>
-          <w:szCs w:val="24"/>
-        </w:rPr>
-      </w:pPr>
-      <w:proofErr w:type="spellStart"/>
-      <w:r>
-        <w:rPr>
-          <w:rFonts w:asciiTheme="majorHAnsi" w:hAnsiTheme="majorHAnsi"/>
-          <w:sz w:val="20"/>
-          <w:szCs w:val="24"/>
-        </w:rPr>
-        <w:t>TextMessage</w:t>
-      </w:r>
-      <w:proofErr w:type="spellEnd"/>
-      <w:r>
-        <w:rPr>
-          <w:rFonts w:asciiTheme="majorHAnsi" w:hAnsiTheme="majorHAnsi"/>
-          <w:sz w:val="20"/>
-          <w:szCs w:val="24"/>
-        </w:rPr>
-        <w:t xml:space="preserve"> </w:t>
-      </w:r>
-      <w:proofErr w:type="spellStart"/>
-      <w:r>
-        <w:rPr>
-          <w:rFonts w:asciiTheme="majorHAnsi" w:hAnsiTheme="majorHAnsi"/>
-          <w:sz w:val="20"/>
-          <w:szCs w:val="24"/>
-        </w:rPr>
-        <w:t>msg</w:t>
-      </w:r>
-      <w:proofErr w:type="spellEnd"/>
-      <w:r>
-        <w:rPr>
-          <w:rFonts w:asciiTheme="majorHAnsi" w:hAnsiTheme="majorHAnsi"/>
-          <w:sz w:val="20"/>
-          <w:szCs w:val="24"/>
-        </w:rPr>
-        <w:t xml:space="preserve"> = </w:t>
-      </w:r>
-      <w:proofErr w:type="gramStart"/>
-      <w:r>
-        <w:rPr>
-          <w:rFonts w:asciiTheme="majorHAnsi" w:hAnsiTheme="majorHAnsi"/>
-          <w:sz w:val="20"/>
-          <w:szCs w:val="24"/>
-        </w:rPr>
-        <w:t>null;</w:t>
-      </w:r>
-      <w:proofErr w:type="gramEnd"/>
-    </w:p>
-    <w:p>
-      <w:pPr>
-        <w:pStyle w:val="ListParagraph"/>
-        <w:pBdr>
-          <w:top w:val="single" w:sz="4" w:space="1" w:color="auto"/>
-          <w:left w:val="single" w:sz="4" w:space="4" w:color="auto"/>
-          <w:bottom w:val="single" w:sz="4" w:space="1" w:color="auto"/>
-          <w:right w:val="single" w:sz="4" w:space="4" w:color="auto"/>
-        </w:pBdr>
-        <w:spacing w:after="0" w:line="360" w:lineRule="auto"/>
-        <w:ind w:left="792"/>
-        <w:jc w:val="both"/>
-        <w:rPr>
-          <w:rFonts w:asciiTheme="majorHAnsi" w:hAnsiTheme="majorHAnsi"/>
-          <w:sz w:val="20"/>
-          <w:szCs w:val="24"/>
-        </w:rPr>
-      </w:pPr>
-      <w:r>
-        <w:rPr>
-          <w:rFonts w:asciiTheme="majorHAnsi" w:hAnsiTheme="majorHAnsi"/>
-          <w:sz w:val="20"/>
-          <w:szCs w:val="24"/>
-        </w:rPr>
-        <w:t xml:space="preserve">        try {</w:t>
-      </w:r>
-    </w:p>
-    <w:p>
-      <w:pPr>
-        <w:pStyle w:val="ListParagraph"/>
-        <w:pBdr>
-          <w:top w:val="single" w:sz="4" w:space="1" w:color="auto"/>
-          <w:left w:val="single" w:sz="4" w:space="4" w:color="auto"/>
-          <w:bottom w:val="single" w:sz="4" w:space="1" w:color="auto"/>
-          <w:right w:val="single" w:sz="4" w:space="4" w:color="auto"/>
-        </w:pBdr>
-        <w:spacing w:after="0" w:line="360" w:lineRule="auto"/>
-        <w:ind w:left="792"/>
-        <w:jc w:val="both"/>
-        <w:rPr>
-          <w:rFonts w:asciiTheme="majorHAnsi" w:hAnsiTheme="majorHAnsi"/>
-          <w:sz w:val="20"/>
-          <w:szCs w:val="24"/>
-        </w:rPr>
-      </w:pPr>
-      <w:r>
-        <w:rPr>
-          <w:rFonts w:asciiTheme="majorHAnsi" w:hAnsiTheme="majorHAnsi"/>
-          <w:sz w:val="20"/>
-          <w:szCs w:val="24"/>
-        </w:rPr>
-        <w:t xml:space="preserve">            if (message </w:t>
-      </w:r>
-      <w:proofErr w:type="spellStart"/>
-      <w:r>
-        <w:rPr>
-          <w:rFonts w:asciiTheme="majorHAnsi" w:hAnsiTheme="majorHAnsi"/>
-          <w:sz w:val="20"/>
-          <w:szCs w:val="24"/>
-        </w:rPr>
-        <w:t>instanceof</w:t>
-      </w:r>
-      <w:proofErr w:type="spellEnd"/>
-      <w:r>
-        <w:rPr>
-          <w:rFonts w:asciiTheme="majorHAnsi" w:hAnsiTheme="majorHAnsi"/>
-          <w:sz w:val="20"/>
-          <w:szCs w:val="24"/>
-        </w:rPr>
-        <w:t xml:space="preserve"> </w:t>
-      </w:r>
-      <w:proofErr w:type="spellStart"/>
-      <w:r>
-        <w:rPr>
-          <w:rFonts w:asciiTheme="majorHAnsi" w:hAnsiTheme="majorHAnsi"/>
-          <w:sz w:val="20"/>
-          <w:szCs w:val="24"/>
-        </w:rPr>
-        <w:t>TextMessage</w:t>
-      </w:r>
-      <w:proofErr w:type="spellEnd"/>
-      <w:r>
-        <w:rPr>
-          <w:rFonts w:asciiTheme="majorHAnsi" w:hAnsiTheme="majorHAnsi"/>
-          <w:sz w:val="20"/>
-          <w:szCs w:val="24"/>
-        </w:rPr>
-        <w:t>) {</w:t>
-      </w:r>
-    </w:p>
-    <w:p>
-      <w:pPr>
-        <w:pStyle w:val="ListParagraph"/>
-        <w:pBdr>
-          <w:top w:val="single" w:sz="4" w:space="1" w:color="auto"/>
-          <w:left w:val="single" w:sz="4" w:space="4" w:color="auto"/>
-          <w:bottom w:val="single" w:sz="4" w:space="1" w:color="auto"/>
-          <w:right w:val="single" w:sz="4" w:space="4" w:color="auto"/>
-        </w:pBdr>
-        <w:spacing w:after="0" w:line="360" w:lineRule="auto"/>
-        <w:ind w:left="792"/>
-        <w:jc w:val="both"/>
-        <w:rPr>
-          <w:rFonts w:asciiTheme="majorHAnsi" w:hAnsiTheme="majorHAnsi"/>
-          <w:sz w:val="20"/>
-          <w:szCs w:val="24"/>
-        </w:rPr>
-      </w:pPr>
-      <w:r>
-        <w:rPr>
-          <w:rFonts w:asciiTheme="majorHAnsi" w:hAnsiTheme="majorHAnsi"/>
-          <w:sz w:val="20"/>
-          <w:szCs w:val="24"/>
-        </w:rPr>
-        <w:t xml:space="preserve">                </w:t>
-      </w:r>
-      <w:proofErr w:type="spellStart"/>
-      <w:r>
-        <w:rPr>
-          <w:rFonts w:asciiTheme="majorHAnsi" w:hAnsiTheme="majorHAnsi"/>
-          <w:sz w:val="20"/>
-          <w:szCs w:val="24"/>
-        </w:rPr>
-        <w:t>msg</w:t>
-      </w:r>
-      <w:proofErr w:type="spellEnd"/>
-      <w:r>
-        <w:rPr>
-          <w:rFonts w:asciiTheme="majorHAnsi" w:hAnsiTheme="majorHAnsi"/>
-          <w:sz w:val="20"/>
-          <w:szCs w:val="24"/>
-        </w:rPr>
-        <w:t xml:space="preserve"> = (</w:t>
-      </w:r>
-      <w:proofErr w:type="spellStart"/>
-      <w:r>
-        <w:rPr>
-          <w:rFonts w:asciiTheme="majorHAnsi" w:hAnsiTheme="majorHAnsi"/>
-          <w:sz w:val="20"/>
-          <w:szCs w:val="24"/>
-        </w:rPr>
-        <w:t>TextMessage</w:t>
-      </w:r>
-      <w:proofErr w:type="spellEnd"/>
-      <w:r>
-        <w:rPr>
-          <w:rFonts w:asciiTheme="majorHAnsi" w:hAnsiTheme="majorHAnsi"/>
-          <w:sz w:val="20"/>
-          <w:szCs w:val="24"/>
-        </w:rPr>
-        <w:t xml:space="preserve">) </w:t>
-      </w:r>
-      <w:proofErr w:type="gramStart"/>
-      <w:r>
-        <w:rPr>
-          <w:rFonts w:asciiTheme="majorHAnsi" w:hAnsiTheme="majorHAnsi"/>
-          <w:sz w:val="20"/>
-          <w:szCs w:val="24"/>
-        </w:rPr>
-        <w:t>message;</w:t>
-      </w:r>
-      <w:proofErr w:type="gramEnd"/>
-    </w:p>
-    <w:p>
-      <w:pPr>
-        <w:pStyle w:val="ListParagraph"/>
-        <w:pBdr>
-          <w:top w:val="single" w:sz="4" w:space="1" w:color="auto"/>
-          <w:left w:val="single" w:sz="4" w:space="4" w:color="auto"/>
-          <w:bottom w:val="single" w:sz="4" w:space="1" w:color="auto"/>
-          <w:right w:val="single" w:sz="4" w:space="4" w:color="auto"/>
-        </w:pBdr>
-        <w:spacing w:after="0" w:line="360" w:lineRule="auto"/>
-        <w:ind w:left="792"/>
-        <w:jc w:val="both"/>
-        <w:rPr>
-          <w:rFonts w:asciiTheme="majorHAnsi" w:hAnsiTheme="majorHAnsi"/>
-          <w:sz w:val="20"/>
-          <w:szCs w:val="24"/>
-        </w:rPr>
-      </w:pPr>
-      <w:r>
-        <w:rPr>
-          <w:rFonts w:asciiTheme="majorHAnsi" w:hAnsiTheme="majorHAnsi"/>
-          <w:sz w:val="20"/>
-          <w:szCs w:val="24"/>
-        </w:rPr>
-        <w:t xml:space="preserve">                </w:t>
-      </w:r>
-      <w:proofErr w:type="spellStart"/>
-      <w:r>
-        <w:rPr>
-          <w:rFonts w:asciiTheme="majorHAnsi" w:hAnsiTheme="majorHAnsi"/>
-          <w:sz w:val="20"/>
-          <w:szCs w:val="24"/>
-        </w:rPr>
-        <w:t>System.out.println</w:t>
-      </w:r>
-      <w:proofErr w:type="spellEnd"/>
-      <w:r>
-        <w:rPr>
-          <w:rFonts w:asciiTheme="majorHAnsi" w:hAnsiTheme="majorHAnsi"/>
-          <w:sz w:val="20"/>
-          <w:szCs w:val="24"/>
-        </w:rPr>
-        <w:t>("A Message received in TMDB: "</w:t>
-      </w:r>
-    </w:p>
-    <w:p>
-      <w:pPr>
-        <w:pStyle w:val="ListParagraph"/>
-        <w:pBdr>
-          <w:top w:val="single" w:sz="4" w:space="1" w:color="auto"/>
-          <w:left w:val="single" w:sz="4" w:space="4" w:color="auto"/>
-          <w:bottom w:val="single" w:sz="4" w:space="1" w:color="auto"/>
-          <w:right w:val="single" w:sz="4" w:space="4" w:color="auto"/>
-        </w:pBdr>
-        <w:spacing w:after="0" w:line="360" w:lineRule="auto"/>
-        <w:ind w:left="792"/>
-        <w:jc w:val="both"/>
-        <w:rPr>
-          <w:rFonts w:asciiTheme="majorHAnsi" w:hAnsiTheme="majorHAnsi"/>
-          <w:sz w:val="20"/>
-          <w:szCs w:val="24"/>
-        </w:rPr>
-      </w:pPr>
-      <w:r>
-        <w:rPr>
-          <w:rFonts w:asciiTheme="majorHAnsi" w:hAnsiTheme="majorHAnsi"/>
-          <w:sz w:val="20"/>
-          <w:szCs w:val="24"/>
-        </w:rPr>
-        <w:t xml:space="preserve">                                                    + </w:t>
-      </w:r>
-      <w:proofErr w:type="spellStart"/>
-      <w:proofErr w:type="gramStart"/>
-      <w:r>
-        <w:rPr>
-          <w:rFonts w:asciiTheme="majorHAnsi" w:hAnsiTheme="majorHAnsi"/>
-          <w:sz w:val="20"/>
-          <w:szCs w:val="24"/>
-        </w:rPr>
-        <w:t>msg.getText</w:t>
-      </w:r>
-      <w:proofErr w:type="spellEnd"/>
-      <w:proofErr w:type="gramEnd"/>
-      <w:r>
-        <w:rPr>
-          <w:rFonts w:asciiTheme="majorHAnsi" w:hAnsiTheme="majorHAnsi"/>
-          <w:sz w:val="20"/>
-          <w:szCs w:val="24"/>
-        </w:rPr>
-        <w:t>()</w:t>
-      </w:r>
-      <w:proofErr w:type="gramStart"/>
-      <w:r>
-        <w:rPr>
-          <w:rFonts w:asciiTheme="majorHAnsi" w:hAnsiTheme="majorHAnsi"/>
-          <w:sz w:val="20"/>
-          <w:szCs w:val="24"/>
-        </w:rPr>
-        <w:t>);</w:t>
-      </w:r>
-      <w:proofErr w:type="gramEnd"/>
-    </w:p>
-    <w:p>
-      <w:pPr>
-        <w:pStyle w:val="ListParagraph"/>
-        <w:pBdr>
-          <w:top w:val="single" w:sz="4" w:space="1" w:color="auto"/>
-          <w:left w:val="single" w:sz="4" w:space="4" w:color="auto"/>
-          <w:bottom w:val="single" w:sz="4" w:space="1" w:color="auto"/>
-          <w:right w:val="single" w:sz="4" w:space="4" w:color="auto"/>
-        </w:pBdr>
-        <w:spacing w:after="0" w:line="360" w:lineRule="auto"/>
-        <w:ind w:left="792"/>
-        <w:jc w:val="both"/>
-        <w:rPr>
-          <w:rFonts w:asciiTheme="majorHAnsi" w:hAnsiTheme="majorHAnsi"/>
-          <w:sz w:val="20"/>
-          <w:szCs w:val="24"/>
-        </w:rPr>
-      </w:pPr>
-      <w:r>
-        <w:rPr>
-          <w:rFonts w:asciiTheme="majorHAnsi" w:hAnsiTheme="majorHAnsi"/>
-          <w:sz w:val="20"/>
-          <w:szCs w:val="24"/>
-        </w:rPr>
-        <w:t xml:space="preserve">            }</w:t>
-      </w:r>
-    </w:p>
-    <w:p>
-      <w:pPr>
-        <w:pStyle w:val="ListParagraph"/>
-        <w:pBdr>
-          <w:top w:val="single" w:sz="4" w:space="1" w:color="auto"/>
-          <w:left w:val="single" w:sz="4" w:space="4" w:color="auto"/>
-          <w:bottom w:val="single" w:sz="4" w:space="1" w:color="auto"/>
-          <w:right w:val="single" w:sz="4" w:space="4" w:color="auto"/>
-        </w:pBdr>
-        <w:spacing w:after="0" w:line="360" w:lineRule="auto"/>
-        <w:ind w:left="792"/>
-        <w:jc w:val="both"/>
-        <w:rPr>
-          <w:rFonts w:asciiTheme="majorHAnsi" w:hAnsiTheme="majorHAnsi"/>
-          <w:sz w:val="20"/>
-          <w:szCs w:val="24"/>
-        </w:rPr>
-      </w:pPr>
-      <w:r>
-        <w:rPr>
-          <w:rFonts w:asciiTheme="majorHAnsi" w:hAnsiTheme="majorHAnsi"/>
-          <w:sz w:val="20"/>
-          <w:szCs w:val="24"/>
-        </w:rPr>
-        <w:t xml:space="preserve">            else {</w:t>
-      </w:r>
-    </w:p>
-    <w:p>
-      <w:pPr>
-        <w:pStyle w:val="ListParagraph"/>
-        <w:pBdr>
-          <w:top w:val="single" w:sz="4" w:space="1" w:color="auto"/>
-          <w:left w:val="single" w:sz="4" w:space="4" w:color="auto"/>
-          <w:bottom w:val="single" w:sz="4" w:space="1" w:color="auto"/>
-          <w:right w:val="single" w:sz="4" w:space="4" w:color="auto"/>
-        </w:pBdr>
-        <w:spacing w:after="0" w:line="360" w:lineRule="auto"/>
-        <w:ind w:left="792"/>
-        <w:jc w:val="both"/>
-        <w:rPr>
-          <w:rFonts w:asciiTheme="majorHAnsi" w:hAnsiTheme="majorHAnsi"/>
-          <w:sz w:val="20"/>
-          <w:szCs w:val="24"/>
-        </w:rPr>
-      </w:pPr>
-      <w:r>
-        <w:rPr>
-          <w:rFonts w:asciiTheme="majorHAnsi" w:hAnsiTheme="majorHAnsi"/>
-          <w:sz w:val="20"/>
-          <w:szCs w:val="24"/>
-        </w:rPr>
-        <w:lastRenderedPageBreak/>
-        <w:t xml:space="preserve">               </w:t>
-      </w:r>
-      <w:proofErr w:type="spellStart"/>
-      <w:r>
-        <w:rPr>
-          <w:rFonts w:asciiTheme="majorHAnsi" w:hAnsiTheme="majorHAnsi"/>
-          <w:sz w:val="20"/>
-          <w:szCs w:val="24"/>
-        </w:rPr>
-        <w:t>System.out.println</w:t>
-      </w:r>
-      <w:proofErr w:type="spellEnd"/>
-      <w:r>
-        <w:rPr>
-          <w:rFonts w:asciiTheme="majorHAnsi" w:hAnsiTheme="majorHAnsi"/>
-          <w:sz w:val="20"/>
-          <w:szCs w:val="24"/>
-        </w:rPr>
-        <w:t>("Message of wrong type: "</w:t>
-      </w:r>
-    </w:p>
-    <w:p>
-      <w:pPr>
-        <w:pStyle w:val="ListParagraph"/>
-        <w:pBdr>
-          <w:top w:val="single" w:sz="4" w:space="1" w:color="auto"/>
-          <w:left w:val="single" w:sz="4" w:space="4" w:color="auto"/>
-          <w:bottom w:val="single" w:sz="4" w:space="1" w:color="auto"/>
-          <w:right w:val="single" w:sz="4" w:space="4" w:color="auto"/>
-        </w:pBdr>
-        <w:spacing w:after="0" w:line="360" w:lineRule="auto"/>
-        <w:ind w:left="792"/>
-        <w:jc w:val="both"/>
-        <w:rPr>
-          <w:rFonts w:asciiTheme="majorHAnsi" w:hAnsiTheme="majorHAnsi"/>
-          <w:sz w:val="20"/>
-          <w:szCs w:val="24"/>
-        </w:rPr>
-      </w:pPr>
-      <w:r>
-        <w:rPr>
-          <w:rFonts w:asciiTheme="majorHAnsi" w:hAnsiTheme="majorHAnsi"/>
-          <w:sz w:val="20"/>
-          <w:szCs w:val="24"/>
-        </w:rPr>
-        <w:t xml:space="preserve">                                            + </w:t>
-      </w:r>
-      <w:proofErr w:type="spellStart"/>
-      <w:proofErr w:type="gramStart"/>
-      <w:r>
-        <w:rPr>
-          <w:rFonts w:asciiTheme="majorHAnsi" w:hAnsiTheme="majorHAnsi"/>
-          <w:sz w:val="20"/>
-          <w:szCs w:val="24"/>
-        </w:rPr>
-        <w:t>message.getClass</w:t>
-      </w:r>
-      <w:proofErr w:type="spellEnd"/>
-      <w:proofErr w:type="gramEnd"/>
-      <w:r>
-        <w:rPr>
-          <w:rFonts w:asciiTheme="majorHAnsi" w:hAnsiTheme="majorHAnsi"/>
-          <w:sz w:val="20"/>
-          <w:szCs w:val="24"/>
-        </w:rPr>
-        <w:t>(</w:t>
-      </w:r>
-      <w:proofErr w:type="gramStart"/>
-      <w:r>
-        <w:rPr>
-          <w:rFonts w:asciiTheme="majorHAnsi" w:hAnsiTheme="majorHAnsi"/>
-          <w:sz w:val="20"/>
-          <w:szCs w:val="24"/>
-        </w:rPr>
-        <w:t>).</w:t>
-      </w:r>
-      <w:proofErr w:type="spellStart"/>
-      <w:r>
-        <w:rPr>
-          <w:rFonts w:asciiTheme="majorHAnsi" w:hAnsiTheme="majorHAnsi"/>
-          <w:sz w:val="20"/>
-          <w:szCs w:val="24"/>
-        </w:rPr>
-        <w:t>getName</w:t>
-      </w:r>
-      <w:proofErr w:type="spellEnd"/>
-      <w:proofErr w:type="gramEnd"/>
-      <w:r>
-        <w:rPr>
-          <w:rFonts w:asciiTheme="majorHAnsi" w:hAnsiTheme="majorHAnsi"/>
-          <w:sz w:val="20"/>
-          <w:szCs w:val="24"/>
-        </w:rPr>
-        <w:t>()</w:t>
-      </w:r>
-      <w:proofErr w:type="gramStart"/>
-      <w:r>
-        <w:rPr>
-          <w:rFonts w:asciiTheme="majorHAnsi" w:hAnsiTheme="majorHAnsi"/>
-          <w:sz w:val="20"/>
-          <w:szCs w:val="24"/>
-        </w:rPr>
-        <w:t>);</w:t>
-      </w:r>
-      <w:proofErr w:type="gramEnd"/>
-    </w:p>
-    <w:p>
-      <w:pPr>
-        <w:pStyle w:val="ListParagraph"/>
-        <w:pBdr>
-          <w:top w:val="single" w:sz="4" w:space="1" w:color="auto"/>
-          <w:left w:val="single" w:sz="4" w:space="4" w:color="auto"/>
-          <w:bottom w:val="single" w:sz="4" w:space="1" w:color="auto"/>
-          <w:right w:val="single" w:sz="4" w:space="4" w:color="auto"/>
-        </w:pBdr>
-        <w:spacing w:after="0" w:line="360" w:lineRule="auto"/>
-        <w:ind w:left="792"/>
-        <w:jc w:val="both"/>
-        <w:rPr>
-          <w:rFonts w:asciiTheme="majorHAnsi" w:hAnsiTheme="majorHAnsi"/>
-          <w:sz w:val="20"/>
-          <w:szCs w:val="24"/>
-        </w:rPr>
-      </w:pPr>
-      <w:r>
-        <w:rPr>
-          <w:rFonts w:asciiTheme="majorHAnsi" w:hAnsiTheme="majorHAnsi"/>
-          <w:sz w:val="20"/>
-          <w:szCs w:val="24"/>
-        </w:rPr>
-        <w:t xml:space="preserve">            }</w:t>
-      </w:r>
-    </w:p>
-    <w:p>
-      <w:pPr>
-        <w:pStyle w:val="ListParagraph"/>
-        <w:pBdr>
-          <w:top w:val="single" w:sz="4" w:space="1" w:color="auto"/>
-          <w:left w:val="single" w:sz="4" w:space="4" w:color="auto"/>
-          <w:bottom w:val="single" w:sz="4" w:space="1" w:color="auto"/>
-          <w:right w:val="single" w:sz="4" w:space="4" w:color="auto"/>
-        </w:pBdr>
-        <w:spacing w:after="0" w:line="360" w:lineRule="auto"/>
-        <w:ind w:left="792"/>
-        <w:jc w:val="both"/>
-        <w:rPr>
-          <w:rFonts w:asciiTheme="majorHAnsi" w:hAnsiTheme="majorHAnsi"/>
-          <w:sz w:val="20"/>
-          <w:szCs w:val="24"/>
-        </w:rPr>
-      </w:pPr>
-      <w:r>
-        <w:rPr>
-          <w:rFonts w:asciiTheme="majorHAnsi" w:hAnsiTheme="majorHAnsi"/>
-          <w:sz w:val="20"/>
-          <w:szCs w:val="24"/>
-        </w:rPr>
-        <w:t xml:space="preserve">        } catch (</w:t>
-      </w:r>
-      <w:proofErr w:type="spellStart"/>
-      <w:r>
-        <w:rPr>
-          <w:rFonts w:asciiTheme="majorHAnsi" w:hAnsiTheme="majorHAnsi"/>
-          <w:sz w:val="20"/>
-          <w:szCs w:val="24"/>
-        </w:rPr>
-        <w:t>JMSException</w:t>
-      </w:r>
-      <w:proofErr w:type="spellEnd"/>
-      <w:r>
-        <w:rPr>
-          <w:rFonts w:asciiTheme="majorHAnsi" w:hAnsiTheme="majorHAnsi"/>
-          <w:sz w:val="20"/>
-          <w:szCs w:val="24"/>
-        </w:rPr>
-        <w:t xml:space="preserve"> e) {</w:t>
-      </w:r>
-    </w:p>
-    <w:p>
-      <w:pPr>
-        <w:pStyle w:val="ListParagraph"/>
-        <w:pBdr>
-          <w:top w:val="single" w:sz="4" w:space="1" w:color="auto"/>
-          <w:left w:val="single" w:sz="4" w:space="4" w:color="auto"/>
-          <w:bottom w:val="single" w:sz="4" w:space="1" w:color="auto"/>
-          <w:right w:val="single" w:sz="4" w:space="4" w:color="auto"/>
-        </w:pBdr>
-        <w:spacing w:after="0" w:line="360" w:lineRule="auto"/>
-        <w:ind w:left="792"/>
-        <w:jc w:val="both"/>
-        <w:rPr>
-          <w:rFonts w:asciiTheme="majorHAnsi" w:hAnsiTheme="majorHAnsi"/>
-          <w:sz w:val="20"/>
-          <w:szCs w:val="24"/>
-        </w:rPr>
-      </w:pPr>
-      <w:r>
-        <w:rPr>
-          <w:rFonts w:asciiTheme="majorHAnsi" w:hAnsiTheme="majorHAnsi"/>
-          <w:sz w:val="20"/>
-          <w:szCs w:val="24"/>
-        </w:rPr>
-        <w:t xml:space="preserve">            </w:t>
-      </w:r>
-      <w:proofErr w:type="spellStart"/>
-      <w:proofErr w:type="gramStart"/>
-      <w:r>
-        <w:rPr>
-          <w:rFonts w:asciiTheme="majorHAnsi" w:hAnsiTheme="majorHAnsi"/>
-          <w:sz w:val="20"/>
-          <w:szCs w:val="24"/>
-        </w:rPr>
-        <w:t>e.printStackTrace</w:t>
-      </w:r>
-      <w:proofErr w:type="spellEnd"/>
-      <w:proofErr w:type="gramEnd"/>
-      <w:r>
-        <w:rPr>
-          <w:rFonts w:asciiTheme="majorHAnsi" w:hAnsiTheme="majorHAnsi"/>
-          <w:sz w:val="20"/>
-          <w:szCs w:val="24"/>
-        </w:rPr>
-        <w:t>(</w:t>
-      </w:r>
-      <w:proofErr w:type="gramStart"/>
-      <w:r>
-        <w:rPr>
-          <w:rFonts w:asciiTheme="majorHAnsi" w:hAnsiTheme="majorHAnsi"/>
-          <w:sz w:val="20"/>
-          <w:szCs w:val="24"/>
-        </w:rPr>
-        <w:t>);</w:t>
-      </w:r>
-      <w:proofErr w:type="gramEnd"/>
-    </w:p>
-    <w:p>
-      <w:pPr>
-        <w:pStyle w:val="ListParagraph"/>
-        <w:pBdr>
-          <w:top w:val="single" w:sz="4" w:space="1" w:color="auto"/>
-          <w:left w:val="single" w:sz="4" w:space="4" w:color="auto"/>
-          <w:bottom w:val="single" w:sz="4" w:space="1" w:color="auto"/>
-          <w:right w:val="single" w:sz="4" w:space="4" w:color="auto"/>
-        </w:pBdr>
-        <w:spacing w:after="0" w:line="360" w:lineRule="auto"/>
-        <w:ind w:left="792"/>
-        <w:jc w:val="both"/>
-        <w:rPr>
-          <w:rFonts w:asciiTheme="majorHAnsi" w:hAnsiTheme="majorHAnsi"/>
-          <w:sz w:val="20"/>
-          <w:szCs w:val="24"/>
-        </w:rPr>
-      </w:pPr>
-      <w:r>
-        <w:rPr>
-          <w:rFonts w:asciiTheme="majorHAnsi" w:hAnsiTheme="majorHAnsi"/>
-          <w:sz w:val="20"/>
-          <w:szCs w:val="24"/>
-        </w:rPr>
-        <w:t xml:space="preserve">            </w:t>
-      </w:r>
-      <w:proofErr w:type="spellStart"/>
-      <w:r>
-        <w:rPr>
-          <w:rFonts w:asciiTheme="majorHAnsi" w:hAnsiTheme="majorHAnsi"/>
-          <w:sz w:val="20"/>
-          <w:szCs w:val="24"/>
-        </w:rPr>
-        <w:t>mdc.</w:t>
-      </w:r>
-      <w:proofErr w:type="gramStart"/>
-      <w:r>
-        <w:rPr>
-          <w:rFonts w:asciiTheme="majorHAnsi" w:hAnsiTheme="majorHAnsi"/>
-          <w:sz w:val="20"/>
-          <w:szCs w:val="24"/>
-        </w:rPr>
-        <w:t>setRollbackOnly</w:t>
-      </w:r>
-      <w:proofErr w:type="spellEnd"/>
-      <w:r>
-        <w:rPr>
-          <w:rFonts w:asciiTheme="majorHAnsi" w:hAnsiTheme="majorHAnsi"/>
-          <w:sz w:val="20"/>
-          <w:szCs w:val="24"/>
-        </w:rPr>
-        <w:t>();</w:t>
-      </w:r>
-      <w:proofErr w:type="gramEnd"/>
-    </w:p>
-    <w:p>
-      <w:pPr>
-        <w:pStyle w:val="ListParagraph"/>
-        <w:pBdr>
-          <w:top w:val="single" w:sz="4" w:space="1" w:color="auto"/>
-          <w:left w:val="single" w:sz="4" w:space="4" w:color="auto"/>
-          <w:bottom w:val="single" w:sz="4" w:space="1" w:color="auto"/>
-          <w:right w:val="single" w:sz="4" w:space="4" w:color="auto"/>
-        </w:pBdr>
-        <w:spacing w:after="0" w:line="360" w:lineRule="auto"/>
-        <w:ind w:left="792"/>
-        <w:jc w:val="both"/>
-        <w:rPr>
-          <w:rFonts w:asciiTheme="majorHAnsi" w:hAnsiTheme="majorHAnsi"/>
-          <w:sz w:val="20"/>
-          <w:szCs w:val="24"/>
-        </w:rPr>
-      </w:pPr>
-      <w:r>
-        <w:rPr>
-          <w:rFonts w:asciiTheme="majorHAnsi" w:hAnsiTheme="majorHAnsi"/>
-          <w:sz w:val="20"/>
-          <w:szCs w:val="24"/>
-        </w:rPr>
-        <w:t xml:space="preserve">        } catch (Throwable </w:t>
-      </w:r>
-      <w:proofErr w:type="spellStart"/>
-      <w:r>
-        <w:rPr>
-          <w:rFonts w:asciiTheme="majorHAnsi" w:hAnsiTheme="majorHAnsi"/>
-          <w:sz w:val="20"/>
-          <w:szCs w:val="24"/>
-        </w:rPr>
-        <w:t>te</w:t>
-      </w:r>
-      <w:proofErr w:type="spellEnd"/>
-      <w:r>
-        <w:rPr>
-          <w:rFonts w:asciiTheme="majorHAnsi" w:hAnsiTheme="majorHAnsi"/>
-          <w:sz w:val="20"/>
-          <w:szCs w:val="24"/>
-        </w:rPr>
-        <w:t>) {</w:t>
-      </w:r>
-    </w:p>
-    <w:p>
-      <w:pPr>
-        <w:pStyle w:val="ListParagraph"/>
-        <w:pBdr>
-          <w:top w:val="single" w:sz="4" w:space="1" w:color="auto"/>
-          <w:left w:val="single" w:sz="4" w:space="4" w:color="auto"/>
-          <w:bottom w:val="single" w:sz="4" w:space="1" w:color="auto"/>
-          <w:right w:val="single" w:sz="4" w:space="4" w:color="auto"/>
-        </w:pBdr>
-        <w:spacing w:after="0" w:line="360" w:lineRule="auto"/>
-        <w:ind w:left="792"/>
-        <w:jc w:val="both"/>
-        <w:rPr>
-          <w:rFonts w:asciiTheme="majorHAnsi" w:hAnsiTheme="majorHAnsi"/>
-          <w:sz w:val="20"/>
-          <w:szCs w:val="24"/>
-        </w:rPr>
-      </w:pPr>
-      <w:r>
-        <w:rPr>
-          <w:rFonts w:asciiTheme="majorHAnsi" w:hAnsiTheme="majorHAnsi"/>
-          <w:sz w:val="20"/>
-          <w:szCs w:val="24"/>
-        </w:rPr>
-        <w:t xml:space="preserve">            </w:t>
-      </w:r>
-      <w:proofErr w:type="spellStart"/>
-      <w:proofErr w:type="gramStart"/>
-      <w:r>
-        <w:rPr>
-          <w:rFonts w:asciiTheme="majorHAnsi" w:hAnsiTheme="majorHAnsi"/>
-          <w:sz w:val="20"/>
-          <w:szCs w:val="24"/>
-        </w:rPr>
-        <w:t>te.printStackTrace</w:t>
-      </w:r>
-      <w:proofErr w:type="spellEnd"/>
-      <w:proofErr w:type="gramEnd"/>
-      <w:r>
-        <w:rPr>
-          <w:rFonts w:asciiTheme="majorHAnsi" w:hAnsiTheme="majorHAnsi"/>
-          <w:sz w:val="20"/>
-          <w:szCs w:val="24"/>
-        </w:rPr>
-        <w:t>(</w:t>
-      </w:r>
-      <w:proofErr w:type="gramStart"/>
-      <w:r>
-        <w:rPr>
-          <w:rFonts w:asciiTheme="majorHAnsi" w:hAnsiTheme="majorHAnsi"/>
-          <w:sz w:val="20"/>
-          <w:szCs w:val="24"/>
-        </w:rPr>
-        <w:t>);</w:t>
-      </w:r>
-      <w:proofErr w:type="gramEnd"/>
-    </w:p>
-    <w:p>
-      <w:pPr>
-        <w:pStyle w:val="ListParagraph"/>
-        <w:pBdr>
-          <w:top w:val="single" w:sz="4" w:space="1" w:color="auto"/>
-          <w:left w:val="single" w:sz="4" w:space="4" w:color="auto"/>
-          <w:bottom w:val="single" w:sz="4" w:space="1" w:color="auto"/>
-          <w:right w:val="single" w:sz="4" w:space="4" w:color="auto"/>
-        </w:pBdr>
-        <w:spacing w:after="0" w:line="360" w:lineRule="auto"/>
-        <w:ind w:left="792"/>
-        <w:jc w:val="both"/>
-        <w:rPr>
-          <w:rFonts w:asciiTheme="majorHAnsi" w:hAnsiTheme="majorHAnsi"/>
-          <w:sz w:val="20"/>
-          <w:szCs w:val="24"/>
-        </w:rPr>
-      </w:pPr>
-      <w:r>
-        <w:rPr>
-          <w:rFonts w:asciiTheme="majorHAnsi" w:hAnsiTheme="majorHAnsi"/>
-          <w:sz w:val="20"/>
-          <w:szCs w:val="24"/>
-        </w:rPr>
-        <w:t xml:space="preserve">        }</w:t>
-      </w:r>
-    </w:p>
-    <w:p>
-      <w:pPr>
-        <w:pStyle w:val="ListParagraph"/>
-        <w:pBdr>
-          <w:top w:val="single" w:sz="4" w:space="1" w:color="auto"/>
-          <w:left w:val="single" w:sz="4" w:space="4" w:color="auto"/>
-          <w:bottom w:val="single" w:sz="4" w:space="1" w:color="auto"/>
-          <w:right w:val="single" w:sz="4" w:space="4" w:color="auto"/>
-        </w:pBdr>
-        <w:spacing w:after="0" w:line="360" w:lineRule="auto"/>
-        <w:ind w:left="792"/>
-        <w:jc w:val="both"/>
-        <w:rPr>
-          <w:rFonts w:asciiTheme="majorHAnsi" w:hAnsiTheme="majorHAnsi"/>
-          <w:sz w:val="20"/>
-          <w:szCs w:val="24"/>
-        </w:rPr>
-      </w:pPr>
-      <w:r>
-        <w:rPr>
-          <w:rFonts w:asciiTheme="majorHAnsi" w:hAnsiTheme="majorHAnsi"/>
-          <w:sz w:val="20"/>
-          <w:szCs w:val="24"/>
-        </w:rPr>
-        <w:t>…</w:t>
-      </w:r>
     </w:p>
     <w:p>
       <w:pPr>
@@ -5033,60 +3358,6 @@
     </w:p>
     <w:p>
       <w:pPr>
-        <w:pStyle w:val="Caption"/>
-        <w:rPr>
-          <w:szCs w:val="24"/>
-        </w:rPr>
-      </w:pPr>
-      <w:bookmarkStart w:id="23" w:name="_Toc429428842"/>
-      <w:r>
-        <w:t xml:space="preserve">Code Listing </w:t>
-      </w:r>
-      <w:r>
-        <w:rPr>
-          <w:noProof/>
-        </w:rPr>
-        <w:fldChar w:fldCharType="begin"/>
-      </w:r>
-      <w:r>
-        <w:rPr>
-          <w:noProof/>
-        </w:rPr>
-        <w:instrText xml:space="preserve"> SEQ Code_Listing \* ARABIC </w:instrText>
-      </w:r>
-      <w:r>
-        <w:rPr>
-          <w:noProof/>
-        </w:rPr>
-        <w:fldChar w:fldCharType="separate"/>
-      </w:r>
-      <w:r>
-        <w:rPr>
-          <w:noProof/>
-        </w:rPr>
-        <w:t>1</w:t>
-      </w:r>
-      <w:r>
-        <w:rPr>
-          <w:noProof/>
-        </w:rPr>
-        <w:fldChar w:fldCharType="end"/>
-      </w:r>
-      <w:r>
-        <w:t xml:space="preserve"> </w:t>
-      </w:r>
-      <w:proofErr w:type="spellStart"/>
-      <w:r>
-        <w:t>MDBean</w:t>
-      </w:r>
-      <w:proofErr w:type="spellEnd"/>
-      <w:r>
-        <w:t xml:space="preserve"> Message Handling</w:t>
-      </w:r>
-      <w:bookmarkEnd w:id="23"/>
-    </w:p>
-    <w:p>
-      <w:pPr>
         <w:spacing w:after="0" w:line="360" w:lineRule="auto"/>
         <w:jc w:val="both"/>
         <w:rPr>
@@ -5094,388 +3365,6 @@
           <w:szCs w:val="24"/>
         </w:rPr>
       </w:pPr>
-    </w:p>
-    <w:p>
-      <w:pPr>
-        <w:spacing w:after="0" w:line="360" w:lineRule="auto"/>
-        <w:jc w:val="both"/>
-        <w:rPr>
-          <w:sz w:val="24"/>
-          <w:szCs w:val="24"/>
-        </w:rPr>
-      </w:pPr>
-      <w:r>
-        <w:rPr>
-          <w:sz w:val="24"/>
-          <w:szCs w:val="24"/>
-        </w:rPr>
-        <w:t xml:space="preserve">Notice that only minimal commenting is provided within the text.  The code is shown in Cambria, 10 </w:t>
-      </w:r>
-      <w:proofErr w:type="gramStart"/>
-      <w:r>
-        <w:rPr>
-          <w:sz w:val="24"/>
-          <w:szCs w:val="24"/>
-        </w:rPr>
-        <w:t>point</w:t>
-      </w:r>
-      <w:proofErr w:type="gramEnd"/>
-      <w:r>
-        <w:rPr>
-          <w:sz w:val="24"/>
-          <w:szCs w:val="24"/>
-        </w:rPr>
-        <w:t xml:space="preserve">. This reduces the overall text size and clearly distinguishes it from the main text. </w:t>
-      </w:r>
-    </w:p>
-    <w:p>
-      <w:pPr>
-        <w:pStyle w:val="ListParagraph"/>
-        <w:spacing w:after="0" w:line="360" w:lineRule="auto"/>
-        <w:ind w:left="792"/>
-        <w:jc w:val="both"/>
-        <w:rPr>
-          <w:sz w:val="24"/>
-          <w:szCs w:val="24"/>
-        </w:rPr>
-      </w:pPr>
-    </w:p>
-    <w:p>
-      <w:pPr>
-        <w:spacing w:after="0" w:line="360" w:lineRule="auto"/>
-        <w:jc w:val="both"/>
-        <w:rPr>
-          <w:sz w:val="24"/>
-          <w:szCs w:val="24"/>
-        </w:rPr>
-      </w:pPr>
-      <w:r>
-        <w:rPr>
-          <w:sz w:val="24"/>
-          <w:szCs w:val="24"/>
-        </w:rPr>
-        <w:t xml:space="preserve">If a single line of formula is </w:t>
-      </w:r>
-      <w:proofErr w:type="gramStart"/>
-      <w:r>
-        <w:rPr>
-          <w:sz w:val="24"/>
-          <w:szCs w:val="24"/>
-        </w:rPr>
-        <w:t>required</w:t>
-      </w:r>
-      <w:proofErr w:type="gramEnd"/>
-      <w:r>
-        <w:rPr>
-          <w:sz w:val="24"/>
-          <w:szCs w:val="24"/>
-        </w:rPr>
-        <w:t xml:space="preserve"> it can be referred to within the text as formula (</w:t>
-      </w:r>
-      <w:r>
-        <w:rPr>
-          <w:sz w:val="24"/>
-          <w:szCs w:val="24"/>
-        </w:rPr>
-        <w:t xml:space="preserve">Equation </w:t>
-      </w:r>
-      <w:r>
-        <w:rPr>
-          <w:sz w:val="24"/>
-          <w:szCs w:val="24"/>
-        </w:rPr>
-        <w:t>1) for example with the formula example shown slightly indented and with the formula number to the far right.</w:t>
-      </w:r>
-    </w:p>
-    <w:p>
-      <w:pPr>
-        <w:pStyle w:val="ListParagraph"/>
-        <w:tabs>
-          <w:tab w:val="left" w:pos="6439"/>
-        </w:tabs>
-        <w:spacing w:after="0" w:line="360" w:lineRule="auto"/>
-        <w:ind w:left="792"/>
-        <w:jc w:val="both"/>
-        <w:rPr>
-          <w:sz w:val="24"/>
-          <w:szCs w:val="24"/>
-        </w:rPr>
-      </w:pPr>
-      <w:r>
-        <w:rPr>
-          <w:sz w:val="24"/>
-          <w:szCs w:val="24"/>
-        </w:rPr>
-        <w:tab/>
-      </w:r>
-    </w:p>
-    <w:p>
-      <w:pPr>
-        <w:pStyle w:val="Caption"/>
-        <w:jc w:val="both"/>
-      </w:pPr>
-      <w:r>
-        <w:t xml:space="preserve">Equation </w:t>
-      </w:r>
-      <w:r>
-        <w:rPr>
-          <w:noProof/>
-        </w:rPr>
-        <w:fldChar w:fldCharType="begin"/>
-      </w:r>
-      <w:r>
-        <w:rPr>
-          <w:noProof/>
-        </w:rPr>
-        <w:instrText xml:space="preserve"> SEQ Equation \* ARABIC </w:instrText>
-      </w:r>
-      <w:r>
-        <w:rPr>
-          <w:noProof/>
-        </w:rPr>
-        <w:fldChar w:fldCharType="separate"/>
-      </w:r>
-      <w:r>
-        <w:rPr>
-          <w:noProof/>
-        </w:rPr>
-        <w:t>1</w:t>
-      </w:r>
-      <w:r>
-        <w:rPr>
-          <w:noProof/>
-        </w:rPr>
-        <w:fldChar w:fldCharType="end"/>
-      </w:r>
-    </w:p>
-    <w:p>
-      <w:pPr>
-        <w:pStyle w:val="ListParagraph"/>
-        <w:tabs>
-          <w:tab w:val="right" w:pos="9026"/>
-        </w:tabs>
-        <w:spacing w:after="0" w:line="360" w:lineRule="auto"/>
-        <w:ind w:left="1701"/>
-        <w:jc w:val="both"/>
-        <w:rPr>
-          <w:sz w:val="24"/>
-          <w:szCs w:val="24"/>
-        </w:rPr>
-      </w:pPr>
-      <m:oMath>
-        <m:r>
-          <w:rPr>
-            <w:rFonts w:ascii="Cambria Math" w:hAnsi="Cambria Math"/>
-            <w:sz w:val="28"/>
-            <w:szCs w:val="24"/>
-          </w:rPr>
-          <m:t>∆v=</m:t>
-        </m:r>
-        <m:sSub>
-          <m:sSubPr>
-            <m:ctrlPr>
-              <w:rPr>
-                <w:rFonts w:ascii="Cambria Math" w:hAnsi="Cambria Math"/>
-                <w:i/>
-                <w:sz w:val="28"/>
-                <w:szCs w:val="24"/>
-              </w:rPr>
-            </m:ctrlPr>
-          </m:sSubPr>
-          <m:e>
-            <m:r>
-              <w:rPr>
-                <w:rFonts w:ascii="Cambria Math" w:hAnsi="Cambria Math"/>
-                <w:sz w:val="28"/>
-                <w:szCs w:val="24"/>
-              </w:rPr>
-              <m:t>v</m:t>
-            </m:r>
-          </m:e>
-          <m:sub>
-            <m:r>
-              <w:rPr>
-                <w:rFonts w:ascii="Cambria Math" w:hAnsi="Cambria Math"/>
-                <w:sz w:val="28"/>
-                <w:szCs w:val="24"/>
-              </w:rPr>
-              <m:t>e</m:t>
-            </m:r>
-          </m:sub>
-        </m:sSub>
-        <m:r>
-          <w:rPr>
-            <w:rFonts w:ascii="Cambria Math" w:hAnsi="Cambria Math"/>
-            <w:sz w:val="28"/>
-            <w:szCs w:val="24"/>
-          </w:rPr>
-          <m:t>ln</m:t>
-        </m:r>
-        <m:f>
-          <m:fPr>
-            <m:ctrlPr>
-              <w:rPr>
-                <w:rFonts w:ascii="Cambria Math" w:hAnsi="Cambria Math"/>
-                <w:i/>
-                <w:sz w:val="28"/>
-                <w:szCs w:val="24"/>
-              </w:rPr>
-            </m:ctrlPr>
-          </m:fPr>
-          <m:num>
-            <m:sSub>
-              <m:sSubPr>
-                <m:ctrlPr>
-                  <w:rPr>
-                    <w:rFonts w:ascii="Cambria Math" w:hAnsi="Cambria Math"/>
-                    <w:i/>
-                    <w:sz w:val="28"/>
-                    <w:szCs w:val="24"/>
-                  </w:rPr>
-                </m:ctrlPr>
-              </m:sSubPr>
-              <m:e>
-                <m:r>
-                  <w:rPr>
-                    <w:rFonts w:ascii="Cambria Math" w:hAnsi="Cambria Math"/>
-                    <w:sz w:val="28"/>
-                    <w:szCs w:val="24"/>
-                  </w:rPr>
-                  <m:t>m</m:t>
-                </m:r>
-              </m:e>
-              <m:sub>
-                <m:r>
-                  <w:rPr>
-                    <w:rFonts w:ascii="Cambria Math" w:hAnsi="Cambria Math"/>
-                    <w:sz w:val="28"/>
-                    <w:szCs w:val="24"/>
-                  </w:rPr>
-                  <m:t>0</m:t>
-                </m:r>
-              </m:sub>
-            </m:sSub>
-          </m:num>
-          <m:den>
-            <m:sSub>
-              <m:sSubPr>
-                <m:ctrlPr>
-                  <w:rPr>
-                    <w:rFonts w:ascii="Cambria Math" w:hAnsi="Cambria Math"/>
-                    <w:i/>
-                    <w:sz w:val="28"/>
-                    <w:szCs w:val="24"/>
-                  </w:rPr>
-                </m:ctrlPr>
-              </m:sSubPr>
-              <m:e>
-                <m:r>
-                  <w:rPr>
-                    <w:rFonts w:ascii="Cambria Math" w:hAnsi="Cambria Math"/>
-                    <w:sz w:val="28"/>
-                    <w:szCs w:val="24"/>
-                  </w:rPr>
-                  <m:t>m</m:t>
-                </m:r>
-              </m:e>
-              <m:sub>
-                <m:r>
-                  <w:rPr>
-                    <w:rFonts w:ascii="Cambria Math" w:hAnsi="Cambria Math"/>
-                    <w:sz w:val="28"/>
-                    <w:szCs w:val="24"/>
-                  </w:rPr>
-                  <m:t>1</m:t>
-                </m:r>
-              </m:sub>
-            </m:sSub>
-          </m:den>
-        </m:f>
-      </m:oMath>
-      <w:r>
-        <w:rPr>
-          <w:sz w:val="24"/>
-          <w:szCs w:val="24"/>
-        </w:rPr>
-        <w:tab/>
-      </w:r>
-    </w:p>
-    <w:p>
-      <w:pPr>
-        <w:pStyle w:val="ListParagraph"/>
-        <w:spacing w:after="0" w:line="360" w:lineRule="auto"/>
-        <w:ind w:left="792"/>
-        <w:jc w:val="both"/>
-        <w:rPr>
-          <w:sz w:val="24"/>
-          <w:szCs w:val="24"/>
-        </w:rPr>
-      </w:pPr>
-    </w:p>
-    <w:p>
-      <w:pPr>
-        <w:spacing w:after="0" w:line="360" w:lineRule="auto"/>
-        <w:jc w:val="both"/>
-        <w:rPr>
-          <w:sz w:val="24"/>
-          <w:szCs w:val="24"/>
-        </w:rPr>
-      </w:pPr>
-      <w:r>
-        <w:rPr>
-          <w:sz w:val="24"/>
-          <w:szCs w:val="24"/>
-        </w:rPr>
-        <w:t>A single line space above and below the formula (Tsiolkovsky, 2000) also aids legibility. Note also that the font size</w:t>
-      </w:r>
-      <w:r>
-        <w:rPr>
-          <w:sz w:val="24"/>
-          <w:szCs w:val="24"/>
-        </w:rPr>
-        <w:t xml:space="preserve"> is increased</w:t>
-      </w:r>
-      <w:r>
-        <w:rPr>
-          <w:sz w:val="24"/>
-          <w:szCs w:val="24"/>
-        </w:rPr>
-        <w:t xml:space="preserve"> by one point. A further item to note is that equations may also be referenced.</w:t>
-      </w:r>
-    </w:p>
-    <w:p>
-      <w:pPr>
-        <w:pStyle w:val="ListParagraph"/>
-        <w:spacing w:after="0" w:line="360" w:lineRule="auto"/>
-        <w:ind w:left="792"/>
-        <w:jc w:val="both"/>
-        <w:rPr>
-          <w:sz w:val="24"/>
-          <w:szCs w:val="24"/>
-        </w:rPr>
-      </w:pPr>
-    </w:p>
-    <w:p>
-      <w:pPr>
-        <w:pStyle w:val="ListParagraph"/>
-        <w:spacing w:after="0" w:line="360" w:lineRule="auto"/>
-        <w:ind w:left="792"/>
-        <w:jc w:val="both"/>
-        <w:rPr>
-          <w:sz w:val="24"/>
-          <w:szCs w:val="24"/>
-        </w:rPr>
-      </w:pPr>
-    </w:p>
-    <w:p>
-      <w:pPr>
-        <w:spacing w:after="0" w:line="360" w:lineRule="auto"/>
-        <w:jc w:val="both"/>
-        <w:rPr>
-          <w:sz w:val="24"/>
-          <w:szCs w:val="24"/>
-        </w:rPr>
-      </w:pPr>
       <w:r>
         <w:rPr>
           <w:sz w:val="24"/>
@@ -5488,7 +3377,7 @@
       <w:pPr>
         <w:ind w:left="1701" w:hanging="1701"/>
         <w:sectPr>
-          <w:footerReference w:type="default" r:id="rId12"/>
+          <w:footerReference w:type="default" r:id="rId10"/>
           <w:pgSz w:w="11906" w:h="16838"/>
           <w:pgMar w:top="1440" w:right="1440" w:bottom="1440" w:left="1440" w:header="708" w:footer="708" w:gutter="0"/>
           <w:pgNumType w:start="1"/>
@@ -5503,14 +3392,14 @@
         <w:spacing w:before="0" w:line="360" w:lineRule="auto"/>
         <w:ind w:left="567" w:hanging="567"/>
       </w:pPr>
-      <w:bookmarkStart w:id="24" w:name="_Toc101374253"/>
-      <w:bookmarkStart w:id="25" w:name="_Toc193990932"/>
+      <w:bookmarkStart w:id="14" w:name="_Toc101374253"/>
+      <w:bookmarkStart w:id="15" w:name="_Toc193990932"/>
       <w:r>
         <w:lastRenderedPageBreak/>
         <w:t>References</w:t>
       </w:r>
-      <w:bookmarkEnd w:id="24"/>
-      <w:bookmarkEnd w:id="25"/>
+      <w:bookmarkEnd w:id="14"/>
+      <w:bookmarkEnd w:id="15"/>
     </w:p>
     <w:p>
       <w:pPr>
@@ -5598,23 +3487,7 @@
           <w:sz w:val="24"/>
           <w:szCs w:val="24"/>
         </w:rPr>
-        <w:t xml:space="preserve">a), Another Article, Proceedings of </w:t>
-      </w:r>
-      <w:proofErr w:type="gramStart"/>
-      <w:r>
-        <w:rPr>
-          <w:sz w:val="24"/>
-          <w:szCs w:val="24"/>
-        </w:rPr>
-        <w:t>The</w:t>
-      </w:r>
-      <w:proofErr w:type="gramEnd"/>
-      <w:r>
-        <w:rPr>
-          <w:sz w:val="24"/>
-          <w:szCs w:val="24"/>
-        </w:rPr>
-        <w:t xml:space="preserve"> 5th Conference on Computing, ACM, Paris, pp. 123-132.</w:t>
+        <w:t>a), Another Article, Proceedings of The 5th Conference on Computing, ACM, Paris, pp. 123-132.</w:t>
       </w:r>
     </w:p>
     <w:p>
@@ -5707,711 +3580,13 @@
       <w:pPr>
         <w:pStyle w:val="Heading1"/>
       </w:pPr>
-      <w:bookmarkStart w:id="26" w:name="_Toc193990933"/>
+      <w:bookmarkStart w:id="16" w:name="_Toc193990933"/>
       <w:r>
         <w:lastRenderedPageBreak/>
         <w:t>Appendix A: Report Structure Example</w:t>
       </w:r>
-      <w:bookmarkEnd w:id="26"/>
-    </w:p>
-    <w:p/>
-    <w:p>
-      <w:pPr>
-        <w:spacing w:line="360" w:lineRule="auto"/>
-        <w:jc w:val="center"/>
-        <w:rPr>
-          <w:b/>
-          <w:bCs/>
-          <w:sz w:val="32"/>
-          <w:szCs w:val="32"/>
-          <w:u w:val="single"/>
-        </w:rPr>
-      </w:pPr>
-      <w:r>
-        <w:rPr>
-          <w:b/>
-          <w:bCs/>
-          <w:sz w:val="32"/>
-          <w:szCs w:val="32"/>
-          <w:u w:val="single"/>
-        </w:rPr>
-        <w:t>Project Technical Report</w:t>
-      </w:r>
-    </w:p>
-    <w:p>
-      <w:pPr>
-        <w:spacing w:after="0" w:line="360" w:lineRule="auto"/>
-        <w:rPr>
-          <w:b/>
-          <w:bCs/>
-        </w:rPr>
-      </w:pPr>
-      <w:r>
-        <w:rPr>
-          <w:b/>
-          <w:bCs/>
-        </w:rPr>
-        <w:t xml:space="preserve">1) Project </w:t>
-      </w:r>
-      <w:r>
-        <w:rPr>
-          <w:b/>
-          <w:bCs/>
-        </w:rPr>
-        <w:t>Overview</w:t>
-      </w:r>
-    </w:p>
-    <w:p>
-      <w:pPr>
-        <w:numPr>
-          <w:ilvl w:val="0"/>
-          <w:numId w:val="14"/>
-        </w:numPr>
-        <w:spacing w:after="0" w:line="360" w:lineRule="auto"/>
-      </w:pPr>
-      <w:r>
-        <w:t>Purpose and objectives of the software</w:t>
-      </w:r>
-    </w:p>
-    <w:p>
-      <w:pPr>
-        <w:numPr>
-          <w:ilvl w:val="0"/>
-          <w:numId w:val="14"/>
-        </w:numPr>
-        <w:spacing w:after="0" w:line="360" w:lineRule="auto"/>
-      </w:pPr>
-      <w:r>
-        <w:t>Scope of the project</w:t>
-      </w:r>
-    </w:p>
-    <w:p>
-      <w:pPr>
-        <w:numPr>
-          <w:ilvl w:val="0"/>
-          <w:numId w:val="15"/>
-        </w:numPr>
-        <w:spacing w:after="0" w:line="360" w:lineRule="auto"/>
-      </w:pPr>
-      <w:r>
-        <w:t>Assumptions</w:t>
-      </w:r>
-      <w:r>
-        <w:t>, constraints</w:t>
-      </w:r>
-      <w:r>
-        <w:t xml:space="preserve"> and dependencies</w:t>
-      </w:r>
-    </w:p>
-    <w:p>
-      <w:pPr>
-        <w:numPr>
-          <w:ilvl w:val="0"/>
-          <w:numId w:val="15"/>
-        </w:numPr>
-        <w:spacing w:after="0" w:line="360" w:lineRule="auto"/>
-      </w:pPr>
-      <w:r>
-        <w:t>Definitions and acronyms</w:t>
-      </w:r>
-    </w:p>
-    <w:p>
-      <w:pPr>
-        <w:spacing w:after="0" w:line="360" w:lineRule="auto"/>
-        <w:ind w:left="720"/>
-      </w:pPr>
-    </w:p>
-    <w:p>
-      <w:pPr>
-        <w:spacing w:after="0" w:line="360" w:lineRule="auto"/>
-        <w:rPr>
-          <w:b/>
-          <w:bCs/>
-        </w:rPr>
-      </w:pPr>
-      <w:r>
-        <w:rPr>
-          <w:b/>
-          <w:bCs/>
-        </w:rPr>
-        <w:t xml:space="preserve">2) </w:t>
-      </w:r>
-      <w:r>
-        <w:rPr>
-          <w:b/>
-          <w:bCs/>
-        </w:rPr>
-        <w:t>Requirements</w:t>
-      </w:r>
-    </w:p>
-    <w:p>
-      <w:pPr>
-        <w:spacing w:after="0" w:line="240" w:lineRule="auto"/>
-        <w:rPr>
-          <w:i/>
-          <w:iCs/>
-        </w:rPr>
-      </w:pPr>
-      <w:r>
-        <w:rPr>
-          <w:i/>
-          <w:iCs/>
-        </w:rPr>
-        <w:t>Functional Requirements</w:t>
-      </w:r>
-    </w:p>
-    <w:p>
-      <w:pPr>
-        <w:numPr>
-          <w:ilvl w:val="0"/>
-          <w:numId w:val="16"/>
-        </w:numPr>
-        <w:spacing w:after="0" w:line="360" w:lineRule="auto"/>
-      </w:pPr>
-      <w:r>
-        <w:t>Detailed description of system functions and capabilities</w:t>
-      </w:r>
-    </w:p>
-    <w:p>
-      <w:pPr>
-        <w:numPr>
-          <w:ilvl w:val="0"/>
-          <w:numId w:val="16"/>
-        </w:numPr>
-        <w:spacing w:after="0" w:line="360" w:lineRule="auto"/>
-      </w:pPr>
-      <w:r>
-        <w:t>Input and output specifications</w:t>
-      </w:r>
-    </w:p>
-    <w:p>
-      <w:pPr>
-        <w:numPr>
-          <w:ilvl w:val="0"/>
-          <w:numId w:val="16"/>
-        </w:numPr>
-        <w:spacing w:after="0" w:line="360" w:lineRule="auto"/>
-      </w:pPr>
-      <w:r>
-        <w:t>Data processing operations</w:t>
-      </w:r>
-    </w:p>
-    <w:p>
-      <w:pPr>
-        <w:pStyle w:val="ListParagraph"/>
-        <w:numPr>
-          <w:ilvl w:val="0"/>
-          <w:numId w:val="16"/>
-        </w:numPr>
-      </w:pPr>
-      <w:r>
-        <w:t>Use cases, user stories (if applicable)</w:t>
-      </w:r>
-    </w:p>
-    <w:p>
-      <w:pPr>
-        <w:spacing w:after="0" w:line="240" w:lineRule="auto"/>
-        <w:rPr>
-          <w:i/>
-          <w:iCs/>
-        </w:rPr>
-      </w:pPr>
-      <w:r>
-        <w:rPr>
-          <w:i/>
-          <w:iCs/>
-        </w:rPr>
-        <w:t>Non-Functional Requirements</w:t>
-      </w:r>
-    </w:p>
-    <w:p>
-      <w:pPr>
-        <w:numPr>
-          <w:ilvl w:val="0"/>
-          <w:numId w:val="17"/>
-        </w:numPr>
-        <w:spacing w:after="0" w:line="360" w:lineRule="auto"/>
-      </w:pPr>
-      <w:r>
-        <w:t>Performance requirements (e.g., response time, throughput)</w:t>
-      </w:r>
-    </w:p>
-    <w:p>
-      <w:pPr>
-        <w:numPr>
-          <w:ilvl w:val="0"/>
-          <w:numId w:val="17"/>
-        </w:numPr>
-        <w:spacing w:after="0" w:line="360" w:lineRule="auto"/>
-      </w:pPr>
-      <w:r>
-        <w:t>Security requirements</w:t>
-      </w:r>
-    </w:p>
-    <w:p>
-      <w:pPr>
-        <w:numPr>
-          <w:ilvl w:val="0"/>
-          <w:numId w:val="17"/>
-        </w:numPr>
-        <w:spacing w:after="0" w:line="360" w:lineRule="auto"/>
-      </w:pPr>
-      <w:r>
-        <w:t>Usability and accessibility standards</w:t>
-      </w:r>
-    </w:p>
-    <w:p>
-      <w:pPr>
-        <w:numPr>
-          <w:ilvl w:val="0"/>
-          <w:numId w:val="17"/>
-        </w:numPr>
-        <w:spacing w:after="0" w:line="360" w:lineRule="auto"/>
-      </w:pPr>
-      <w:r>
-        <w:t>Reliability and availability metrics</w:t>
-      </w:r>
-    </w:p>
-    <w:p>
-      <w:pPr>
-        <w:numPr>
-          <w:ilvl w:val="0"/>
-          <w:numId w:val="17"/>
-        </w:numPr>
-        <w:spacing w:after="0" w:line="360" w:lineRule="auto"/>
-      </w:pPr>
-      <w:r>
-        <w:t>Scalability considerations</w:t>
-      </w:r>
-      <w:r>
-        <w:t xml:space="preserve"> </w:t>
-      </w:r>
-      <w:r>
-        <w:rPr>
-          <w:i/>
-          <w:iCs/>
-        </w:rPr>
-        <w:t>(if applicable)</w:t>
-      </w:r>
-    </w:p>
-    <w:p>
-      <w:pPr>
-        <w:spacing w:after="0" w:line="360" w:lineRule="auto"/>
-        <w:ind w:left="720"/>
-      </w:pPr>
-    </w:p>
-    <w:p>
-      <w:pPr>
-        <w:spacing w:after="0" w:line="360" w:lineRule="auto"/>
-        <w:rPr>
-          <w:b/>
-          <w:bCs/>
-        </w:rPr>
-      </w:pPr>
-      <w:r>
-        <w:rPr>
-          <w:b/>
-          <w:bCs/>
-        </w:rPr>
-        <w:t xml:space="preserve">3) </w:t>
-      </w:r>
-      <w:r>
-        <w:rPr>
-          <w:b/>
-          <w:bCs/>
-        </w:rPr>
-        <w:t xml:space="preserve">System </w:t>
-      </w:r>
-      <w:r>
-        <w:rPr>
-          <w:b/>
-          <w:bCs/>
-        </w:rPr>
-        <w:t>Architecture &amp; Design</w:t>
-      </w:r>
-    </w:p>
-    <w:p>
-      <w:pPr>
-        <w:numPr>
-          <w:ilvl w:val="0"/>
-          <w:numId w:val="18"/>
-        </w:numPr>
-        <w:spacing w:after="0" w:line="360" w:lineRule="auto"/>
-      </w:pPr>
-      <w:r>
-        <w:t>Hardware and software requirements (including development and runtime environment)</w:t>
-      </w:r>
-    </w:p>
-    <w:p>
-      <w:pPr>
-        <w:numPr>
-          <w:ilvl w:val="0"/>
-          <w:numId w:val="18"/>
-        </w:numPr>
-        <w:spacing w:after="0" w:line="360" w:lineRule="auto"/>
-      </w:pPr>
-      <w:r>
-        <w:t>High-level system architecture</w:t>
-      </w:r>
-    </w:p>
-    <w:p>
-      <w:pPr>
-        <w:numPr>
-          <w:ilvl w:val="0"/>
-          <w:numId w:val="18"/>
-        </w:numPr>
-        <w:spacing w:after="0" w:line="360" w:lineRule="auto"/>
-      </w:pPr>
-      <w:r>
-        <w:t>Key components/functions/objects and their interactions</w:t>
-      </w:r>
-    </w:p>
-    <w:p>
-      <w:pPr>
-        <w:numPr>
-          <w:ilvl w:val="0"/>
-          <w:numId w:val="18"/>
-        </w:numPr>
-        <w:spacing w:after="0" w:line="360" w:lineRule="auto"/>
-      </w:pPr>
-      <w:r>
-        <w:t>Detailed description of system features</w:t>
-      </w:r>
-      <w:r>
-        <w:t>, including workflow descriptions.</w:t>
-      </w:r>
-    </w:p>
-    <w:p>
-      <w:pPr>
-        <w:numPr>
-          <w:ilvl w:val="0"/>
-          <w:numId w:val="19"/>
-        </w:numPr>
-        <w:spacing w:after="0" w:line="360" w:lineRule="auto"/>
-      </w:pPr>
-      <w:r>
-        <w:t>Design and implementation constraints</w:t>
-      </w:r>
-    </w:p>
-    <w:p>
-      <w:pPr>
-        <w:numPr>
-          <w:ilvl w:val="0"/>
-          <w:numId w:val="19"/>
-        </w:numPr>
-        <w:spacing w:after="0" w:line="360" w:lineRule="auto"/>
-      </w:pPr>
-      <w:r>
-        <w:t>System qualities (e.g., maintainability, extensibility)</w:t>
-      </w:r>
-    </w:p>
-    <w:p>
-      <w:pPr>
-        <w:numPr>
-          <w:ilvl w:val="0"/>
-          <w:numId w:val="19"/>
-        </w:numPr>
-        <w:spacing w:after="0" w:line="360" w:lineRule="auto"/>
-      </w:pPr>
-      <w:r>
-        <w:t>Security protocols / considerations</w:t>
-      </w:r>
-    </w:p>
-    <w:p>
-      <w:pPr>
-        <w:numPr>
-          <w:ilvl w:val="0"/>
-          <w:numId w:val="19"/>
-        </w:numPr>
-        <w:spacing w:after="0" w:line="360" w:lineRule="auto"/>
-      </w:pPr>
-      <w:r>
-        <w:t>Testing strategy</w:t>
-      </w:r>
-    </w:p>
-    <w:p>
-      <w:pPr>
-        <w:spacing w:after="0" w:line="360" w:lineRule="auto"/>
-        <w:ind w:left="720"/>
-      </w:pPr>
-    </w:p>
-    <w:p>
-      <w:pPr>
-        <w:spacing w:after="0" w:line="360" w:lineRule="auto"/>
-        <w:ind w:left="720"/>
-      </w:pPr>
-    </w:p>
-    <w:p>
-      <w:pPr>
-        <w:spacing w:after="0" w:line="360" w:lineRule="auto"/>
-        <w:ind w:left="720"/>
-      </w:pPr>
-    </w:p>
-    <w:p>
-      <w:pPr>
-        <w:spacing w:after="0" w:line="360" w:lineRule="auto"/>
-        <w:rPr>
-          <w:b/>
-          <w:bCs/>
-        </w:rPr>
-      </w:pPr>
-      <w:r>
-        <w:rPr>
-          <w:b/>
-          <w:bCs/>
-        </w:rPr>
-        <w:lastRenderedPageBreak/>
-        <w:t>4) Data Requirements</w:t>
-      </w:r>
-    </w:p>
-    <w:p>
-      <w:pPr>
-        <w:pStyle w:val="ListParagraph"/>
-        <w:numPr>
-          <w:ilvl w:val="0"/>
-          <w:numId w:val="20"/>
-        </w:numPr>
-        <w:spacing w:after="0" w:line="360" w:lineRule="auto"/>
-      </w:pPr>
-      <w:r>
-        <w:t>Data models and schemas</w:t>
-      </w:r>
-    </w:p>
-    <w:p>
-      <w:pPr>
-        <w:pStyle w:val="ListParagraph"/>
-        <w:numPr>
-          <w:ilvl w:val="0"/>
-          <w:numId w:val="20"/>
-        </w:numPr>
-        <w:spacing w:after="0" w:line="360" w:lineRule="auto"/>
-      </w:pPr>
-      <w:r>
-        <w:t>Data flow diagrams, class diagram or similar</w:t>
-      </w:r>
-    </w:p>
-    <w:p>
-      <w:pPr>
-        <w:pStyle w:val="ListParagraph"/>
-        <w:spacing w:after="0" w:line="360" w:lineRule="auto"/>
-      </w:pPr>
-    </w:p>
-    <w:p>
-      <w:pPr>
-        <w:spacing w:after="0" w:line="360" w:lineRule="auto"/>
-        <w:rPr>
-          <w:b/>
-          <w:bCs/>
-        </w:rPr>
-      </w:pPr>
-      <w:r>
-        <w:rPr>
-          <w:b/>
-          <w:bCs/>
-        </w:rPr>
-        <w:t>5) Implementation</w:t>
-      </w:r>
-    </w:p>
-    <w:p>
-      <w:pPr>
-        <w:pStyle w:val="ListParagraph"/>
-        <w:numPr>
-          <w:ilvl w:val="0"/>
-          <w:numId w:val="21"/>
-        </w:numPr>
-        <w:spacing w:after="0" w:line="360" w:lineRule="auto"/>
-      </w:pPr>
-      <w:r>
-        <w:t>Document the development process</w:t>
-      </w:r>
-    </w:p>
-    <w:p>
-      <w:pPr>
-        <w:pStyle w:val="ListParagraph"/>
-        <w:numPr>
-          <w:ilvl w:val="0"/>
-          <w:numId w:val="21"/>
-        </w:numPr>
-        <w:spacing w:after="0" w:line="360" w:lineRule="auto"/>
-        <w:rPr>
-          <w:i/>
-          <w:iCs/>
-        </w:rPr>
-      </w:pPr>
-      <w:r>
-        <w:t>Code management, version control, etc.</w:t>
-      </w:r>
-      <w:r>
-        <w:t xml:space="preserve"> </w:t>
-      </w:r>
-      <w:r>
-        <w:rPr>
-          <w:i/>
-          <w:iCs/>
-        </w:rPr>
-        <w:t>(evidence of following best practice)</w:t>
-      </w:r>
-    </w:p>
-    <w:p>
-      <w:pPr>
-        <w:pStyle w:val="ListParagraph"/>
-        <w:numPr>
-          <w:ilvl w:val="0"/>
-          <w:numId w:val="20"/>
-        </w:numPr>
-        <w:spacing w:after="0" w:line="360" w:lineRule="auto"/>
-      </w:pPr>
-      <w:r>
-        <w:t>Discuss challenges, errors and limitations</w:t>
-      </w:r>
-    </w:p>
-    <w:p>
-      <w:pPr>
-        <w:pStyle w:val="ListParagraph"/>
-        <w:spacing w:after="0" w:line="360" w:lineRule="auto"/>
-      </w:pPr>
-    </w:p>
-    <w:p>
-      <w:pPr>
-        <w:spacing w:after="0" w:line="360" w:lineRule="auto"/>
-        <w:rPr>
-          <w:b/>
-          <w:bCs/>
-        </w:rPr>
-      </w:pPr>
-      <w:r>
-        <w:rPr>
-          <w:b/>
-          <w:bCs/>
-        </w:rPr>
-        <w:t>6) Testing &amp; Evaluation</w:t>
-      </w:r>
-    </w:p>
-    <w:p>
-      <w:pPr>
-        <w:pStyle w:val="ListParagraph"/>
-        <w:numPr>
-          <w:ilvl w:val="0"/>
-          <w:numId w:val="21"/>
-        </w:numPr>
-        <w:spacing w:after="0" w:line="360" w:lineRule="auto"/>
-      </w:pPr>
-      <w:r>
-        <w:t>Testing overview / discussing testing requirements</w:t>
-      </w:r>
-    </w:p>
-    <w:p>
-      <w:pPr>
-        <w:pStyle w:val="ListParagraph"/>
-        <w:numPr>
-          <w:ilvl w:val="0"/>
-          <w:numId w:val="21"/>
-        </w:numPr>
-        <w:spacing w:after="0" w:line="360" w:lineRule="auto"/>
-      </w:pPr>
-      <w:r>
-        <w:t>Functional Testing / Analysis</w:t>
-      </w:r>
-      <w:r>
-        <w:t xml:space="preserve"> </w:t>
-      </w:r>
-      <w:r>
-        <w:rPr>
-          <w:i/>
-          <w:iCs/>
-        </w:rPr>
-        <w:t>(following testing strategy)</w:t>
-      </w:r>
-    </w:p>
-    <w:p>
-      <w:pPr>
-        <w:pStyle w:val="ListParagraph"/>
-        <w:numPr>
-          <w:ilvl w:val="0"/>
-          <w:numId w:val="21"/>
-        </w:numPr>
-        <w:spacing w:after="0" w:line="360" w:lineRule="auto"/>
-      </w:pPr>
-      <w:r>
-        <w:t>Results/Evaluation Discussion</w:t>
-      </w:r>
-    </w:p>
-    <w:p>
-      <w:pPr>
-        <w:pStyle w:val="ListParagraph"/>
-        <w:spacing w:after="0" w:line="360" w:lineRule="auto"/>
-      </w:pPr>
-    </w:p>
-    <w:p>
-      <w:pPr>
-        <w:spacing w:after="0" w:line="360" w:lineRule="auto"/>
-        <w:rPr>
-          <w:b/>
-          <w:bCs/>
-        </w:rPr>
-      </w:pPr>
-      <w:r>
-        <w:rPr>
-          <w:b/>
-          <w:bCs/>
-        </w:rPr>
-        <w:t>7</w:t>
-      </w:r>
-      <w:r>
-        <w:rPr>
-          <w:b/>
-          <w:bCs/>
-        </w:rPr>
-        <w:t xml:space="preserve">) </w:t>
-      </w:r>
-      <w:r>
-        <w:rPr>
-          <w:b/>
-          <w:bCs/>
-        </w:rPr>
-        <w:t>Conclusion</w:t>
-      </w:r>
-    </w:p>
-    <w:p>
-      <w:pPr>
-        <w:pStyle w:val="ListParagraph"/>
-        <w:numPr>
-          <w:ilvl w:val="0"/>
-          <w:numId w:val="21"/>
-        </w:numPr>
-        <w:spacing w:after="0" w:line="360" w:lineRule="auto"/>
-      </w:pPr>
-      <w:r>
-        <w:t>Project conclusion/findings</w:t>
-      </w:r>
-    </w:p>
-    <w:p>
-      <w:pPr>
-        <w:pStyle w:val="ListParagraph"/>
-        <w:numPr>
-          <w:ilvl w:val="0"/>
-          <w:numId w:val="21"/>
-        </w:numPr>
-        <w:spacing w:after="0" w:line="360" w:lineRule="auto"/>
-      </w:pPr>
-      <w:r>
-        <w:t>Limitations</w:t>
-      </w:r>
-    </w:p>
-    <w:p>
-      <w:pPr>
-        <w:pStyle w:val="ListParagraph"/>
-        <w:numPr>
-          <w:ilvl w:val="0"/>
-          <w:numId w:val="21"/>
-        </w:numPr>
-        <w:spacing w:after="0" w:line="360" w:lineRule="auto"/>
-      </w:pPr>
-      <w:r>
-        <w:t>Future Work</w:t>
-      </w:r>
-    </w:p>
-    <w:p/>
+      <w:bookmarkEnd w:id="16"/>
+    </w:p>
     <w:p>
       <w:pPr>
         <w:spacing w:after="160" w:line="259" w:lineRule="auto"/>
@@ -6431,8 +3606,8 @@
       <w:pPr>
         <w:pStyle w:val="Heading1"/>
       </w:pPr>
-      <w:bookmarkStart w:id="27" w:name="_Toc101374255"/>
-      <w:bookmarkStart w:id="28" w:name="_Toc193990934"/>
+      <w:bookmarkStart w:id="17" w:name="_Toc101374255"/>
+      <w:bookmarkStart w:id="18" w:name="_Toc193990934"/>
       <w:r>
         <w:lastRenderedPageBreak/>
         <w:t xml:space="preserve">Appendix </w:t>
@@ -6443,11 +3618,11 @@
       <w:r>
         <w:t>:  Code Listing</w:t>
       </w:r>
-      <w:bookmarkEnd w:id="27"/>
+      <w:bookmarkEnd w:id="17"/>
       <w:r>
         <w:t xml:space="preserve"> / GitHub Project Link</w:t>
       </w:r>
-      <w:bookmarkEnd w:id="28"/>
+      <w:bookmarkEnd w:id="18"/>
     </w:p>
     <w:p>
       <w:pPr>
@@ -6456,7 +3631,7 @@
     </w:p>
     <w:p/>
     <w:sectPr>
-      <w:footerReference w:type="default" r:id="rId13"/>
+      <w:footerReference w:type="default" r:id="rId11"/>
       <w:pgSz w:w="11906" w:h="16838"/>
       <w:pgMar w:top="1440" w:right="1440" w:bottom="1440" w:left="1440" w:header="708" w:footer="708" w:gutter="0"/>
       <w:pgNumType w:fmt="lowerRoman" w:start="1"/>
@@ -7112,6 +4287,118 @@
     </w:lvl>
   </w:abstractNum>
   <w:abstractNum w:abstractNumId="4" w15:restartNumberingAfterBreak="0">
+    <w:nsid w:val="1CE1158A"/>
+    <w:multiLevelType w:val="hybridMultilevel"/>
+    <w:tmpl w:val="8C146ADC"/>
+    <w:lvl w:ilvl="0" w:tplc="59AA5FE0">
+      <w:numFmt w:val="bullet"/>
+      <w:lvlText w:val="-"/>
+      <w:lvlJc w:val="left"/>
+      <w:pPr>
+        <w:ind w:left="720" w:hanging="360"/>
+      </w:pPr>
+      <w:rPr>
+        <w:rFonts w:ascii="Calibri" w:eastAsiaTheme="minorEastAsia" w:hAnsi="Calibri" w:cs="Calibri" w:hint="default"/>
+      </w:rPr>
+    </w:lvl>
+    <w:lvl w:ilvl="1" w:tplc="18090003" w:tentative="1">
+      <w:start w:val="1"/>
+      <w:numFmt w:val="bullet"/>
+      <w:lvlText w:val="o"/>
+      <w:lvlJc w:val="left"/>
+      <w:pPr>
+        <w:ind w:left="1440" w:hanging="360"/>
+      </w:pPr>
+      <w:rPr>
+        <w:rFonts w:ascii="Courier New" w:hAnsi="Courier New" w:cs="Courier New" w:hint="default"/>
+      </w:rPr>
+    </w:lvl>
+    <w:lvl w:ilvl="2" w:tplc="18090005" w:tentative="1">
+      <w:start w:val="1"/>
+      <w:numFmt w:val="bullet"/>
+      <w:lvlText w:val=""/>
+      <w:lvlJc w:val="left"/>
+      <w:pPr>
+        <w:ind w:left="2160" w:hanging="360"/>
+      </w:pPr>
+      <w:rPr>
+        <w:rFonts w:ascii="Wingdings" w:hAnsi="Wingdings" w:hint="default"/>
+      </w:rPr>
+    </w:lvl>
+    <w:lvl w:ilvl="3" w:tplc="18090001" w:tentative="1">
+      <w:start w:val="1"/>
+      <w:numFmt w:val="bullet"/>
+      <w:lvlText w:val=""/>
+      <w:lvlJc w:val="left"/>
+      <w:pPr>
+        <w:ind w:left="2880" w:hanging="360"/>
+      </w:pPr>
+      <w:rPr>
+        <w:rFonts w:ascii="Symbol" w:hAnsi="Symbol" w:hint="default"/>
+      </w:rPr>
+    </w:lvl>
+    <w:lvl w:ilvl="4" w:tplc="18090003" w:tentative="1">
+      <w:start w:val="1"/>
+      <w:numFmt w:val="bullet"/>
+      <w:lvlText w:val="o"/>
+      <w:lvlJc w:val="left"/>
+      <w:pPr>
+        <w:ind w:left="3600" w:hanging="360"/>
+      </w:pPr>
+      <w:rPr>
+        <w:rFonts w:ascii="Courier New" w:hAnsi="Courier New" w:cs="Courier New" w:hint="default"/>
+      </w:rPr>
+    </w:lvl>
+    <w:lvl w:ilvl="5" w:tplc="18090005" w:tentative="1">
+      <w:start w:val="1"/>
+      <w:numFmt w:val="bullet"/>
+      <w:lvlText w:val=""/>
+      <w:lvlJc w:val="left"/>
+      <w:pPr>
+        <w:ind w:left="4320" w:hanging="360"/>
+      </w:pPr>
+      <w:rPr>
+        <w:rFonts w:ascii="Wingdings" w:hAnsi="Wingdings" w:hint="default"/>
+      </w:rPr>
+    </w:lvl>
+    <w:lvl w:ilvl="6" w:tplc="18090001" w:tentative="1">
+      <w:start w:val="1"/>
+      <w:numFmt w:val="bullet"/>
+      <w:lvlText w:val=""/>
+      <w:lvlJc w:val="left"/>
+      <w:pPr>
+        <w:ind w:left="5040" w:hanging="360"/>
+      </w:pPr>
+      <w:rPr>
+        <w:rFonts w:ascii="Symbol" w:hAnsi="Symbol" w:hint="default"/>
+      </w:rPr>
+    </w:lvl>
+    <w:lvl w:ilvl="7" w:tplc="18090003" w:tentative="1">
+      <w:start w:val="1"/>
+      <w:numFmt w:val="bullet"/>
+      <w:lvlText w:val="o"/>
+      <w:lvlJc w:val="left"/>
+      <w:pPr>
+        <w:ind w:left="5760" w:hanging="360"/>
+      </w:pPr>
+      <w:rPr>
+        <w:rFonts w:ascii="Courier New" w:hAnsi="Courier New" w:cs="Courier New" w:hint="default"/>
+      </w:rPr>
+    </w:lvl>
+    <w:lvl w:ilvl="8" w:tplc="18090005" w:tentative="1">
+      <w:start w:val="1"/>
+      <w:numFmt w:val="bullet"/>
+      <w:lvlText w:val=""/>
+      <w:lvlJc w:val="left"/>
+      <w:pPr>
+        <w:ind w:left="6480" w:hanging="360"/>
+      </w:pPr>
+      <w:rPr>
+        <w:rFonts w:ascii="Wingdings" w:hAnsi="Wingdings" w:hint="default"/>
+      </w:rPr>
+    </w:lvl>
+  </w:abstractNum>
+  <w:abstractNum w:abstractNumId="5" w15:restartNumberingAfterBreak="0">
     <w:nsid w:val="1EC47D28"/>
     <w:multiLevelType w:val="hybridMultilevel"/>
     <w:tmpl w:val="976C96E8"/>
@@ -7197,7 +4484,7 @@
       </w:pPr>
     </w:lvl>
   </w:abstractNum>
-  <w:abstractNum w:abstractNumId="5" w15:restartNumberingAfterBreak="0">
+  <w:abstractNum w:abstractNumId="6" w15:restartNumberingAfterBreak="0">
     <w:nsid w:val="210F64D0"/>
     <w:multiLevelType w:val="hybridMultilevel"/>
     <w:tmpl w:val="7A6639DA"/>
@@ -7310,7 +4597,7 @@
       </w:rPr>
     </w:lvl>
   </w:abstractNum>
-  <w:abstractNum w:abstractNumId="6" w15:restartNumberingAfterBreak="0">
+  <w:abstractNum w:abstractNumId="7" w15:restartNumberingAfterBreak="0">
     <w:nsid w:val="23DC667F"/>
     <w:multiLevelType w:val="multilevel"/>
     <w:tmpl w:val="B3DC99AA"/>
@@ -7459,7 +4746,7 @@
       </w:rPr>
     </w:lvl>
   </w:abstractNum>
-  <w:abstractNum w:abstractNumId="7" w15:restartNumberingAfterBreak="0">
+  <w:abstractNum w:abstractNumId="8" w15:restartNumberingAfterBreak="0">
     <w:nsid w:val="24952DE9"/>
     <w:multiLevelType w:val="multilevel"/>
     <w:tmpl w:val="1809001F"/>
@@ -7545,7 +4832,7 @@
       </w:pPr>
     </w:lvl>
   </w:abstractNum>
-  <w:abstractNum w:abstractNumId="8" w15:restartNumberingAfterBreak="0">
+  <w:abstractNum w:abstractNumId="9" w15:restartNumberingAfterBreak="0">
     <w:nsid w:val="2B3B2E35"/>
     <w:multiLevelType w:val="multilevel"/>
     <w:tmpl w:val="C0A88470"/>
@@ -7694,7 +4981,7 @@
       </w:rPr>
     </w:lvl>
   </w:abstractNum>
-  <w:abstractNum w:abstractNumId="9" w15:restartNumberingAfterBreak="0">
+  <w:abstractNum w:abstractNumId="10" w15:restartNumberingAfterBreak="0">
     <w:nsid w:val="31C20F72"/>
     <w:multiLevelType w:val="multilevel"/>
     <w:tmpl w:val="42A63998"/>
@@ -7807,7 +5094,7 @@
       </w:rPr>
     </w:lvl>
   </w:abstractNum>
-  <w:abstractNum w:abstractNumId="10" w15:restartNumberingAfterBreak="0">
+  <w:abstractNum w:abstractNumId="11" w15:restartNumberingAfterBreak="0">
     <w:nsid w:val="387E67BF"/>
     <w:multiLevelType w:val="hybridMultilevel"/>
     <w:tmpl w:val="9D3A5CA4"/>
@@ -7920,7 +5207,7 @@
       </w:rPr>
     </w:lvl>
   </w:abstractNum>
-  <w:abstractNum w:abstractNumId="11" w15:restartNumberingAfterBreak="0">
+  <w:abstractNum w:abstractNumId="12" w15:restartNumberingAfterBreak="0">
     <w:nsid w:val="3C27653E"/>
     <w:multiLevelType w:val="multilevel"/>
     <w:tmpl w:val="1809001F"/>
@@ -8006,7 +5293,7 @@
       </w:pPr>
     </w:lvl>
   </w:abstractNum>
-  <w:abstractNum w:abstractNumId="12" w15:restartNumberingAfterBreak="0">
+  <w:abstractNum w:abstractNumId="13" w15:restartNumberingAfterBreak="0">
     <w:nsid w:val="400839C3"/>
     <w:multiLevelType w:val="multilevel"/>
     <w:tmpl w:val="4E98AE18"/>
@@ -8155,7 +5442,7 @@
       </w:rPr>
     </w:lvl>
   </w:abstractNum>
-  <w:abstractNum w:abstractNumId="13" w15:restartNumberingAfterBreak="0">
+  <w:abstractNum w:abstractNumId="14" w15:restartNumberingAfterBreak="0">
     <w:nsid w:val="425E5319"/>
     <w:multiLevelType w:val="hybridMultilevel"/>
     <w:tmpl w:val="573AE2DC"/>
@@ -8268,7 +5555,7 @@
       </w:rPr>
     </w:lvl>
   </w:abstractNum>
-  <w:abstractNum w:abstractNumId="14" w15:restartNumberingAfterBreak="0">
+  <w:abstractNum w:abstractNumId="15" w15:restartNumberingAfterBreak="0">
     <w:nsid w:val="483F539D"/>
     <w:multiLevelType w:val="multilevel"/>
     <w:tmpl w:val="1809001F"/>
@@ -8354,7 +5641,7 @@
       </w:pPr>
     </w:lvl>
   </w:abstractNum>
-  <w:abstractNum w:abstractNumId="15" w15:restartNumberingAfterBreak="0">
+  <w:abstractNum w:abstractNumId="16" w15:restartNumberingAfterBreak="0">
     <w:nsid w:val="57D843FE"/>
     <w:multiLevelType w:val="multilevel"/>
     <w:tmpl w:val="1809001F"/>
@@ -8440,7 +5727,7 @@
       </w:pPr>
     </w:lvl>
   </w:abstractNum>
-  <w:abstractNum w:abstractNumId="16" w15:restartNumberingAfterBreak="0">
+  <w:abstractNum w:abstractNumId="17" w15:restartNumberingAfterBreak="0">
     <w:nsid w:val="596E17BB"/>
     <w:multiLevelType w:val="multilevel"/>
     <w:tmpl w:val="1809001F"/>
@@ -8526,7 +5813,7 @@
       </w:pPr>
     </w:lvl>
   </w:abstractNum>
-  <w:abstractNum w:abstractNumId="17" w15:restartNumberingAfterBreak="0">
+  <w:abstractNum w:abstractNumId="18" w15:restartNumberingAfterBreak="0">
     <w:nsid w:val="62FF0E61"/>
     <w:multiLevelType w:val="multilevel"/>
     <w:tmpl w:val="1809001F"/>
@@ -8612,7 +5899,7 @@
       </w:pPr>
     </w:lvl>
   </w:abstractNum>
-  <w:abstractNum w:abstractNumId="18" w15:restartNumberingAfterBreak="0">
+  <w:abstractNum w:abstractNumId="19" w15:restartNumberingAfterBreak="0">
     <w:nsid w:val="65B35916"/>
     <w:multiLevelType w:val="multilevel"/>
     <w:tmpl w:val="C1FED04A"/>
@@ -8761,7 +6048,7 @@
       </w:rPr>
     </w:lvl>
   </w:abstractNum>
-  <w:abstractNum w:abstractNumId="19" w15:restartNumberingAfterBreak="0">
+  <w:abstractNum w:abstractNumId="20" w15:restartNumberingAfterBreak="0">
     <w:nsid w:val="76E157EA"/>
     <w:multiLevelType w:val="multilevel"/>
     <w:tmpl w:val="42A63998"/>
@@ -8874,7 +6161,7 @@
       </w:rPr>
     </w:lvl>
   </w:abstractNum>
-  <w:abstractNum w:abstractNumId="20" w15:restartNumberingAfterBreak="0">
+  <w:abstractNum w:abstractNumId="21" w15:restartNumberingAfterBreak="0">
     <w:nsid w:val="76F72D90"/>
     <w:multiLevelType w:val="multilevel"/>
     <w:tmpl w:val="1809001F"/>
@@ -8961,67 +6248,70 @@
     </w:lvl>
   </w:abstractNum>
   <w:num w:numId="1" w16cid:durableId="164783103">
-    <w:abstractNumId w:val="9"/>
+    <w:abstractNumId w:val="10"/>
   </w:num>
   <w:num w:numId="2" w16cid:durableId="1974363537">
-    <w:abstractNumId w:val="5"/>
+    <w:abstractNumId w:val="6"/>
   </w:num>
   <w:num w:numId="3" w16cid:durableId="1154569728">
+    <w:abstractNumId w:val="16"/>
+  </w:num>
+  <w:num w:numId="4" w16cid:durableId="2124879464">
+    <w:abstractNumId w:val="18"/>
+  </w:num>
+  <w:num w:numId="5" w16cid:durableId="498275244">
+    <w:abstractNumId w:val="17"/>
+  </w:num>
+  <w:num w:numId="6" w16cid:durableId="1466855395">
     <w:abstractNumId w:val="15"/>
   </w:num>
-  <w:num w:numId="4" w16cid:durableId="2124879464">
-    <w:abstractNumId w:val="17"/>
-  </w:num>
-  <w:num w:numId="5" w16cid:durableId="498275244">
-    <w:abstractNumId w:val="16"/>
-  </w:num>
-  <w:num w:numId="6" w16cid:durableId="1466855395">
-    <w:abstractNumId w:val="14"/>
-  </w:num>
   <w:num w:numId="7" w16cid:durableId="158809926">
-    <w:abstractNumId w:val="20"/>
+    <w:abstractNumId w:val="21"/>
   </w:num>
   <w:num w:numId="8" w16cid:durableId="689723603">
-    <w:abstractNumId w:val="7"/>
+    <w:abstractNumId w:val="8"/>
   </w:num>
   <w:num w:numId="9" w16cid:durableId="1898321483">
     <w:abstractNumId w:val="3"/>
   </w:num>
   <w:num w:numId="10" w16cid:durableId="417095995">
-    <w:abstractNumId w:val="19"/>
+    <w:abstractNumId w:val="20"/>
   </w:num>
   <w:num w:numId="11" w16cid:durableId="996961976">
     <w:abstractNumId w:val="1"/>
   </w:num>
   <w:num w:numId="12" w16cid:durableId="374893155">
-    <w:abstractNumId w:val="11"/>
+    <w:abstractNumId w:val="12"/>
   </w:num>
   <w:num w:numId="13" w16cid:durableId="691999202">
-    <w:abstractNumId w:val="4"/>
+    <w:abstractNumId w:val="5"/>
   </w:num>
   <w:num w:numId="14" w16cid:durableId="1054543310">
     <w:abstractNumId w:val="2"/>
   </w:num>
   <w:num w:numId="15" w16cid:durableId="875894764">
-    <w:abstractNumId w:val="12"/>
+    <w:abstractNumId w:val="13"/>
   </w:num>
   <w:num w:numId="16" w16cid:durableId="589235824">
-    <w:abstractNumId w:val="18"/>
+    <w:abstractNumId w:val="19"/>
   </w:num>
   <w:num w:numId="17" w16cid:durableId="1602565703">
-    <w:abstractNumId w:val="6"/>
+    <w:abstractNumId w:val="7"/>
   </w:num>
   <w:num w:numId="18" w16cid:durableId="274219580">
     <w:abstractNumId w:val="0"/>
   </w:num>
   <w:num w:numId="19" w16cid:durableId="725033526">
-    <w:abstractNumId w:val="8"/>
+    <w:abstractNumId w:val="9"/>
   </w:num>
   <w:num w:numId="20" w16cid:durableId="1298686657">
-    <w:abstractNumId w:val="13"/>
+    <w:abstractNumId w:val="14"/>
   </w:num>
   <w:num w:numId="21" w16cid:durableId="299459585">
-    <w:abstractNumId w:val="10"/>
+    <w:abstractNumId w:val="11"/>
+  </w:num>
+  <w:num w:numId="22" w16cid:durableId="1492528682">
+    <w:abstractNumId w:val="4"/>
   </w:num>
 </w:numbering>
 </file>

</xml_diff>

<commit_message>
Work on implementing plugin
</commit_message>
<xml_diff>
--- a/Documentation/Project Technical Report WIP.docx
+++ b/Documentation/Project Technical Report WIP.docx
@@ -48,7 +48,16 @@
           <w:sz w:val="40"/>
           <w:szCs w:val="40"/>
         </w:rPr>
-        <w:t xml:space="preserve"> (Hons) Course Name Here</w:t>
+        <w:t xml:space="preserve"> (Hons) C</w:t>
+      </w:r>
+      <w:r>
+        <w:rPr>
+          <w:b/>
+          <w:bCs/>
+          <w:sz w:val="40"/>
+          <w:szCs w:val="40"/>
+        </w:rPr>
+        <w:t>omputing with Computer Games Development</w:t>
       </w:r>
     </w:p>
     <w:p>
@@ -152,7 +161,7 @@
           <w:sz w:val="40"/>
           <w:szCs w:val="40"/>
         </w:rPr>
-        <w:t>Project Title</w:t>
+        <w:t>Narratology vs Ludology: Comparing Narrative Engagement Between Game Design Methodologies</w:t>
       </w:r>
     </w:p>
     <w:p>
@@ -186,7 +195,7 @@
           <w:sz w:val="40"/>
           <w:szCs w:val="40"/>
         </w:rPr>
-        <w:t>Student Name</w:t>
+        <w:t>Maya McGhee</w:t>
       </w:r>
     </w:p>
     <w:p>
@@ -202,7 +211,7 @@
           <w:sz w:val="40"/>
           <w:szCs w:val="40"/>
         </w:rPr>
-        <w:t>Student ID</w:t>
+        <w:t>L00169946</w:t>
       </w:r>
     </w:p>
     <w:p>
@@ -249,7 +258,6 @@
           <w:sz w:val="32"/>
           <w:szCs w:val="32"/>
         </w:rPr>
-        <w:lastRenderedPageBreak/>
         <w:t>Declaration</w:t>
       </w:r>
       <w:bookmarkEnd w:id="0"/>
@@ -486,7 +494,7 @@
           </w:rPr>
           <w:id w:val="1031225410"/>
           <w14:checkbox>
-            <w14:checked w14:val="0"/>
+            <w14:checked w14:val="1"/>
             <w14:checkedState w14:val="2612" w14:font="MS Gothic"/>
             <w14:uncheckedState w14:val="2610" w14:font="MS Gothic"/>
           </w14:checkbox>
@@ -500,7 +508,7 @@
               <w:sz w:val="20"/>
               <w:szCs w:val="20"/>
             </w:rPr>
-            <w:t>☐</w:t>
+            <w:t>☒</w:t>
           </w:r>
         </w:sdtContent>
       </w:sdt>
@@ -540,7 +548,23 @@
           <w:sz w:val="20"/>
           <w:szCs w:val="20"/>
         </w:rPr>
-        <w:t xml:space="preserve"> _______________________________</w:t>
+        <w:t xml:space="preserve"> _______</w:t>
+      </w:r>
+      <w:r>
+        <w:rPr>
+          <w:rFonts w:ascii="Arial" w:hAnsi="Arial" w:cs="Arial"/>
+          <w:sz w:val="20"/>
+          <w:szCs w:val="20"/>
+        </w:rPr>
+        <w:t>Maya McGhee</w:t>
+      </w:r>
+      <w:r>
+        <w:rPr>
+          <w:rFonts w:ascii="Arial" w:hAnsi="Arial" w:cs="Arial"/>
+          <w:sz w:val="20"/>
+          <w:szCs w:val="20"/>
+        </w:rPr>
+        <w:t>________________________</w:t>
       </w:r>
     </w:p>
     <w:p>
@@ -560,7 +584,22 @@
         <w:t>Date:</w:t>
       </w:r>
       <w:r>
-        <w:t xml:space="preserve"> DD/MM/YYYY</w:t>
+        <w:t xml:space="preserve"> </w:t>
+      </w:r>
+      <w:r>
+        <w:t>11</w:t>
+      </w:r>
+      <w:r>
+        <w:t>/</w:t>
+      </w:r>
+      <w:r>
+        <w:t>12</w:t>
+      </w:r>
+      <w:r>
+        <w:t>/</w:t>
+      </w:r>
+      <w:r>
+        <w:t>2025</w:t>
       </w:r>
     </w:p>
     <w:p>
@@ -714,7 +753,7 @@
           <w:r>
             <w:fldChar w:fldCharType="separate"/>
           </w:r>
-          <w:hyperlink w:anchor="_Toc193990920" w:history="1">
+          <w:hyperlink w:anchor="_Toc216371223" w:history="1">
             <w:r>
               <w:rPr>
                 <w:rStyle w:val="Hyperlink"/>
@@ -759,7 +798,7 @@
                 <w:noProof/>
                 <w:webHidden/>
               </w:rPr>
-              <w:instrText xml:space="preserve"> PAGEREF _Toc193990920 \h </w:instrText>
+              <w:instrText xml:space="preserve"> PAGEREF _Toc216371223 \h </w:instrText>
             </w:r>
             <w:r>
               <w:rPr>
@@ -806,7 +845,7 @@
               <w14:ligatures w14:val="standardContextual"/>
             </w:rPr>
           </w:pPr>
-          <w:hyperlink w:anchor="_Toc193990921" w:history="1">
+          <w:hyperlink w:anchor="_Toc216371224" w:history="1">
             <w:r>
               <w:rPr>
                 <w:rStyle w:val="Hyperlink"/>
@@ -851,7 +890,7 @@
                 <w:noProof/>
                 <w:webHidden/>
               </w:rPr>
-              <w:instrText xml:space="preserve"> PAGEREF _Toc193990921 \h </w:instrText>
+              <w:instrText xml:space="preserve"> PAGEREF _Toc216371224 \h </w:instrText>
             </w:r>
             <w:r>
               <w:rPr>
@@ -898,7 +937,7 @@
               <w14:ligatures w14:val="standardContextual"/>
             </w:rPr>
           </w:pPr>
-          <w:hyperlink w:anchor="_Toc193990922" w:history="1">
+          <w:hyperlink w:anchor="_Toc216371225" w:history="1">
             <w:r>
               <w:rPr>
                 <w:rStyle w:val="Hyperlink"/>
@@ -943,191 +982,7 @@
                 <w:noProof/>
                 <w:webHidden/>
               </w:rPr>
-              <w:instrText xml:space="preserve"> PAGEREF _Toc193990922 \h </w:instrText>
-            </w:r>
-            <w:r>
-              <w:rPr>
-                <w:noProof/>
-                <w:webHidden/>
-              </w:rPr>
-            </w:r>
-            <w:r>
-              <w:rPr>
-                <w:noProof/>
-                <w:webHidden/>
-              </w:rPr>
-              <w:fldChar w:fldCharType="separate"/>
-            </w:r>
-            <w:r>
-              <w:rPr>
-                <w:noProof/>
-                <w:webHidden/>
-              </w:rPr>
-              <w:t>1</w:t>
-            </w:r>
-            <w:r>
-              <w:rPr>
-                <w:noProof/>
-                <w:webHidden/>
-              </w:rPr>
-              <w:fldChar w:fldCharType="end"/>
-            </w:r>
-          </w:hyperlink>
-        </w:p>
-        <w:p>
-          <w:pPr>
-            <w:pStyle w:val="TOC3"/>
-            <w:tabs>
-              <w:tab w:val="left" w:pos="1440"/>
-              <w:tab w:val="right" w:leader="dot" w:pos="9016"/>
-            </w:tabs>
-            <w:rPr>
-              <w:noProof/>
-              <w:kern w:val="2"/>
-              <w:sz w:val="24"/>
-              <w:szCs w:val="24"/>
-              <w:lang w:val="en-IE" w:eastAsia="en-IE"/>
-              <w14:ligatures w14:val="standardContextual"/>
-            </w:rPr>
-          </w:pPr>
-          <w:hyperlink w:anchor="_Toc193990923" w:history="1">
-            <w:r>
-              <w:rPr>
-                <w:rStyle w:val="Hyperlink"/>
-                <w:noProof/>
-              </w:rPr>
-              <w:t>1.2.1.</w:t>
-            </w:r>
-            <w:r>
-              <w:rPr>
-                <w:noProof/>
-                <w:kern w:val="2"/>
-                <w:sz w:val="24"/>
-                <w:szCs w:val="24"/>
-                <w:lang w:val="en-IE" w:eastAsia="en-IE"/>
-                <w14:ligatures w14:val="standardContextual"/>
-              </w:rPr>
-              <w:tab/>
-            </w:r>
-            <w:r>
-              <w:rPr>
-                <w:rStyle w:val="Hyperlink"/>
-                <w:noProof/>
-              </w:rPr>
-              <w:t>One liner</w:t>
-            </w:r>
-            <w:r>
-              <w:rPr>
-                <w:noProof/>
-                <w:webHidden/>
-              </w:rPr>
-              <w:tab/>
-            </w:r>
-            <w:r>
-              <w:rPr>
-                <w:noProof/>
-                <w:webHidden/>
-              </w:rPr>
-              <w:fldChar w:fldCharType="begin"/>
-            </w:r>
-            <w:r>
-              <w:rPr>
-                <w:noProof/>
-                <w:webHidden/>
-              </w:rPr>
-              <w:instrText xml:space="preserve"> PAGEREF _Toc193990923 \h </w:instrText>
-            </w:r>
-            <w:r>
-              <w:rPr>
-                <w:noProof/>
-                <w:webHidden/>
-              </w:rPr>
-            </w:r>
-            <w:r>
-              <w:rPr>
-                <w:noProof/>
-                <w:webHidden/>
-              </w:rPr>
-              <w:fldChar w:fldCharType="separate"/>
-            </w:r>
-            <w:r>
-              <w:rPr>
-                <w:noProof/>
-                <w:webHidden/>
-              </w:rPr>
-              <w:t>1</w:t>
-            </w:r>
-            <w:r>
-              <w:rPr>
-                <w:noProof/>
-                <w:webHidden/>
-              </w:rPr>
-              <w:fldChar w:fldCharType="end"/>
-            </w:r>
-          </w:hyperlink>
-        </w:p>
-        <w:p>
-          <w:pPr>
-            <w:pStyle w:val="TOC3"/>
-            <w:tabs>
-              <w:tab w:val="left" w:pos="1440"/>
-              <w:tab w:val="right" w:leader="dot" w:pos="9016"/>
-            </w:tabs>
-            <w:rPr>
-              <w:noProof/>
-              <w:kern w:val="2"/>
-              <w:sz w:val="24"/>
-              <w:szCs w:val="24"/>
-              <w:lang w:val="en-IE" w:eastAsia="en-IE"/>
-              <w14:ligatures w14:val="standardContextual"/>
-            </w:rPr>
-          </w:pPr>
-          <w:hyperlink w:anchor="_Toc193990924" w:history="1">
-            <w:r>
-              <w:rPr>
-                <w:rStyle w:val="Hyperlink"/>
-                <w:noProof/>
-              </w:rPr>
-              <w:t>1.2.2.</w:t>
-            </w:r>
-            <w:r>
-              <w:rPr>
-                <w:noProof/>
-                <w:kern w:val="2"/>
-                <w:sz w:val="24"/>
-                <w:szCs w:val="24"/>
-                <w:lang w:val="en-IE" w:eastAsia="en-IE"/>
-                <w14:ligatures w14:val="standardContextual"/>
-              </w:rPr>
-              <w:tab/>
-            </w:r>
-            <w:r>
-              <w:rPr>
-                <w:rStyle w:val="Hyperlink"/>
-                <w:noProof/>
-              </w:rPr>
-              <w:t>Sub-Item</w:t>
-            </w:r>
-            <w:r>
-              <w:rPr>
-                <w:noProof/>
-                <w:webHidden/>
-              </w:rPr>
-              <w:tab/>
-            </w:r>
-            <w:r>
-              <w:rPr>
-                <w:noProof/>
-                <w:webHidden/>
-              </w:rPr>
-              <w:fldChar w:fldCharType="begin"/>
-            </w:r>
-            <w:r>
-              <w:rPr>
-                <w:noProof/>
-                <w:webHidden/>
-              </w:rPr>
-              <w:instrText xml:space="preserve"> PAGEREF _Toc193990924 \h </w:instrText>
+              <w:instrText xml:space="preserve"> PAGEREF _Toc216371225 \h </w:instrText>
             </w:r>
             <w:r>
               <w:rPr>
@@ -1174,7 +1029,7 @@
               <w14:ligatures w14:val="standardContextual"/>
             </w:rPr>
           </w:pPr>
-          <w:hyperlink w:anchor="_Toc193990925" w:history="1">
+          <w:hyperlink w:anchor="_Toc216371226" w:history="1">
             <w:r>
               <w:rPr>
                 <w:rStyle w:val="Hyperlink"/>
@@ -1219,7 +1074,7 @@
                 <w:noProof/>
                 <w:webHidden/>
               </w:rPr>
-              <w:instrText xml:space="preserve"> PAGEREF _Toc193990925 \h </w:instrText>
+              <w:instrText xml:space="preserve"> PAGEREF _Toc216371226 \h </w:instrText>
             </w:r>
             <w:r>
               <w:rPr>
@@ -1266,7 +1121,7 @@
               <w14:ligatures w14:val="standardContextual"/>
             </w:rPr>
           </w:pPr>
-          <w:hyperlink w:anchor="_Toc193990926" w:history="1">
+          <w:hyperlink w:anchor="_Toc216371227" w:history="1">
             <w:r>
               <w:rPr>
                 <w:rStyle w:val="Hyperlink"/>
@@ -1311,7 +1166,7 @@
                 <w:noProof/>
                 <w:webHidden/>
               </w:rPr>
-              <w:instrText xml:space="preserve"> PAGEREF _Toc193990926 \h </w:instrText>
+              <w:instrText xml:space="preserve"> PAGEREF _Toc216371227 \h </w:instrText>
             </w:r>
             <w:r>
               <w:rPr>
@@ -1331,7 +1186,7 @@
                 <w:noProof/>
                 <w:webHidden/>
               </w:rPr>
-              <w:t>2</w:t>
+              <w:t>1</w:t>
             </w:r>
             <w:r>
               <w:rPr>
@@ -1358,7 +1213,7 @@
               <w14:ligatures w14:val="standardContextual"/>
             </w:rPr>
           </w:pPr>
-          <w:hyperlink w:anchor="_Toc193990927" w:history="1">
+          <w:hyperlink w:anchor="_Toc216371228" w:history="1">
             <w:r>
               <w:rPr>
                 <w:rStyle w:val="Hyperlink"/>
@@ -1403,7 +1258,7 @@
                 <w:noProof/>
                 <w:webHidden/>
               </w:rPr>
-              <w:instrText xml:space="preserve"> PAGEREF _Toc193990927 \h </w:instrText>
+              <w:instrText xml:space="preserve"> PAGEREF _Toc216371228 \h </w:instrText>
             </w:r>
             <w:r>
               <w:rPr>
@@ -1423,7 +1278,7 @@
                 <w:noProof/>
                 <w:webHidden/>
               </w:rPr>
-              <w:t>3</w:t>
+              <w:t>2</w:t>
             </w:r>
             <w:r>
               <w:rPr>
@@ -1450,7 +1305,7 @@
               <w14:ligatures w14:val="standardContextual"/>
             </w:rPr>
           </w:pPr>
-          <w:hyperlink w:anchor="_Toc193990928" w:history="1">
+          <w:hyperlink w:anchor="_Toc216371229" w:history="1">
             <w:r>
               <w:rPr>
                 <w:rStyle w:val="Hyperlink"/>
@@ -1495,7 +1350,7 @@
                 <w:noProof/>
                 <w:webHidden/>
               </w:rPr>
-              <w:instrText xml:space="preserve"> PAGEREF _Toc193990928 \h </w:instrText>
+              <w:instrText xml:space="preserve"> PAGEREF _Toc216371229 \h </w:instrText>
             </w:r>
             <w:r>
               <w:rPr>
@@ -1515,7 +1370,7 @@
                 <w:noProof/>
                 <w:webHidden/>
               </w:rPr>
-              <w:t>3</w:t>
+              <w:t>2</w:t>
             </w:r>
             <w:r>
               <w:rPr>
@@ -1542,7 +1397,7 @@
               <w14:ligatures w14:val="standardContextual"/>
             </w:rPr>
           </w:pPr>
-          <w:hyperlink w:anchor="_Toc193990929" w:history="1">
+          <w:hyperlink w:anchor="_Toc216371230" w:history="1">
             <w:r>
               <w:rPr>
                 <w:rStyle w:val="Hyperlink"/>
@@ -1587,7 +1442,7 @@
                 <w:noProof/>
                 <w:webHidden/>
               </w:rPr>
-              <w:instrText xml:space="preserve"> PAGEREF _Toc193990929 \h </w:instrText>
+              <w:instrText xml:space="preserve"> PAGEREF _Toc216371230 \h </w:instrText>
             </w:r>
             <w:r>
               <w:rPr>
@@ -1607,7 +1462,7 @@
                 <w:noProof/>
                 <w:webHidden/>
               </w:rPr>
-              <w:t>3</w:t>
+              <w:t>2</w:t>
             </w:r>
             <w:r>
               <w:rPr>
@@ -1634,7 +1489,7 @@
               <w14:ligatures w14:val="standardContextual"/>
             </w:rPr>
           </w:pPr>
-          <w:hyperlink w:anchor="_Toc193990930" w:history="1">
+          <w:hyperlink w:anchor="_Toc216371231" w:history="1">
             <w:r>
               <w:rPr>
                 <w:rStyle w:val="Hyperlink"/>
@@ -1679,7 +1534,7 @@
                 <w:noProof/>
                 <w:webHidden/>
               </w:rPr>
-              <w:instrText xml:space="preserve"> PAGEREF _Toc193990930 \h </w:instrText>
+              <w:instrText xml:space="preserve"> PAGEREF _Toc216371231 \h </w:instrText>
             </w:r>
             <w:r>
               <w:rPr>
@@ -1699,7 +1554,7 @@
                 <w:noProof/>
                 <w:webHidden/>
               </w:rPr>
-              <w:t>3</w:t>
+              <w:t>2</w:t>
             </w:r>
             <w:r>
               <w:rPr>
@@ -1726,7 +1581,7 @@
               <w14:ligatures w14:val="standardContextual"/>
             </w:rPr>
           </w:pPr>
-          <w:hyperlink w:anchor="_Toc193990931" w:history="1">
+          <w:hyperlink w:anchor="_Toc216371232" w:history="1">
             <w:r>
               <w:rPr>
                 <w:rStyle w:val="Hyperlink"/>
@@ -1771,7 +1626,7 @@
                 <w:noProof/>
                 <w:webHidden/>
               </w:rPr>
-              <w:instrText xml:space="preserve"> PAGEREF _Toc193990931 \h </w:instrText>
+              <w:instrText xml:space="preserve"> PAGEREF _Toc216371232 \h </w:instrText>
             </w:r>
             <w:r>
               <w:rPr>
@@ -1791,7 +1646,7 @@
                 <w:noProof/>
                 <w:webHidden/>
               </w:rPr>
-              <w:t>4</w:t>
+              <w:t>3</w:t>
             </w:r>
             <w:r>
               <w:rPr>
@@ -1817,7 +1672,7 @@
               <w14:ligatures w14:val="standardContextual"/>
             </w:rPr>
           </w:pPr>
-          <w:hyperlink w:anchor="_Toc193990932" w:history="1">
+          <w:hyperlink w:anchor="_Toc216371233" w:history="1">
             <w:r>
               <w:rPr>
                 <w:rStyle w:val="Hyperlink"/>
@@ -1844,7 +1699,7 @@
                 <w:noProof/>
                 <w:webHidden/>
               </w:rPr>
-              <w:instrText xml:space="preserve"> PAGEREF _Toc193990932 \h </w:instrText>
+              <w:instrText xml:space="preserve"> PAGEREF _Toc216371233 \h </w:instrText>
             </w:r>
             <w:r>
               <w:rPr>
@@ -1890,7 +1745,7 @@
               <w14:ligatures w14:val="standardContextual"/>
             </w:rPr>
           </w:pPr>
-          <w:hyperlink w:anchor="_Toc193990933" w:history="1">
+          <w:hyperlink w:anchor="_Toc216371234" w:history="1">
             <w:r>
               <w:rPr>
                 <w:rStyle w:val="Hyperlink"/>
@@ -1917,7 +1772,7 @@
                 <w:noProof/>
                 <w:webHidden/>
               </w:rPr>
-              <w:instrText xml:space="preserve"> PAGEREF _Toc193990933 \h </w:instrText>
+              <w:instrText xml:space="preserve"> PAGEREF _Toc216371234 \h </w:instrText>
             </w:r>
             <w:r>
               <w:rPr>
@@ -1963,7 +1818,7 @@
               <w14:ligatures w14:val="standardContextual"/>
             </w:rPr>
           </w:pPr>
-          <w:hyperlink w:anchor="_Toc193990934" w:history="1">
+          <w:hyperlink w:anchor="_Toc216371235" w:history="1">
             <w:r>
               <w:rPr>
                 <w:rStyle w:val="Hyperlink"/>
@@ -1990,7 +1845,7 @@
                 <w:noProof/>
                 <w:webHidden/>
               </w:rPr>
-              <w:instrText xml:space="preserve"> PAGEREF _Toc193990934 \h </w:instrText>
+              <w:instrText xml:space="preserve"> PAGEREF _Toc216371235 \h </w:instrText>
             </w:r>
             <w:r>
               <w:rPr>
@@ -2399,7 +2254,7 @@
           </w:tcPr>
           <w:p>
             <w:r>
-              <w:t>Artificial Intelligence (AI)</w:t>
+              <w:t>Ludology</w:t>
             </w:r>
           </w:p>
         </w:tc>
@@ -2409,13 +2264,76 @@
           </w:tcPr>
           <w:p>
             <w:r>
-              <w:t>T</w:t>
-            </w:r>
-            <w:r>
-              <w:t>he development of computer systems that can perform tasks that typically require human intelligence, such as learning, problem-solving, and decision-making</w:t>
-            </w:r>
-            <w:r>
-              <w:t>.</w:t>
+              <w:t>The study of play. As related to this project, particularly the study of how narratives are cultivated and experienced in games.</w:t>
+            </w:r>
+          </w:p>
+        </w:tc>
+      </w:tr>
+      <w:tr>
+        <w:tc>
+          <w:tcPr>
+            <w:tcW w:w="2547" w:type="dxa"/>
+          </w:tcPr>
+          <w:p>
+            <w:r>
+              <w:t>Narratology</w:t>
+            </w:r>
+          </w:p>
+        </w:tc>
+        <w:tc>
+          <w:tcPr>
+            <w:tcW w:w="6469" w:type="dxa"/>
+          </w:tcPr>
+          <w:p>
+            <w:r>
+              <w:t>The study of narratives</w:t>
+            </w:r>
+            <w:r>
+              <w:t>, narrative structures, and how people engage with them.</w:t>
+            </w:r>
+          </w:p>
+        </w:tc>
+      </w:tr>
+      <w:tr>
+        <w:tc>
+          <w:tcPr>
+            <w:tcW w:w="2547" w:type="dxa"/>
+          </w:tcPr>
+          <w:p>
+            <w:r>
+              <w:t>Story engine</w:t>
+            </w:r>
+          </w:p>
+        </w:tc>
+        <w:tc>
+          <w:tcPr>
+            <w:tcW w:w="6469" w:type="dxa"/>
+          </w:tcPr>
+          <w:p>
+            <w:r>
+              <w:t>A programme or piece of software that handles all aspects of a story, from displaying text to handling interaction and branching.</w:t>
+            </w:r>
+          </w:p>
+        </w:tc>
+      </w:tr>
+      <w:tr>
+        <w:tc>
+          <w:tcPr>
+            <w:tcW w:w="2547" w:type="dxa"/>
+          </w:tcPr>
+          <w:p>
+            <w:r>
+              <w:t>Narrative engagement</w:t>
+            </w:r>
+          </w:p>
+        </w:tc>
+        <w:tc>
+          <w:tcPr>
+            <w:tcW w:w="6469" w:type="dxa"/>
+          </w:tcPr>
+          <w:p>
+            <w:r>
+              <w:t>The sum of mental processes and emotional sensations that create a sense of immersion with a narrative.</w:t>
             </w:r>
           </w:p>
         </w:tc>
@@ -2462,48 +2380,6 @@
           <w:p/>
         </w:tc>
       </w:tr>
-      <w:tr>
-        <w:tc>
-          <w:tcPr>
-            <w:tcW w:w="2547" w:type="dxa"/>
-          </w:tcPr>
-          <w:p/>
-        </w:tc>
-        <w:tc>
-          <w:tcPr>
-            <w:tcW w:w="6469" w:type="dxa"/>
-          </w:tcPr>
-          <w:p/>
-        </w:tc>
-      </w:tr>
-      <w:tr>
-        <w:tc>
-          <w:tcPr>
-            <w:tcW w:w="2547" w:type="dxa"/>
-          </w:tcPr>
-          <w:p/>
-        </w:tc>
-        <w:tc>
-          <w:tcPr>
-            <w:tcW w:w="6469" w:type="dxa"/>
-          </w:tcPr>
-          <w:p/>
-        </w:tc>
-      </w:tr>
-      <w:tr>
-        <w:tc>
-          <w:tcPr>
-            <w:tcW w:w="2547" w:type="dxa"/>
-          </w:tcPr>
-          <w:p/>
-        </w:tc>
-        <w:tc>
-          <w:tcPr>
-            <w:tcW w:w="6469" w:type="dxa"/>
-          </w:tcPr>
-          <w:p/>
-        </w:tc>
-      </w:tr>
     </w:tbl>
     <w:p>
       <w:pPr>
@@ -2560,7 +2436,7 @@
         </w:numPr>
         <w:ind w:left="567" w:hanging="567"/>
       </w:pPr>
-      <w:bookmarkStart w:id="1" w:name="_Toc193990920"/>
+      <w:bookmarkStart w:id="1" w:name="_Toc216371223"/>
       <w:r>
         <w:lastRenderedPageBreak/>
         <w:t>Project Overview</w:t>
@@ -2625,7 +2501,7 @@
         <w:ind w:left="851" w:hanging="851"/>
       </w:pPr>
       <w:bookmarkStart w:id="2" w:name="_Toc101374242"/>
-      <w:bookmarkStart w:id="3" w:name="_Toc193990921"/>
+      <w:bookmarkStart w:id="3" w:name="_Toc216371224"/>
       <w:r>
         <w:t>Purpose</w:t>
       </w:r>
@@ -2634,11 +2510,6 @@
     </w:p>
     <w:p>
       <w:pPr>
-        <w:pStyle w:val="ListParagraph"/>
-        <w:numPr>
-          <w:ilvl w:val="0"/>
-          <w:numId w:val="23"/>
-        </w:numPr>
         <w:spacing w:after="0" w:line="360" w:lineRule="auto"/>
         <w:jc w:val="both"/>
         <w:rPr>
@@ -2651,7 +2522,14 @@
           <w:sz w:val="24"/>
           <w:szCs w:val="24"/>
         </w:rPr>
-        <w:t>To see if one design provides a better player experience over the other</w:t>
+        <w:t>The purpose of this project is to</w:t>
+      </w:r>
+      <w:r>
+        <w:rPr>
+          <w:sz w:val="24"/>
+          <w:szCs w:val="24"/>
+        </w:rPr>
+        <w:t xml:space="preserve"> see if there is a significant difference in narrative engagement between narratology and ludology focused designs.</w:t>
       </w:r>
     </w:p>
     <w:p>
@@ -2675,7 +2553,7 @@
         </w:numPr>
         <w:ind w:left="851" w:hanging="851"/>
       </w:pPr>
-      <w:bookmarkStart w:id="4" w:name="_Toc193990922"/>
+      <w:bookmarkStart w:id="4" w:name="_Toc216371225"/>
       <w:r>
         <w:t>Objectives</w:t>
       </w:r>
@@ -2683,11 +2561,6 @@
     </w:p>
     <w:p>
       <w:pPr>
-        <w:pStyle w:val="ListParagraph"/>
-        <w:numPr>
-          <w:ilvl w:val="0"/>
-          <w:numId w:val="22"/>
-        </w:numPr>
         <w:spacing w:after="0" w:line="360" w:lineRule="auto"/>
         <w:jc w:val="both"/>
         <w:rPr>
@@ -2695,175 +2568,10 @@
           <w:szCs w:val="24"/>
         </w:rPr>
       </w:pPr>
-      <w:r>
-        <w:rPr>
-          <w:sz w:val="24"/>
-          <w:szCs w:val="24"/>
-        </w:rPr>
-        <w:t>Impliment 2 design methodologies</w:t>
-      </w:r>
-    </w:p>
-    <w:p>
-      <w:pPr>
-        <w:pStyle w:val="ListParagraph"/>
-        <w:numPr>
-          <w:ilvl w:val="0"/>
-          <w:numId w:val="22"/>
-        </w:numPr>
+    </w:p>
+    <w:p>
+      <w:pPr>
         <w:spacing w:after="0" w:line="360" w:lineRule="auto"/>
-        <w:jc w:val="both"/>
-        <w:rPr>
-          <w:sz w:val="24"/>
-          <w:szCs w:val="24"/>
-        </w:rPr>
-      </w:pPr>
-      <w:r>
-        <w:rPr>
-          <w:sz w:val="24"/>
-          <w:szCs w:val="24"/>
-        </w:rPr>
-        <w:t>Measure any differences with player engagement through a qualitative survey</w:t>
-      </w:r>
-    </w:p>
-    <w:p>
-      <w:pPr>
-        <w:pStyle w:val="Heading3"/>
-        <w:numPr>
-          <w:ilvl w:val="2"/>
-          <w:numId w:val="4"/>
-        </w:numPr>
-        <w:ind w:left="1134" w:hanging="1134"/>
-      </w:pPr>
-      <w:bookmarkStart w:id="5" w:name="_Toc101374244"/>
-      <w:bookmarkStart w:id="6" w:name="_Toc193990923"/>
-      <w:r>
-        <w:t>One liner</w:t>
-      </w:r>
-      <w:bookmarkEnd w:id="5"/>
-      <w:bookmarkEnd w:id="6"/>
-    </w:p>
-    <w:p>
-      <w:pPr>
-        <w:spacing w:after="0" w:line="360" w:lineRule="auto"/>
-        <w:jc w:val="both"/>
-        <w:rPr>
-          <w:sz w:val="24"/>
-          <w:szCs w:val="24"/>
-        </w:rPr>
-      </w:pPr>
-      <w:r>
-        <w:rPr>
-          <w:sz w:val="24"/>
-          <w:szCs w:val="24"/>
-        </w:rPr>
-        <w:t xml:space="preserve">Where one line of text is </w:t>
-      </w:r>
-      <w:proofErr w:type="gramStart"/>
-      <w:r>
-        <w:rPr>
-          <w:sz w:val="24"/>
-          <w:szCs w:val="24"/>
-        </w:rPr>
-        <w:t>required</w:t>
-      </w:r>
-      <w:proofErr w:type="gramEnd"/>
-      <w:r>
-        <w:rPr>
-          <w:sz w:val="24"/>
-          <w:szCs w:val="24"/>
-        </w:rPr>
-        <w:t xml:space="preserve"> a bulleted list should replace the heading. This is done to aid the legibility of the final document.</w:t>
-      </w:r>
-    </w:p>
-    <w:p>
-      <w:pPr>
-        <w:spacing w:after="0" w:line="360" w:lineRule="auto"/>
-        <w:jc w:val="both"/>
-        <w:rPr>
-          <w:sz w:val="24"/>
-          <w:szCs w:val="24"/>
-        </w:rPr>
-      </w:pPr>
-    </w:p>
-    <w:p>
-      <w:pPr>
-        <w:pStyle w:val="Heading3"/>
-        <w:numPr>
-          <w:ilvl w:val="2"/>
-          <w:numId w:val="4"/>
-        </w:numPr>
-        <w:ind w:left="1134" w:hanging="1134"/>
-      </w:pPr>
-      <w:bookmarkStart w:id="7" w:name="_Toc101374245"/>
-      <w:bookmarkStart w:id="8" w:name="_Toc193990924"/>
-      <w:r>
-        <w:t>Sub-Item</w:t>
-      </w:r>
-      <w:bookmarkEnd w:id="7"/>
-      <w:bookmarkEnd w:id="8"/>
-    </w:p>
-    <w:p>
-      <w:pPr>
-        <w:spacing w:after="0" w:line="360" w:lineRule="auto"/>
-        <w:jc w:val="both"/>
-        <w:rPr>
-          <w:sz w:val="24"/>
-          <w:szCs w:val="24"/>
-        </w:rPr>
-      </w:pPr>
-      <w:r>
-        <w:rPr>
-          <w:sz w:val="24"/>
-          <w:szCs w:val="24"/>
-        </w:rPr>
-        <w:t>If only one sub-item is required neither a bulleted nor numbered list is required.</w:t>
-      </w:r>
-    </w:p>
-    <w:p>
-      <w:pPr>
-        <w:spacing w:after="0" w:line="360" w:lineRule="auto"/>
-        <w:jc w:val="both"/>
-        <w:rPr>
-          <w:sz w:val="24"/>
-          <w:szCs w:val="24"/>
-        </w:rPr>
-      </w:pPr>
-    </w:p>
-    <w:p>
-      <w:pPr>
-        <w:pStyle w:val="Heading4"/>
-      </w:pPr>
-      <w:r>
-        <w:t xml:space="preserve">1.2.2.1 Fourth </w:t>
-      </w:r>
-      <w:proofErr w:type="gramStart"/>
-      <w:r>
-        <w:t>sub heading</w:t>
-      </w:r>
-      <w:proofErr w:type="gramEnd"/>
-    </w:p>
-    <w:p>
-      <w:pPr>
-        <w:spacing w:after="0" w:line="360" w:lineRule="auto"/>
-        <w:jc w:val="both"/>
-        <w:rPr>
-          <w:sz w:val="24"/>
-          <w:szCs w:val="24"/>
-        </w:rPr>
-      </w:pPr>
-      <w:r>
-        <w:rPr>
-          <w:sz w:val="24"/>
-          <w:szCs w:val="24"/>
-        </w:rPr>
-        <w:t>Continue with text as required.</w:t>
-      </w:r>
-    </w:p>
-    <w:p>
-      <w:pPr>
-        <w:pStyle w:val="ListParagraph"/>
-        <w:spacing w:after="0" w:line="360" w:lineRule="auto"/>
-        <w:ind w:left="1134"/>
         <w:jc w:val="both"/>
         <w:rPr>
           <w:sz w:val="24"/>
@@ -2880,19 +2588,14 @@
         </w:numPr>
         <w:ind w:left="851" w:hanging="851"/>
       </w:pPr>
-      <w:bookmarkStart w:id="9" w:name="_Toc193990925"/>
+      <w:bookmarkStart w:id="5" w:name="_Toc216371226"/>
       <w:r>
         <w:t>Project Scope</w:t>
       </w:r>
-      <w:bookmarkEnd w:id="9"/>
-    </w:p>
-    <w:p>
-      <w:pPr>
-        <w:pStyle w:val="ListParagraph"/>
-        <w:numPr>
-          <w:ilvl w:val="0"/>
-          <w:numId w:val="22"/>
-        </w:numPr>
+      <w:bookmarkEnd w:id="5"/>
+    </w:p>
+    <w:p>
+      <w:pPr>
         <w:spacing w:after="0" w:line="360" w:lineRule="auto"/>
         <w:jc w:val="both"/>
         <w:rPr>
@@ -2905,7 +2608,7 @@
           <w:sz w:val="24"/>
           <w:szCs w:val="24"/>
         </w:rPr>
-        <w:t>Restricted to 2 separate designs, more academic sources, time constraints</w:t>
+        <w:t>This project is limited to 1 implementation of each methodology for testing purposes. Each implementation is also designed to be played through in 45 minutes or less to account for limited time with testing participants. This project will also focus on the fundamental concepts in ludology and narratology.</w:t>
       </w:r>
     </w:p>
     <w:p>
@@ -2917,11 +2620,11 @@
         </w:numPr>
         <w:ind w:left="851" w:hanging="851"/>
       </w:pPr>
-      <w:bookmarkStart w:id="10" w:name="_Toc193990926"/>
+      <w:bookmarkStart w:id="6" w:name="_Toc216371227"/>
       <w:r>
         <w:t>Definitions and Acronyms</w:t>
       </w:r>
-      <w:bookmarkEnd w:id="10"/>
+      <w:bookmarkEnd w:id="6"/>
     </w:p>
     <w:p>
       <w:pPr>
@@ -2967,288 +2670,6 @@
         </w:rPr>
         <w:t xml:space="preserve"> logo can be seen with an appropriate caption.</w:t>
       </w:r>
-    </w:p>
-    <w:p>
-      <w:pPr>
-        <w:pStyle w:val="ListParagraph"/>
-        <w:spacing w:after="0" w:line="360" w:lineRule="auto"/>
-        <w:ind w:left="1134"/>
-        <w:jc w:val="both"/>
-        <w:rPr>
-          <w:sz w:val="24"/>
-          <w:szCs w:val="24"/>
-        </w:rPr>
-      </w:pPr>
-    </w:p>
-    <w:p>
-      <w:pPr>
-        <w:pStyle w:val="ListParagraph"/>
-        <w:spacing w:after="0" w:line="360" w:lineRule="auto"/>
-        <w:ind w:left="0"/>
-        <w:jc w:val="center"/>
-        <w:rPr>
-          <w:sz w:val="24"/>
-          <w:szCs w:val="24"/>
-        </w:rPr>
-      </w:pPr>
-      <w:r>
-        <w:rPr>
-          <w:noProof/>
-          <w:sz w:val="24"/>
-          <w:szCs w:val="24"/>
-          <w:lang w:eastAsia="en-IE"/>
-        </w:rPr>
-        <w:lastRenderedPageBreak/>
-        <w:drawing>
-          <wp:inline distT="0" distB="0" distL="0" distR="0" wp14:anchorId="3D001103" wp14:editId="469970B6">
-            <wp:extent cx="3154750" cy="1158334"/>
-            <wp:effectExtent l="0" t="0" r="7620" b="3810"/>
-            <wp:docPr id="4" name="Picture 4"/>
-            <wp:cNvGraphicFramePr>
-              <a:graphicFrameLocks xmlns:a="http://schemas.openxmlformats.org/drawingml/2006/main" noChangeAspect="1"/>
-            </wp:cNvGraphicFramePr>
-            <a:graphic xmlns:a="http://schemas.openxmlformats.org/drawingml/2006/main">
-              <a:graphicData uri="http://schemas.openxmlformats.org/drawingml/2006/picture">
-                <pic:pic xmlns:pic="http://schemas.openxmlformats.org/drawingml/2006/picture">
-                  <pic:nvPicPr>
-                    <pic:cNvPr id="4" name="ATU-LOGO-DONEGAL.png"/>
-                    <pic:cNvPicPr/>
-                  </pic:nvPicPr>
-                  <pic:blipFill>
-                    <a:blip r:embed="rId10">
-                      <a:extLst>
-                        <a:ext uri="{28A0092B-C50C-407E-A947-70E740481C1C}">
-                          <a14:useLocalDpi xmlns:a14="http://schemas.microsoft.com/office/drawing/2010/main" val="0"/>
-                        </a:ext>
-                      </a:extLst>
-                    </a:blip>
-                    <a:stretch>
-                      <a:fillRect/>
-                    </a:stretch>
-                  </pic:blipFill>
-                  <pic:spPr>
-                    <a:xfrm>
-                      <a:off x="0" y="0"/>
-                      <a:ext cx="3177643" cy="1166740"/>
-                    </a:xfrm>
-                    <a:prstGeom prst="rect">
-                      <a:avLst/>
-                    </a:prstGeom>
-                  </pic:spPr>
-                </pic:pic>
-              </a:graphicData>
-            </a:graphic>
-          </wp:inline>
-        </w:drawing>
-      </w:r>
-    </w:p>
-    <w:p>
-      <w:pPr>
-        <w:pStyle w:val="Caption"/>
-      </w:pPr>
-      <w:bookmarkStart w:id="11" w:name="_Toc193456586"/>
-      <w:bookmarkStart w:id="12" w:name="_Toc193456844"/>
-      <w:r>
-        <w:t xml:space="preserve">Figure </w:t>
-      </w:r>
-      <w:r>
-        <w:fldChar w:fldCharType="begin"/>
-      </w:r>
-      <w:r>
-        <w:instrText xml:space="preserve"> SEQ Figure \* ARABIC </w:instrText>
-      </w:r>
-      <w:r>
-        <w:fldChar w:fldCharType="separate"/>
-      </w:r>
-      <w:r>
-        <w:t>1</w:t>
-      </w:r>
-      <w:r>
-        <w:fldChar w:fldCharType="end"/>
-      </w:r>
-      <w:r>
-        <w:t xml:space="preserve"> </w:t>
-      </w:r>
-      <w:r>
-        <w:t>Atlantic Technological University Donegal Logo</w:t>
-      </w:r>
-      <w:bookmarkEnd w:id="11"/>
-      <w:bookmarkEnd w:id="12"/>
-    </w:p>
-    <w:p>
-      <w:pPr>
-        <w:spacing w:after="0" w:line="360" w:lineRule="auto"/>
-        <w:jc w:val="both"/>
-        <w:rPr>
-          <w:sz w:val="24"/>
-          <w:szCs w:val="24"/>
-        </w:rPr>
-      </w:pPr>
-    </w:p>
-    <w:p>
-      <w:pPr>
-        <w:spacing w:after="0" w:line="360" w:lineRule="auto"/>
-        <w:jc w:val="both"/>
-        <w:rPr>
-          <w:sz w:val="24"/>
-          <w:szCs w:val="24"/>
-        </w:rPr>
-      </w:pPr>
-      <w:proofErr w:type="gramStart"/>
-      <w:r>
-        <w:rPr>
-          <w:sz w:val="24"/>
-          <w:szCs w:val="24"/>
-        </w:rPr>
-        <w:t>In order to</w:t>
-      </w:r>
-      <w:proofErr w:type="gramEnd"/>
-      <w:r>
-        <w:rPr>
-          <w:sz w:val="24"/>
-          <w:szCs w:val="24"/>
-        </w:rPr>
-        <w:t xml:space="preserve"> provide a caption for an image, table or equation the item should be selected. The Microsoft References ribbon should be selected. From there the Insert Caption button should be selected. The label should be set to the most appropriate one. In this example the Figure label was selected. New labels can be created as necessary. Remember not to simply copy and paste from above. Instead insert the image into the file and select it. Add the caption as described.</w:t>
-      </w:r>
-    </w:p>
-    <w:p>
-      <w:pPr>
-        <w:spacing w:after="0" w:line="360" w:lineRule="auto"/>
-        <w:jc w:val="both"/>
-        <w:rPr>
-          <w:sz w:val="24"/>
-          <w:szCs w:val="24"/>
-        </w:rPr>
-      </w:pPr>
-      <w:r>
-        <w:rPr>
-          <w:sz w:val="24"/>
-          <w:szCs w:val="24"/>
-        </w:rPr>
-        <w:t>Where an image does not have a clearly defined border, one should be added. Care should be taken to ensure that all details of images are clearly visible both when in print and when in electronic format. Careful selection of colours should be considered for this purpose. Images as shown in Figure 2 should always be referred to from the main text.</w:t>
-      </w:r>
-    </w:p>
-    <w:p>
-      <w:pPr>
-        <w:spacing w:after="0" w:line="360" w:lineRule="auto"/>
-        <w:jc w:val="both"/>
-        <w:rPr>
-          <w:sz w:val="24"/>
-          <w:szCs w:val="24"/>
-        </w:rPr>
-      </w:pPr>
-    </w:p>
-    <w:p>
-      <w:pPr>
-        <w:spacing w:after="0" w:line="360" w:lineRule="auto"/>
-        <w:jc w:val="center"/>
-        <w:rPr>
-          <w:sz w:val="24"/>
-          <w:szCs w:val="24"/>
-        </w:rPr>
-      </w:pPr>
-      <w:r>
-        <w:rPr>
-          <w:noProof/>
-          <w:bdr w:val="single" w:sz="4" w:space="0" w:color="auto"/>
-          <w:lang w:eastAsia="en-IE"/>
-        </w:rPr>
-        <w:drawing>
-          <wp:inline distT="0" distB="0" distL="0" distR="0" wp14:anchorId="0785E10B" wp14:editId="36171E31">
-            <wp:extent cx="2859405" cy="1146810"/>
-            <wp:effectExtent l="0" t="0" r="0" b="0"/>
-            <wp:docPr id="1" name="Picture 1" descr="https://upload.wikimedia.org/wikipedia/commons/thumb/e/e4/LYIT.jpg/300px-LYIT.jpg"/>
-            <wp:cNvGraphicFramePr>
-              <a:graphicFrameLocks xmlns:a="http://schemas.openxmlformats.org/drawingml/2006/main" noChangeAspect="1"/>
-            </wp:cNvGraphicFramePr>
-            <a:graphic xmlns:a="http://schemas.openxmlformats.org/drawingml/2006/main">
-              <a:graphicData uri="http://schemas.openxmlformats.org/drawingml/2006/picture">
-                <pic:pic xmlns:pic="http://schemas.openxmlformats.org/drawingml/2006/picture">
-                  <pic:nvPicPr>
-                    <pic:cNvPr id="0" name="Picture 1" descr="https://upload.wikimedia.org/wikipedia/commons/thumb/e/e4/LYIT.jpg/300px-LYIT.jpg"/>
-                    <pic:cNvPicPr>
-                      <a:picLocks noChangeAspect="1" noChangeArrowheads="1"/>
-                    </pic:cNvPicPr>
-                  </pic:nvPicPr>
-                  <pic:blipFill>
-                    <a:blip r:embed="rId11">
-                      <a:extLst>
-                        <a:ext uri="{28A0092B-C50C-407E-A947-70E740481C1C}">
-                          <a14:useLocalDpi xmlns:a14="http://schemas.microsoft.com/office/drawing/2010/main" val="0"/>
-                        </a:ext>
-                      </a:extLst>
-                    </a:blip>
-                    <a:srcRect/>
-                    <a:stretch>
-                      <a:fillRect/>
-                    </a:stretch>
-                  </pic:blipFill>
-                  <pic:spPr bwMode="auto">
-                    <a:xfrm>
-                      <a:off x="0" y="0"/>
-                      <a:ext cx="2859405" cy="1146810"/>
-                    </a:xfrm>
-                    <a:prstGeom prst="rect">
-                      <a:avLst/>
-                    </a:prstGeom>
-                    <a:noFill/>
-                    <a:ln>
-                      <a:noFill/>
-                    </a:ln>
-                  </pic:spPr>
-                </pic:pic>
-              </a:graphicData>
-            </a:graphic>
-          </wp:inline>
-        </w:drawing>
-      </w:r>
-    </w:p>
-    <w:p>
-      <w:pPr>
-        <w:pStyle w:val="Caption"/>
-      </w:pPr>
-    </w:p>
-    <w:p>
-      <w:pPr>
-        <w:pStyle w:val="Caption"/>
-      </w:pPr>
-      <w:bookmarkStart w:id="13" w:name="_Toc193456587"/>
-      <w:bookmarkStart w:id="14" w:name="_Toc193456845"/>
-      <w:r>
-        <w:t xml:space="preserve">Figure </w:t>
-      </w:r>
-      <w:r>
-        <w:fldChar w:fldCharType="begin"/>
-      </w:r>
-      <w:r>
-        <w:instrText xml:space="preserve"> SEQ Figure \* ARABIC </w:instrText>
-      </w:r>
-      <w:r>
-        <w:fldChar w:fldCharType="separate"/>
-      </w:r>
-      <w:r>
-        <w:t>2</w:t>
-      </w:r>
-      <w:r>
-        <w:fldChar w:fldCharType="end"/>
-      </w:r>
-      <w:r>
-        <w:t xml:space="preserve"> </w:t>
-      </w:r>
-      <w:r>
-        <w:t>ATU Donegal, Letterkenny</w:t>
-      </w:r>
-      <w:bookmarkEnd w:id="13"/>
-      <w:bookmarkEnd w:id="14"/>
-    </w:p>
-    <w:p>
-      <w:pPr>
-        <w:spacing w:after="0" w:line="360" w:lineRule="auto"/>
-        <w:rPr>
-          <w:sz w:val="24"/>
-          <w:szCs w:val="24"/>
-        </w:rPr>
-      </w:pPr>
     </w:p>
     <w:p>
       <w:pPr>
@@ -3261,6 +2682,7 @@
           <w:szCs w:val="28"/>
         </w:rPr>
       </w:pPr>
+      <w:bookmarkStart w:id="7" w:name="_Toc216371228"/>
       <w:r>
         <w:br w:type="page"/>
       </w:r>
@@ -3274,35 +2696,42 @@
         </w:numPr>
         <w:ind w:left="567" w:hanging="567"/>
       </w:pPr>
-      <w:bookmarkStart w:id="15" w:name="_Toc193990927"/>
       <w:r>
         <w:lastRenderedPageBreak/>
         <w:t>Requirements</w:t>
       </w:r>
-      <w:bookmarkEnd w:id="15"/>
-    </w:p>
-    <w:p>
-      <w:pPr>
+      <w:bookmarkEnd w:id="7"/>
+    </w:p>
+    <w:p>
+      <w:pPr>
+        <w:pStyle w:val="ListParagraph"/>
         <w:spacing w:after="0" w:line="360" w:lineRule="auto"/>
+        <w:ind w:left="1134"/>
         <w:jc w:val="both"/>
         <w:rPr>
           <w:sz w:val="24"/>
           <w:szCs w:val="24"/>
         </w:rPr>
       </w:pPr>
-      <w:r>
-        <w:rPr>
-          <w:sz w:val="24"/>
-          <w:szCs w:val="24"/>
-        </w:rPr>
-        <w:t>The chapters should all begin on a new page. Page numbers appear at the bottom right of each page. Page numbers appear from Chapter 1 and onwards. Appendices should be paginated using roman numerals (I, II, etc.).</w:t>
-      </w:r>
-    </w:p>
-    <w:p>
-      <w:pPr>
-        <w:pStyle w:val="ListParagraph"/>
+    </w:p>
+    <w:p>
+      <w:pPr>
+        <w:pStyle w:val="Heading2"/>
+        <w:numPr>
+          <w:ilvl w:val="1"/>
+          <w:numId w:val="3"/>
+        </w:numPr>
+        <w:ind w:left="851" w:hanging="851"/>
+      </w:pPr>
+      <w:bookmarkStart w:id="8" w:name="_Toc216371229"/>
+      <w:r>
+        <w:t>Functional Requirements</w:t>
+      </w:r>
+      <w:bookmarkEnd w:id="8"/>
+    </w:p>
+    <w:p>
+      <w:pPr>
         <w:spacing w:after="0" w:line="360" w:lineRule="auto"/>
-        <w:ind w:left="851"/>
         <w:jc w:val="both"/>
         <w:rPr>
           <w:sz w:val="24"/>
@@ -3330,21 +2759,7 @@
           <w:sz w:val="24"/>
           <w:szCs w:val="24"/>
         </w:rPr>
-        <w:t>Bullets</w:t>
-      </w:r>
-      <w:r>
-        <w:rPr>
-          <w:sz w:val="24"/>
-          <w:szCs w:val="24"/>
-        </w:rPr>
-        <w:t xml:space="preserve"> should be aligned with the text</w:t>
-      </w:r>
-      <w:r>
-        <w:rPr>
-          <w:sz w:val="24"/>
-          <w:szCs w:val="24"/>
-        </w:rPr>
-        <w:t>.</w:t>
+        <w:t>Level selection menu</w:t>
       </w:r>
     </w:p>
     <w:p>
@@ -3367,7 +2782,7 @@
           <w:sz w:val="24"/>
           <w:szCs w:val="24"/>
         </w:rPr>
-        <w:t>Bulleted items should have one blank line above and below.</w:t>
+        <w:t>2 playable levels</w:t>
       </w:r>
     </w:p>
     <w:p>
@@ -3390,19 +2805,255 @@
           <w:sz w:val="24"/>
           <w:szCs w:val="24"/>
         </w:rPr>
-        <w:t>If there are only 1 or 2 items a bulleted list is not required.</w:t>
-      </w:r>
-    </w:p>
-    <w:p>
-      <w:pPr>
-        <w:spacing w:after="0" w:line="360" w:lineRule="auto"/>
-        <w:ind w:left="720"/>
-        <w:jc w:val="both"/>
+        <w:t xml:space="preserve">Dialogue </w:t>
+      </w:r>
+      <w:r>
         <w:rPr>
           <w:sz w:val="24"/>
           <w:szCs w:val="24"/>
         </w:rPr>
-      </w:pPr>
+        <w:t>trees</w:t>
+      </w:r>
+    </w:p>
+    <w:p>
+      <w:pPr>
+        <w:pStyle w:val="ListParagraph"/>
+        <w:numPr>
+          <w:ilvl w:val="0"/>
+          <w:numId w:val="2"/>
+        </w:numPr>
+        <w:spacing w:after="0" w:line="360" w:lineRule="auto"/>
+        <w:ind w:left="567" w:hanging="567"/>
+        <w:jc w:val="both"/>
+        <w:rPr>
+          <w:sz w:val="24"/>
+          <w:szCs w:val="24"/>
+        </w:rPr>
+      </w:pPr>
+      <w:r>
+        <w:rPr>
+          <w:sz w:val="24"/>
+          <w:szCs w:val="24"/>
+        </w:rPr>
+        <w:t>Static camera</w:t>
+      </w:r>
+    </w:p>
+    <w:p>
+      <w:pPr>
+        <w:pStyle w:val="ListParagraph"/>
+        <w:numPr>
+          <w:ilvl w:val="0"/>
+          <w:numId w:val="2"/>
+        </w:numPr>
+        <w:spacing w:after="0" w:line="360" w:lineRule="auto"/>
+        <w:ind w:left="567" w:hanging="567"/>
+        <w:jc w:val="both"/>
+        <w:rPr>
+          <w:sz w:val="24"/>
+          <w:szCs w:val="24"/>
+        </w:rPr>
+      </w:pPr>
+      <w:r>
+        <w:rPr>
+          <w:sz w:val="24"/>
+          <w:szCs w:val="24"/>
+        </w:rPr>
+        <w:t>Player movement</w:t>
+      </w:r>
+    </w:p>
+    <w:p>
+      <w:pPr>
+        <w:pStyle w:val="ListParagraph"/>
+        <w:numPr>
+          <w:ilvl w:val="0"/>
+          <w:numId w:val="2"/>
+        </w:numPr>
+        <w:spacing w:after="0" w:line="360" w:lineRule="auto"/>
+        <w:ind w:left="567" w:hanging="567"/>
+        <w:jc w:val="both"/>
+        <w:rPr>
+          <w:sz w:val="24"/>
+          <w:szCs w:val="24"/>
+        </w:rPr>
+      </w:pPr>
+      <w:r>
+        <w:rPr>
+          <w:sz w:val="24"/>
+          <w:szCs w:val="24"/>
+        </w:rPr>
+        <w:t>Triggers to switch between cameras</w:t>
+      </w:r>
+    </w:p>
+    <w:p>
+      <w:pPr>
+        <w:pStyle w:val="Heading2"/>
+        <w:numPr>
+          <w:ilvl w:val="1"/>
+          <w:numId w:val="3"/>
+        </w:numPr>
+        <w:ind w:hanging="792"/>
+      </w:pPr>
+      <w:bookmarkStart w:id="9" w:name="_Toc216371230"/>
+      <w:r>
+        <w:t>Non-Functional Requirements</w:t>
+      </w:r>
+      <w:bookmarkEnd w:id="9"/>
+    </w:p>
+    <w:p>
+      <w:pPr>
+        <w:pStyle w:val="ListParagraph"/>
+        <w:spacing w:after="0" w:line="360" w:lineRule="auto"/>
+        <w:ind w:left="851"/>
+        <w:jc w:val="both"/>
+        <w:rPr>
+          <w:sz w:val="24"/>
+          <w:szCs w:val="24"/>
+        </w:rPr>
+      </w:pPr>
+    </w:p>
+    <w:p>
+      <w:pPr>
+        <w:pStyle w:val="ListParagraph"/>
+        <w:numPr>
+          <w:ilvl w:val="0"/>
+          <w:numId w:val="2"/>
+        </w:numPr>
+        <w:spacing w:after="0" w:line="360" w:lineRule="auto"/>
+        <w:ind w:left="567" w:hanging="567"/>
+        <w:jc w:val="both"/>
+        <w:rPr>
+          <w:sz w:val="24"/>
+          <w:szCs w:val="24"/>
+        </w:rPr>
+      </w:pPr>
+      <w:r>
+        <w:rPr>
+          <w:sz w:val="24"/>
+          <w:szCs w:val="24"/>
+        </w:rPr>
+        <w:t>Stable framerate</w:t>
+      </w:r>
+    </w:p>
+    <w:p>
+      <w:pPr>
+        <w:pStyle w:val="ListParagraph"/>
+        <w:numPr>
+          <w:ilvl w:val="0"/>
+          <w:numId w:val="2"/>
+        </w:numPr>
+        <w:spacing w:after="0" w:line="360" w:lineRule="auto"/>
+        <w:ind w:left="567" w:hanging="567"/>
+        <w:jc w:val="both"/>
+        <w:rPr>
+          <w:sz w:val="24"/>
+          <w:szCs w:val="24"/>
+        </w:rPr>
+      </w:pPr>
+      <w:r>
+        <w:rPr>
+          <w:sz w:val="24"/>
+          <w:szCs w:val="24"/>
+        </w:rPr>
+        <w:t>Intuitive inputs</w:t>
+      </w:r>
+    </w:p>
+    <w:p>
+      <w:pPr>
+        <w:pStyle w:val="ListParagraph"/>
+        <w:numPr>
+          <w:ilvl w:val="0"/>
+          <w:numId w:val="2"/>
+        </w:numPr>
+        <w:spacing w:after="0" w:line="360" w:lineRule="auto"/>
+        <w:ind w:left="567" w:hanging="567"/>
+        <w:jc w:val="both"/>
+        <w:rPr>
+          <w:sz w:val="24"/>
+          <w:szCs w:val="24"/>
+        </w:rPr>
+      </w:pPr>
+      <w:r>
+        <w:rPr>
+          <w:sz w:val="24"/>
+          <w:szCs w:val="24"/>
+        </w:rPr>
+        <w:t>Short gameplay length</w:t>
+      </w:r>
+    </w:p>
+    <w:p>
+      <w:pPr>
+        <w:pStyle w:val="ListParagraph"/>
+        <w:numPr>
+          <w:ilvl w:val="0"/>
+          <w:numId w:val="2"/>
+        </w:numPr>
+        <w:spacing w:after="0" w:line="360" w:lineRule="auto"/>
+        <w:ind w:left="567" w:hanging="567"/>
+        <w:jc w:val="both"/>
+        <w:rPr>
+          <w:sz w:val="24"/>
+          <w:szCs w:val="24"/>
+        </w:rPr>
+      </w:pPr>
+      <w:r>
+        <w:rPr>
+          <w:sz w:val="24"/>
+          <w:szCs w:val="24"/>
+        </w:rPr>
+        <w:t>Able to be completed</w:t>
+      </w:r>
+    </w:p>
+    <w:p>
+      <w:pPr>
+        <w:pStyle w:val="ListParagraph"/>
+        <w:numPr>
+          <w:ilvl w:val="0"/>
+          <w:numId w:val="2"/>
+        </w:numPr>
+        <w:spacing w:after="0" w:line="360" w:lineRule="auto"/>
+        <w:ind w:left="567" w:hanging="567"/>
+        <w:jc w:val="both"/>
+        <w:rPr>
+          <w:sz w:val="24"/>
+          <w:szCs w:val="24"/>
+        </w:rPr>
+      </w:pPr>
+      <w:r>
+        <w:rPr>
+          <w:sz w:val="24"/>
+          <w:szCs w:val="24"/>
+        </w:rPr>
+        <w:t>Mechanics should be simple and easy to learn</w:t>
+      </w:r>
+    </w:p>
+    <w:p>
+      <w:pPr>
+        <w:spacing w:after="160" w:line="259" w:lineRule="auto"/>
+        <w:rPr>
+          <w:sz w:val="24"/>
+          <w:szCs w:val="24"/>
+        </w:rPr>
+      </w:pPr>
+      <w:r>
+        <w:rPr>
+          <w:sz w:val="24"/>
+          <w:szCs w:val="24"/>
+        </w:rPr>
+        <w:br w:type="page"/>
+      </w:r>
+    </w:p>
+    <w:p>
+      <w:pPr>
+        <w:pStyle w:val="Heading2"/>
+        <w:numPr>
+          <w:ilvl w:val="0"/>
+          <w:numId w:val="3"/>
+        </w:numPr>
+      </w:pPr>
+      <w:r>
+        <w:lastRenderedPageBreak/>
+        <w:t>System architecture and design</w:t>
+      </w:r>
     </w:p>
     <w:p>
       <w:pPr>
@@ -3418,20 +3069,15 @@
           <w:sz w:val="24"/>
           <w:szCs w:val="24"/>
         </w:rPr>
-        <w:t>Any paragraph after the list, image or table should resume its normal position for the given header. When using any acronym such as Some Silly Acronym (SSA) it must be expanded on its first occurrence within the text. All acronyms should appear in an acronyms list preceding the main chapters.</w:t>
-      </w:r>
-    </w:p>
-    <w:p>
-      <w:pPr>
-        <w:pStyle w:val="ListParagraph"/>
-        <w:spacing w:after="0" w:line="360" w:lineRule="auto"/>
-        <w:ind w:left="1134"/>
-        <w:jc w:val="both"/>
+        <w:t>While this project is mainly focused on the design of the game world and narrative, there are still some important considerations for the technical aspects of the project.</w:t>
+      </w:r>
+      <w:r>
         <w:rPr>
           <w:sz w:val="24"/>
           <w:szCs w:val="24"/>
         </w:rPr>
-      </w:pPr>
+        <w:t xml:space="preserve"> </w:t>
+      </w:r>
     </w:p>
     <w:p>
       <w:pPr>
@@ -3442,11 +3088,9 @@
         </w:numPr>
         <w:ind w:left="851" w:hanging="851"/>
       </w:pPr>
-      <w:bookmarkStart w:id="16" w:name="_Toc193990928"/>
-      <w:r>
-        <w:t>Functional Requirements</w:t>
-      </w:r>
-      <w:bookmarkEnd w:id="16"/>
+      <w:r>
+        <w:t>Software requirements</w:t>
+      </w:r>
     </w:p>
     <w:p>
       <w:pPr>
@@ -3462,7 +3106,14 @@
           <w:sz w:val="24"/>
           <w:szCs w:val="24"/>
         </w:rPr>
-        <w:t>…</w:t>
+        <w:t>The software requirements are Unreal Engine</w:t>
+      </w:r>
+      <w:r>
+        <w:rPr>
+          <w:sz w:val="24"/>
+          <w:szCs w:val="24"/>
+        </w:rPr>
+        <w:t xml:space="preserve"> 5.6.1.</w:t>
       </w:r>
     </w:p>
     <w:p>
@@ -3474,48 +3125,20 @@
           <w:szCs w:val="24"/>
         </w:rPr>
       </w:pPr>
-    </w:p>
-    <w:p>
-      <w:pPr>
-        <w:pStyle w:val="Heading2"/>
-        <w:numPr>
-          <w:ilvl w:val="1"/>
-          <w:numId w:val="3"/>
-        </w:numPr>
-        <w:ind w:hanging="792"/>
-      </w:pPr>
-      <w:bookmarkStart w:id="17" w:name="_Toc193990929"/>
-      <w:r>
-        <w:t>Non-Functional Requirements</w:t>
-      </w:r>
-      <w:bookmarkEnd w:id="17"/>
-    </w:p>
-    <w:p>
-      <w:pPr>
-        <w:spacing w:after="0" w:line="360" w:lineRule="auto"/>
-        <w:jc w:val="both"/>
+      <w:r>
         <w:rPr>
           <w:sz w:val="24"/>
           <w:szCs w:val="24"/>
         </w:rPr>
-      </w:pPr>
+        <w:t>This project will also be using Narrative Toolkit, a work in progress plugin from Heathen Engineering, to speed up development of narrative features. However, this could also be done manually with features already built into Unreal Engine.</w:t>
+      </w:r>
       <w:r>
         <w:rPr>
           <w:sz w:val="24"/>
           <w:szCs w:val="24"/>
         </w:rPr>
-        <w:t>…</w:t>
-      </w:r>
-    </w:p>
-    <w:p>
-      <w:pPr>
-        <w:spacing w:after="0" w:line="360" w:lineRule="auto"/>
-        <w:jc w:val="both"/>
-        <w:rPr>
-          <w:sz w:val="24"/>
-          <w:szCs w:val="24"/>
-        </w:rPr>
-      </w:pPr>
+        <w:t xml:space="preserve"> Functionality will be created entirely through blueprints.</w:t>
+      </w:r>
     </w:p>
     <w:p>
       <w:pPr>
@@ -3526,594 +3149,14 @@
         </w:numPr>
         <w:ind w:left="851" w:hanging="851"/>
       </w:pPr>
-      <w:bookmarkStart w:id="18" w:name="_Toc193990930"/>
-      <w:r>
-        <w:t>Table Section</w:t>
-      </w:r>
-      <w:bookmarkEnd w:id="18"/>
-    </w:p>
-    <w:p>
-      <w:pPr>
-        <w:spacing w:after="0" w:line="360" w:lineRule="auto"/>
-        <w:jc w:val="both"/>
-        <w:rPr>
-          <w:sz w:val="24"/>
-          <w:szCs w:val="24"/>
-        </w:rPr>
-      </w:pPr>
-      <w:r>
-        <w:rPr>
-          <w:sz w:val="24"/>
-          <w:szCs w:val="24"/>
-        </w:rPr>
-        <w:t xml:space="preserve">The text of any chapter may include tabular data. </w:t>
-      </w:r>
-      <w:proofErr w:type="gramStart"/>
-      <w:r>
-        <w:rPr>
-          <w:sz w:val="24"/>
-          <w:szCs w:val="24"/>
-        </w:rPr>
-        <w:t>In order to</w:t>
-      </w:r>
-      <w:proofErr w:type="gramEnd"/>
-      <w:r>
-        <w:rPr>
-          <w:sz w:val="24"/>
-          <w:szCs w:val="24"/>
-        </w:rPr>
-        <w:t xml:space="preserve"> aid legibility some simple guidelines should be adhered to. Refer to Table 1.</w:t>
-      </w:r>
-    </w:p>
-    <w:p>
-      <w:pPr>
-        <w:spacing w:after="0" w:line="360" w:lineRule="auto"/>
-        <w:ind w:left="851"/>
-        <w:jc w:val="both"/>
-        <w:rPr>
-          <w:sz w:val="24"/>
-          <w:szCs w:val="24"/>
-        </w:rPr>
-      </w:pPr>
-    </w:p>
-    <w:p>
-      <w:pPr>
-        <w:pStyle w:val="Caption"/>
-      </w:pPr>
-      <w:bookmarkStart w:id="19" w:name="_Toc429429027"/>
-      <w:r>
-        <w:t xml:space="preserve">Table </w:t>
-      </w:r>
-      <w:r>
-        <w:rPr>
-          <w:noProof/>
-        </w:rPr>
-        <w:fldChar w:fldCharType="begin"/>
-      </w:r>
-      <w:r>
-        <w:rPr>
-          <w:noProof/>
-        </w:rPr>
-        <w:instrText xml:space="preserve"> SEQ Table \* ARABIC </w:instrText>
-      </w:r>
-      <w:r>
-        <w:rPr>
-          <w:noProof/>
-        </w:rPr>
-        <w:fldChar w:fldCharType="separate"/>
-      </w:r>
-      <w:r>
-        <w:rPr>
-          <w:noProof/>
-        </w:rPr>
-        <w:t>1</w:t>
-      </w:r>
-      <w:r>
-        <w:rPr>
-          <w:noProof/>
-        </w:rPr>
-        <w:fldChar w:fldCharType="end"/>
-      </w:r>
-      <w:r>
-        <w:t>. Table Formatting Guidelines</w:t>
-      </w:r>
-      <w:bookmarkEnd w:id="19"/>
-    </w:p>
-    <w:tbl>
-      <w:tblPr>
-        <w:tblStyle w:val="TableGrid"/>
-        <w:tblW w:w="0" w:type="auto"/>
-        <w:tblInd w:w="-5" w:type="dxa"/>
-        <w:tblLook w:val="04A0" w:firstRow="1" w:lastRow="0" w:firstColumn="1" w:lastColumn="0" w:noHBand="0" w:noVBand="1"/>
-      </w:tblPr>
-      <w:tblGrid>
-        <w:gridCol w:w="1786"/>
-        <w:gridCol w:w="7145"/>
-      </w:tblGrid>
-      <w:tr>
-        <w:tc>
-          <w:tcPr>
-            <w:tcW w:w="1786" w:type="dxa"/>
-          </w:tcPr>
-          <w:p>
-            <w:pPr>
-              <w:spacing w:line="360" w:lineRule="auto"/>
-              <w:jc w:val="both"/>
-              <w:rPr>
-                <w:b/>
-                <w:sz w:val="24"/>
-                <w:szCs w:val="24"/>
-              </w:rPr>
-            </w:pPr>
-            <w:r>
-              <w:rPr>
-                <w:b/>
-                <w:sz w:val="24"/>
-                <w:szCs w:val="24"/>
-              </w:rPr>
-              <w:t>Format</w:t>
-            </w:r>
-          </w:p>
-        </w:tc>
-        <w:tc>
-          <w:tcPr>
-            <w:tcW w:w="7145" w:type="dxa"/>
-          </w:tcPr>
-          <w:p>
-            <w:pPr>
-              <w:spacing w:line="360" w:lineRule="auto"/>
-              <w:jc w:val="both"/>
-              <w:rPr>
-                <w:b/>
-                <w:sz w:val="24"/>
-                <w:szCs w:val="24"/>
-              </w:rPr>
-            </w:pPr>
-            <w:r>
-              <w:rPr>
-                <w:b/>
-                <w:sz w:val="24"/>
-                <w:szCs w:val="24"/>
-              </w:rPr>
-              <w:t>Description</w:t>
-            </w:r>
-          </w:p>
-        </w:tc>
-      </w:tr>
-      <w:tr>
-        <w:tc>
-          <w:tcPr>
-            <w:tcW w:w="1786" w:type="dxa"/>
-          </w:tcPr>
-          <w:p>
-            <w:pPr>
-              <w:spacing w:line="360" w:lineRule="auto"/>
-              <w:jc w:val="both"/>
-              <w:rPr>
-                <w:sz w:val="24"/>
-                <w:szCs w:val="24"/>
-              </w:rPr>
-            </w:pPr>
-            <w:r>
-              <w:rPr>
-                <w:sz w:val="24"/>
-                <w:szCs w:val="24"/>
-              </w:rPr>
-              <w:t>Size</w:t>
-            </w:r>
-          </w:p>
-        </w:tc>
-        <w:tc>
-          <w:tcPr>
-            <w:tcW w:w="7145" w:type="dxa"/>
-          </w:tcPr>
-          <w:p>
-            <w:pPr>
-              <w:spacing w:line="360" w:lineRule="auto"/>
-              <w:jc w:val="both"/>
-              <w:rPr>
-                <w:sz w:val="24"/>
-                <w:szCs w:val="24"/>
-              </w:rPr>
-            </w:pPr>
-            <w:r>
-              <w:rPr>
-                <w:sz w:val="24"/>
-                <w:szCs w:val="24"/>
-              </w:rPr>
-              <w:t>The table should be able to fit into one page and should not overrun.</w:t>
-            </w:r>
-          </w:p>
-        </w:tc>
-      </w:tr>
-      <w:tr>
-        <w:tc>
-          <w:tcPr>
-            <w:tcW w:w="1786" w:type="dxa"/>
-          </w:tcPr>
-          <w:p>
-            <w:pPr>
-              <w:spacing w:line="360" w:lineRule="auto"/>
-              <w:jc w:val="both"/>
-              <w:rPr>
-                <w:sz w:val="24"/>
-                <w:szCs w:val="24"/>
-              </w:rPr>
-            </w:pPr>
-            <w:r>
-              <w:rPr>
-                <w:sz w:val="24"/>
-                <w:szCs w:val="24"/>
-              </w:rPr>
-              <w:t>Margins</w:t>
-            </w:r>
-          </w:p>
-        </w:tc>
-        <w:tc>
-          <w:tcPr>
-            <w:tcW w:w="7145" w:type="dxa"/>
-          </w:tcPr>
-          <w:p>
-            <w:pPr>
-              <w:spacing w:line="360" w:lineRule="auto"/>
-              <w:jc w:val="both"/>
-              <w:rPr>
-                <w:sz w:val="24"/>
-                <w:szCs w:val="24"/>
-              </w:rPr>
-            </w:pPr>
-            <w:r>
-              <w:rPr>
-                <w:sz w:val="24"/>
-                <w:szCs w:val="24"/>
-              </w:rPr>
-              <w:t>The table should not extend past the normal margins of the page</w:t>
-            </w:r>
-          </w:p>
-        </w:tc>
-      </w:tr>
-      <w:tr>
-        <w:tc>
-          <w:tcPr>
-            <w:tcW w:w="1786" w:type="dxa"/>
-          </w:tcPr>
-          <w:p>
-            <w:pPr>
-              <w:spacing w:line="360" w:lineRule="auto"/>
-              <w:jc w:val="both"/>
-              <w:rPr>
-                <w:sz w:val="24"/>
-                <w:szCs w:val="24"/>
-              </w:rPr>
-            </w:pPr>
-            <w:r>
-              <w:rPr>
-                <w:sz w:val="24"/>
-                <w:szCs w:val="24"/>
-              </w:rPr>
-              <w:lastRenderedPageBreak/>
-              <w:t>Colour</w:t>
-            </w:r>
-          </w:p>
-        </w:tc>
-        <w:tc>
-          <w:tcPr>
-            <w:tcW w:w="7145" w:type="dxa"/>
-          </w:tcPr>
-          <w:p>
-            <w:pPr>
-              <w:spacing w:line="360" w:lineRule="auto"/>
-              <w:jc w:val="both"/>
-              <w:rPr>
-                <w:sz w:val="24"/>
-                <w:szCs w:val="24"/>
-              </w:rPr>
-            </w:pPr>
-            <w:r>
-              <w:rPr>
-                <w:sz w:val="24"/>
-                <w:szCs w:val="24"/>
-              </w:rPr>
-              <w:t>Colour may be used but consideration should be given to both on screen display and printed display.</w:t>
-            </w:r>
-          </w:p>
-        </w:tc>
-      </w:tr>
-      <w:tr>
-        <w:tc>
-          <w:tcPr>
-            <w:tcW w:w="1786" w:type="dxa"/>
-          </w:tcPr>
-          <w:p>
-            <w:pPr>
-              <w:spacing w:line="360" w:lineRule="auto"/>
-              <w:jc w:val="both"/>
-              <w:rPr>
-                <w:sz w:val="24"/>
-                <w:szCs w:val="24"/>
-              </w:rPr>
-            </w:pPr>
-            <w:r>
-              <w:rPr>
-                <w:sz w:val="24"/>
-                <w:szCs w:val="24"/>
-              </w:rPr>
-              <w:t>Design</w:t>
-            </w:r>
-          </w:p>
-        </w:tc>
-        <w:tc>
-          <w:tcPr>
-            <w:tcW w:w="7145" w:type="dxa"/>
-          </w:tcPr>
-          <w:p>
-            <w:pPr>
-              <w:spacing w:line="360" w:lineRule="auto"/>
-              <w:jc w:val="both"/>
-              <w:rPr>
-                <w:sz w:val="24"/>
-                <w:szCs w:val="24"/>
-              </w:rPr>
-            </w:pPr>
-            <w:r>
-              <w:rPr>
-                <w:sz w:val="24"/>
-                <w:szCs w:val="24"/>
-              </w:rPr>
-              <w:t>Simple designs are best. At all times consider that the information in the table is more important than the ‘flashy’ design.</w:t>
-            </w:r>
-          </w:p>
-        </w:tc>
-      </w:tr>
-    </w:tbl>
-    <w:p>
-      <w:pPr>
-        <w:spacing w:after="0" w:line="360" w:lineRule="auto"/>
-        <w:ind w:left="851"/>
-        <w:jc w:val="both"/>
-        <w:rPr>
-          <w:sz w:val="24"/>
-          <w:szCs w:val="24"/>
-        </w:rPr>
-      </w:pPr>
-    </w:p>
-    <w:p>
-      <w:pPr>
-        <w:pStyle w:val="ListParagraph"/>
-        <w:spacing w:after="0" w:line="360" w:lineRule="auto"/>
-        <w:ind w:left="1134"/>
-        <w:jc w:val="both"/>
-        <w:rPr>
-          <w:sz w:val="24"/>
-          <w:szCs w:val="24"/>
-        </w:rPr>
-      </w:pPr>
-    </w:p>
-    <w:p>
-      <w:pPr>
-        <w:spacing w:after="0" w:line="360" w:lineRule="auto"/>
-        <w:jc w:val="both"/>
-        <w:rPr>
-          <w:sz w:val="24"/>
-          <w:szCs w:val="24"/>
-        </w:rPr>
-      </w:pPr>
-      <w:r>
-        <w:rPr>
-          <w:sz w:val="24"/>
-          <w:szCs w:val="24"/>
-        </w:rPr>
-        <w:t xml:space="preserve">The title for an image </w:t>
-      </w:r>
-      <w:r>
-        <w:rPr>
-          <w:sz w:val="24"/>
-          <w:szCs w:val="24"/>
-        </w:rPr>
-        <w:t>or code must appear directly underneath and on the same page. If this is not possible then move the item within the text to ensure that the caption remains with the item.</w:t>
-      </w:r>
-      <w:r>
-        <w:rPr>
-          <w:sz w:val="24"/>
-          <w:szCs w:val="24"/>
-        </w:rPr>
-        <w:t xml:space="preserve"> The title for a table must appear directly above the table.</w:t>
-      </w:r>
-    </w:p>
-    <w:p>
-      <w:pPr>
-        <w:spacing w:after="0" w:line="360" w:lineRule="auto"/>
-        <w:ind w:left="720"/>
-        <w:jc w:val="both"/>
-        <w:rPr>
-          <w:sz w:val="24"/>
-          <w:szCs w:val="24"/>
-        </w:rPr>
-      </w:pPr>
-    </w:p>
-    <w:p>
-      <w:pPr>
-        <w:spacing w:after="0" w:line="360" w:lineRule="auto"/>
-        <w:jc w:val="both"/>
-        <w:rPr>
-          <w:sz w:val="24"/>
-          <w:szCs w:val="24"/>
-        </w:rPr>
-      </w:pPr>
-      <w:r>
-        <w:rPr>
-          <w:sz w:val="24"/>
-          <w:szCs w:val="24"/>
-        </w:rPr>
-        <w:t>Refer to Table 2 for the second short table sample.</w:t>
-      </w:r>
-    </w:p>
-    <w:p>
-      <w:pPr>
-        <w:pStyle w:val="Caption"/>
-      </w:pPr>
-    </w:p>
-    <w:p>
-      <w:pPr>
-        <w:pStyle w:val="Caption"/>
-      </w:pPr>
-      <w:bookmarkStart w:id="20" w:name="_Toc429429028"/>
-      <w:r>
-        <w:t xml:space="preserve">Table </w:t>
-      </w:r>
-      <w:r>
-        <w:rPr>
-          <w:noProof/>
-        </w:rPr>
-        <w:fldChar w:fldCharType="begin"/>
-      </w:r>
-      <w:r>
-        <w:rPr>
-          <w:noProof/>
-        </w:rPr>
-        <w:instrText xml:space="preserve"> SEQ Table \* ARABIC </w:instrText>
-      </w:r>
-      <w:r>
-        <w:rPr>
-          <w:noProof/>
-        </w:rPr>
-        <w:fldChar w:fldCharType="separate"/>
-      </w:r>
-      <w:r>
-        <w:rPr>
-          <w:noProof/>
-        </w:rPr>
-        <w:t>2</w:t>
-      </w:r>
-      <w:r>
-        <w:rPr>
-          <w:noProof/>
-        </w:rPr>
-        <w:fldChar w:fldCharType="end"/>
-      </w:r>
-      <w:r>
-        <w:t xml:space="preserve"> Second Sample Table</w:t>
-      </w:r>
-      <w:bookmarkEnd w:id="20"/>
-    </w:p>
-    <w:tbl>
-      <w:tblPr>
-        <w:tblStyle w:val="TableGrid"/>
-        <w:tblW w:w="0" w:type="auto"/>
-        <w:tblInd w:w="-5" w:type="dxa"/>
-        <w:tblLook w:val="04A0" w:firstRow="1" w:lastRow="0" w:firstColumn="1" w:lastColumn="0" w:noHBand="0" w:noVBand="1"/>
-      </w:tblPr>
-      <w:tblGrid>
-        <w:gridCol w:w="1786"/>
-        <w:gridCol w:w="7145"/>
-      </w:tblGrid>
-      <w:tr>
-        <w:tc>
-          <w:tcPr>
-            <w:tcW w:w="1786" w:type="dxa"/>
-          </w:tcPr>
-          <w:p>
-            <w:pPr>
-              <w:spacing w:line="360" w:lineRule="auto"/>
-              <w:jc w:val="both"/>
-              <w:rPr>
-                <w:b/>
-                <w:sz w:val="24"/>
-                <w:szCs w:val="24"/>
-              </w:rPr>
-            </w:pPr>
-            <w:r>
-              <w:rPr>
-                <w:b/>
-                <w:sz w:val="24"/>
-                <w:szCs w:val="24"/>
-              </w:rPr>
-              <w:t>Format</w:t>
-            </w:r>
-          </w:p>
-        </w:tc>
-        <w:tc>
-          <w:tcPr>
-            <w:tcW w:w="7145" w:type="dxa"/>
-          </w:tcPr>
-          <w:p>
-            <w:pPr>
-              <w:spacing w:line="360" w:lineRule="auto"/>
-              <w:jc w:val="both"/>
-              <w:rPr>
-                <w:b/>
-                <w:sz w:val="24"/>
-                <w:szCs w:val="24"/>
-              </w:rPr>
-            </w:pPr>
-            <w:r>
-              <w:rPr>
-                <w:b/>
-                <w:sz w:val="24"/>
-                <w:szCs w:val="24"/>
-              </w:rPr>
-              <w:t>Description</w:t>
-            </w:r>
-          </w:p>
-        </w:tc>
-      </w:tr>
-      <w:tr>
-        <w:tc>
-          <w:tcPr>
-            <w:tcW w:w="1786" w:type="dxa"/>
-          </w:tcPr>
-          <w:p>
-            <w:pPr>
-              <w:spacing w:line="360" w:lineRule="auto"/>
-              <w:jc w:val="both"/>
-              <w:rPr>
-                <w:sz w:val="24"/>
-                <w:szCs w:val="24"/>
-              </w:rPr>
-            </w:pPr>
-            <w:r>
-              <w:rPr>
-                <w:sz w:val="24"/>
-                <w:szCs w:val="24"/>
-              </w:rPr>
-              <w:t>Size</w:t>
-            </w:r>
-          </w:p>
-        </w:tc>
-        <w:tc>
-          <w:tcPr>
-            <w:tcW w:w="7145" w:type="dxa"/>
-          </w:tcPr>
-          <w:p>
-            <w:pPr>
-              <w:spacing w:line="360" w:lineRule="auto"/>
-              <w:jc w:val="both"/>
-              <w:rPr>
-                <w:sz w:val="24"/>
-                <w:szCs w:val="24"/>
-              </w:rPr>
-            </w:pPr>
-            <w:r>
-              <w:rPr>
-                <w:sz w:val="24"/>
-                <w:szCs w:val="24"/>
-              </w:rPr>
-              <w:t>The table should be able to fit into one page and should not overrun.</w:t>
-            </w:r>
-          </w:p>
-        </w:tc>
-      </w:tr>
-    </w:tbl>
-    <w:p>
-      <w:pPr>
-        <w:spacing w:after="0" w:line="360" w:lineRule="auto"/>
-        <w:ind w:left="720"/>
-        <w:jc w:val="both"/>
-        <w:rPr>
-          <w:sz w:val="24"/>
-          <w:szCs w:val="24"/>
-        </w:rPr>
-      </w:pPr>
+      <w:r>
+        <w:t>Unreal Engine Setup</w:t>
+      </w:r>
+    </w:p>
+    <w:p>
+      <w:r>
+        <w:t xml:space="preserve">The base of the project is the built in third person template. </w:t>
+      </w:r>
     </w:p>
     <w:p>
       <w:pPr>
@@ -4124,14 +3167,96 @@
         </w:numPr>
         <w:ind w:left="851" w:hanging="851"/>
       </w:pPr>
-      <w:bookmarkStart w:id="21" w:name="_Toc101374252"/>
-      <w:bookmarkStart w:id="22" w:name="_Toc193990931"/>
-      <w:r>
-        <w:t>Code and Formulae</w:t>
-      </w:r>
-      <w:bookmarkEnd w:id="21"/>
-      <w:bookmarkEnd w:id="22"/>
-    </w:p>
+      <w:r>
+        <w:t>Player Character</w:t>
+      </w:r>
+    </w:p>
+    <w:p>
+      <w:r>
+        <w:t xml:space="preserve">The player character controller and pawn is mostly the same as the third person template, with a few small adjustments. </w:t>
+      </w:r>
+    </w:p>
+    <w:p>
+      <w:r>
+        <w:t>On the player movement component, the walk speed is adjusted to x. The jump action is removed on the player controller.</w:t>
+      </w:r>
+    </w:p>
+    <w:p>
+      <w:pPr>
+        <w:spacing w:after="160" w:line="259" w:lineRule="auto"/>
+        <w:rPr>
+          <w:rFonts w:eastAsiaTheme="majorEastAsia" w:cstheme="majorBidi"/>
+          <w:b/>
+          <w:bCs/>
+          <w:sz w:val="32"/>
+          <w:szCs w:val="26"/>
+        </w:rPr>
+      </w:pPr>
+      <w:r>
+        <w:br w:type="page"/>
+      </w:r>
+    </w:p>
+    <w:p>
+      <w:pPr>
+        <w:pStyle w:val="Heading2"/>
+        <w:numPr>
+          <w:ilvl w:val="0"/>
+          <w:numId w:val="3"/>
+        </w:numPr>
+      </w:pPr>
+      <w:r>
+        <w:lastRenderedPageBreak/>
+        <w:t>Game Design</w:t>
+      </w:r>
+    </w:p>
+    <w:p>
+      <w:r>
+        <w:t>The underlying base story for this project is “Cat In The Rain” by Earnest Hemmingway. This was selected both to speed up development and to ensure the basic premise is of a good enough quality to measure narrative engagement</w:t>
+      </w:r>
+      <w:r>
+        <w:t>. “Cat In The Rain” is also old enough to be in the public domain and so free to use.</w:t>
+      </w:r>
+    </w:p>
+    <w:p>
+      <w:r>
+        <w:t>Both levels will have the same basic level design, with features added depending on the version. The game will take place in a hotel with a small outdoor area, primarily created with free to use assets.</w:t>
+      </w:r>
+    </w:p>
+    <w:p>
+      <w:pPr>
+        <w:pStyle w:val="Heading2"/>
+        <w:numPr>
+          <w:ilvl w:val="1"/>
+          <w:numId w:val="3"/>
+        </w:numPr>
+        <w:ind w:left="851" w:hanging="851"/>
+      </w:pPr>
+      <w:r>
+        <w:t xml:space="preserve">Ludology </w:t>
+      </w:r>
+    </w:p>
+    <w:p>
+      <w:r>
+        <w:t>The ludology implementation will have a focus on mechanics and environmental story telling</w:t>
+      </w:r>
+    </w:p>
+    <w:p>
+      <w:pPr>
+        <w:pStyle w:val="Heading2"/>
+        <w:numPr>
+          <w:ilvl w:val="1"/>
+          <w:numId w:val="3"/>
+        </w:numPr>
+        <w:ind w:left="851" w:hanging="851"/>
+      </w:pPr>
+      <w:r>
+        <w:t>Narratology</w:t>
+      </w:r>
+    </w:p>
+    <w:p/>
+    <w:p/>
+    <w:p/>
+    <w:p/>
     <w:p>
       <w:pPr>
         <w:spacing w:after="0" w:line="360" w:lineRule="auto"/>
@@ -4141,13 +3266,6 @@
           <w:szCs w:val="24"/>
         </w:rPr>
       </w:pPr>
-      <w:r>
-        <w:rPr>
-          <w:sz w:val="24"/>
-          <w:szCs w:val="24"/>
-        </w:rPr>
-        <w:t>Where code requires listing within the text it should be treated as an image in that it is sectioned off with a border and has a caption directly underneath. Refer to Code Listing 1.1 below.</w:t>
-      </w:r>
     </w:p>
     <w:p>
       <w:pPr>
@@ -4164,1138 +3282,29 @@
     <w:p>
       <w:pPr>
         <w:pStyle w:val="ListParagraph"/>
-        <w:pBdr>
-          <w:top w:val="single" w:sz="4" w:space="1" w:color="auto"/>
-          <w:left w:val="single" w:sz="4" w:space="4" w:color="auto"/>
-          <w:bottom w:val="single" w:sz="4" w:space="1" w:color="auto"/>
-          <w:right w:val="single" w:sz="4" w:space="4" w:color="auto"/>
-        </w:pBdr>
         <w:spacing w:after="0" w:line="360" w:lineRule="auto"/>
         <w:ind w:left="792"/>
         <w:jc w:val="both"/>
         <w:rPr>
-          <w:rFonts w:asciiTheme="majorHAnsi" w:hAnsiTheme="majorHAnsi"/>
-          <w:sz w:val="20"/>
-          <w:szCs w:val="24"/>
-        </w:rPr>
-      </w:pPr>
-      <w:r>
-        <w:rPr>
-          <w:rFonts w:asciiTheme="majorHAnsi" w:hAnsiTheme="majorHAnsi"/>
-          <w:sz w:val="20"/>
-          <w:szCs w:val="24"/>
-        </w:rPr>
-        <w:t>…</w:t>
-      </w:r>
-    </w:p>
-    <w:p>
-      <w:pPr>
-        <w:pStyle w:val="ListParagraph"/>
-        <w:pBdr>
-          <w:top w:val="single" w:sz="4" w:space="1" w:color="auto"/>
-          <w:left w:val="single" w:sz="4" w:space="4" w:color="auto"/>
-          <w:bottom w:val="single" w:sz="4" w:space="1" w:color="auto"/>
-          <w:right w:val="single" w:sz="4" w:space="4" w:color="auto"/>
-        </w:pBdr>
-        <w:spacing w:after="0" w:line="360" w:lineRule="auto"/>
-        <w:ind w:left="792"/>
-        <w:jc w:val="both"/>
-        <w:rPr>
-          <w:rFonts w:asciiTheme="majorHAnsi" w:hAnsiTheme="majorHAnsi"/>
-          <w:sz w:val="20"/>
-          <w:szCs w:val="24"/>
-        </w:rPr>
-      </w:pPr>
-      <w:r>
-        <w:rPr>
-          <w:rFonts w:asciiTheme="majorHAnsi" w:hAnsiTheme="majorHAnsi"/>
-          <w:sz w:val="20"/>
-          <w:szCs w:val="24"/>
-        </w:rPr>
-        <w:t xml:space="preserve">TextMessage msg = </w:t>
-      </w:r>
-      <w:proofErr w:type="gramStart"/>
-      <w:r>
-        <w:rPr>
-          <w:rFonts w:asciiTheme="majorHAnsi" w:hAnsiTheme="majorHAnsi"/>
-          <w:sz w:val="20"/>
-          <w:szCs w:val="24"/>
-        </w:rPr>
-        <w:t>null;</w:t>
-      </w:r>
-      <w:proofErr w:type="gramEnd"/>
-    </w:p>
-    <w:p>
-      <w:pPr>
-        <w:pStyle w:val="ListParagraph"/>
-        <w:pBdr>
-          <w:top w:val="single" w:sz="4" w:space="1" w:color="auto"/>
-          <w:left w:val="single" w:sz="4" w:space="4" w:color="auto"/>
-          <w:bottom w:val="single" w:sz="4" w:space="1" w:color="auto"/>
-          <w:right w:val="single" w:sz="4" w:space="4" w:color="auto"/>
-        </w:pBdr>
-        <w:spacing w:after="0" w:line="360" w:lineRule="auto"/>
-        <w:ind w:left="792"/>
-        <w:jc w:val="both"/>
-        <w:rPr>
-          <w:rFonts w:asciiTheme="majorHAnsi" w:hAnsiTheme="majorHAnsi"/>
-          <w:sz w:val="20"/>
-          <w:szCs w:val="24"/>
-        </w:rPr>
-      </w:pPr>
-      <w:r>
-        <w:rPr>
-          <w:rFonts w:asciiTheme="majorHAnsi" w:hAnsiTheme="majorHAnsi"/>
-          <w:sz w:val="20"/>
-          <w:szCs w:val="24"/>
-        </w:rPr>
-        <w:t xml:space="preserve">        try {</w:t>
-      </w:r>
-    </w:p>
-    <w:p>
-      <w:pPr>
-        <w:pStyle w:val="ListParagraph"/>
-        <w:pBdr>
-          <w:top w:val="single" w:sz="4" w:space="1" w:color="auto"/>
-          <w:left w:val="single" w:sz="4" w:space="4" w:color="auto"/>
-          <w:bottom w:val="single" w:sz="4" w:space="1" w:color="auto"/>
-          <w:right w:val="single" w:sz="4" w:space="4" w:color="auto"/>
-        </w:pBdr>
-        <w:spacing w:after="0" w:line="360" w:lineRule="auto"/>
-        <w:ind w:left="792"/>
-        <w:jc w:val="both"/>
-        <w:rPr>
-          <w:rFonts w:asciiTheme="majorHAnsi" w:hAnsiTheme="majorHAnsi"/>
-          <w:sz w:val="20"/>
-          <w:szCs w:val="24"/>
-        </w:rPr>
-      </w:pPr>
-      <w:r>
-        <w:rPr>
-          <w:rFonts w:asciiTheme="majorHAnsi" w:hAnsiTheme="majorHAnsi"/>
-          <w:sz w:val="20"/>
-          <w:szCs w:val="24"/>
-        </w:rPr>
-        <w:t xml:space="preserve">            if (message instanceof TextMessage) {</w:t>
-      </w:r>
-    </w:p>
-    <w:p>
-      <w:pPr>
-        <w:pStyle w:val="ListParagraph"/>
-        <w:pBdr>
-          <w:top w:val="single" w:sz="4" w:space="1" w:color="auto"/>
-          <w:left w:val="single" w:sz="4" w:space="4" w:color="auto"/>
-          <w:bottom w:val="single" w:sz="4" w:space="1" w:color="auto"/>
-          <w:right w:val="single" w:sz="4" w:space="4" w:color="auto"/>
-        </w:pBdr>
-        <w:spacing w:after="0" w:line="360" w:lineRule="auto"/>
-        <w:ind w:left="792"/>
-        <w:jc w:val="both"/>
-        <w:rPr>
-          <w:rFonts w:asciiTheme="majorHAnsi" w:hAnsiTheme="majorHAnsi"/>
-          <w:sz w:val="20"/>
-          <w:szCs w:val="24"/>
-        </w:rPr>
-      </w:pPr>
-      <w:r>
-        <w:rPr>
-          <w:rFonts w:asciiTheme="majorHAnsi" w:hAnsiTheme="majorHAnsi"/>
-          <w:sz w:val="20"/>
-          <w:szCs w:val="24"/>
-        </w:rPr>
-        <w:t xml:space="preserve">                msg = (TextMessage) </w:t>
-      </w:r>
-      <w:proofErr w:type="gramStart"/>
-      <w:r>
-        <w:rPr>
-          <w:rFonts w:asciiTheme="majorHAnsi" w:hAnsiTheme="majorHAnsi"/>
-          <w:sz w:val="20"/>
-          <w:szCs w:val="24"/>
-        </w:rPr>
-        <w:t>message;</w:t>
-      </w:r>
-      <w:proofErr w:type="gramEnd"/>
-    </w:p>
-    <w:p>
-      <w:pPr>
-        <w:pStyle w:val="ListParagraph"/>
-        <w:pBdr>
-          <w:top w:val="single" w:sz="4" w:space="1" w:color="auto"/>
-          <w:left w:val="single" w:sz="4" w:space="4" w:color="auto"/>
-          <w:bottom w:val="single" w:sz="4" w:space="1" w:color="auto"/>
-          <w:right w:val="single" w:sz="4" w:space="4" w:color="auto"/>
-        </w:pBdr>
-        <w:spacing w:after="0" w:line="360" w:lineRule="auto"/>
-        <w:ind w:left="792"/>
-        <w:jc w:val="both"/>
-        <w:rPr>
-          <w:rFonts w:asciiTheme="majorHAnsi" w:hAnsiTheme="majorHAnsi"/>
-          <w:sz w:val="20"/>
-          <w:szCs w:val="24"/>
-        </w:rPr>
-      </w:pPr>
-      <w:r>
-        <w:rPr>
-          <w:rFonts w:asciiTheme="majorHAnsi" w:hAnsiTheme="majorHAnsi"/>
-          <w:sz w:val="20"/>
-          <w:szCs w:val="24"/>
-        </w:rPr>
-        <w:t xml:space="preserve">                System.out.println("A Message received in TMDB: "</w:t>
-      </w:r>
-    </w:p>
-    <w:p>
-      <w:pPr>
-        <w:pStyle w:val="ListParagraph"/>
-        <w:pBdr>
-          <w:top w:val="single" w:sz="4" w:space="1" w:color="auto"/>
-          <w:left w:val="single" w:sz="4" w:space="4" w:color="auto"/>
-          <w:bottom w:val="single" w:sz="4" w:space="1" w:color="auto"/>
-          <w:right w:val="single" w:sz="4" w:space="4" w:color="auto"/>
-        </w:pBdr>
-        <w:spacing w:after="0" w:line="360" w:lineRule="auto"/>
-        <w:ind w:left="792"/>
-        <w:jc w:val="both"/>
-        <w:rPr>
-          <w:rFonts w:asciiTheme="majorHAnsi" w:hAnsiTheme="majorHAnsi"/>
-          <w:sz w:val="20"/>
-          <w:szCs w:val="24"/>
-        </w:rPr>
-      </w:pPr>
-      <w:r>
-        <w:rPr>
-          <w:rFonts w:asciiTheme="majorHAnsi" w:hAnsiTheme="majorHAnsi"/>
-          <w:sz w:val="20"/>
-          <w:szCs w:val="24"/>
-        </w:rPr>
-        <w:t xml:space="preserve">                                                    + </w:t>
-      </w:r>
-      <w:proofErr w:type="gramStart"/>
-      <w:r>
-        <w:rPr>
-          <w:rFonts w:asciiTheme="majorHAnsi" w:hAnsiTheme="majorHAnsi"/>
-          <w:sz w:val="20"/>
-          <w:szCs w:val="24"/>
-        </w:rPr>
-        <w:t>msg.getText</w:t>
-      </w:r>
-      <w:proofErr w:type="gramEnd"/>
-      <w:r>
-        <w:rPr>
-          <w:rFonts w:asciiTheme="majorHAnsi" w:hAnsiTheme="majorHAnsi"/>
-          <w:sz w:val="20"/>
-          <w:szCs w:val="24"/>
-        </w:rPr>
-        <w:t>()</w:t>
-      </w:r>
-      <w:proofErr w:type="gramStart"/>
-      <w:r>
-        <w:rPr>
-          <w:rFonts w:asciiTheme="majorHAnsi" w:hAnsiTheme="majorHAnsi"/>
-          <w:sz w:val="20"/>
-          <w:szCs w:val="24"/>
-        </w:rPr>
-        <w:t>);</w:t>
-      </w:r>
-      <w:proofErr w:type="gramEnd"/>
-    </w:p>
-    <w:p>
-      <w:pPr>
-        <w:pStyle w:val="ListParagraph"/>
-        <w:pBdr>
-          <w:top w:val="single" w:sz="4" w:space="1" w:color="auto"/>
-          <w:left w:val="single" w:sz="4" w:space="4" w:color="auto"/>
-          <w:bottom w:val="single" w:sz="4" w:space="1" w:color="auto"/>
-          <w:right w:val="single" w:sz="4" w:space="4" w:color="auto"/>
-        </w:pBdr>
-        <w:spacing w:after="0" w:line="360" w:lineRule="auto"/>
-        <w:ind w:left="792"/>
-        <w:jc w:val="both"/>
-        <w:rPr>
-          <w:rFonts w:asciiTheme="majorHAnsi" w:hAnsiTheme="majorHAnsi"/>
-          <w:sz w:val="20"/>
-          <w:szCs w:val="24"/>
-        </w:rPr>
-      </w:pPr>
-      <w:r>
-        <w:rPr>
-          <w:rFonts w:asciiTheme="majorHAnsi" w:hAnsiTheme="majorHAnsi"/>
-          <w:sz w:val="20"/>
-          <w:szCs w:val="24"/>
-        </w:rPr>
-        <w:t xml:space="preserve">            }</w:t>
-      </w:r>
-    </w:p>
-    <w:p>
-      <w:pPr>
-        <w:pStyle w:val="ListParagraph"/>
-        <w:pBdr>
-          <w:top w:val="single" w:sz="4" w:space="1" w:color="auto"/>
-          <w:left w:val="single" w:sz="4" w:space="4" w:color="auto"/>
-          <w:bottom w:val="single" w:sz="4" w:space="1" w:color="auto"/>
-          <w:right w:val="single" w:sz="4" w:space="4" w:color="auto"/>
-        </w:pBdr>
-        <w:spacing w:after="0" w:line="360" w:lineRule="auto"/>
-        <w:ind w:left="792"/>
-        <w:jc w:val="both"/>
-        <w:rPr>
-          <w:rFonts w:asciiTheme="majorHAnsi" w:hAnsiTheme="majorHAnsi"/>
-          <w:sz w:val="20"/>
-          <w:szCs w:val="24"/>
-        </w:rPr>
-      </w:pPr>
-      <w:r>
-        <w:rPr>
-          <w:rFonts w:asciiTheme="majorHAnsi" w:hAnsiTheme="majorHAnsi"/>
-          <w:sz w:val="20"/>
-          <w:szCs w:val="24"/>
-        </w:rPr>
-        <w:t xml:space="preserve">            else {</w:t>
-      </w:r>
-    </w:p>
-    <w:p>
-      <w:pPr>
-        <w:pStyle w:val="ListParagraph"/>
-        <w:pBdr>
-          <w:top w:val="single" w:sz="4" w:space="1" w:color="auto"/>
-          <w:left w:val="single" w:sz="4" w:space="4" w:color="auto"/>
-          <w:bottom w:val="single" w:sz="4" w:space="1" w:color="auto"/>
-          <w:right w:val="single" w:sz="4" w:space="4" w:color="auto"/>
-        </w:pBdr>
-        <w:spacing w:after="0" w:line="360" w:lineRule="auto"/>
-        <w:ind w:left="792"/>
-        <w:jc w:val="both"/>
-        <w:rPr>
-          <w:rFonts w:asciiTheme="majorHAnsi" w:hAnsiTheme="majorHAnsi"/>
-          <w:sz w:val="20"/>
-          <w:szCs w:val="24"/>
-        </w:rPr>
-      </w:pPr>
-      <w:r>
-        <w:rPr>
-          <w:rFonts w:asciiTheme="majorHAnsi" w:hAnsiTheme="majorHAnsi"/>
-          <w:sz w:val="20"/>
-          <w:szCs w:val="24"/>
-        </w:rPr>
-        <w:lastRenderedPageBreak/>
-        <w:t xml:space="preserve">               System.out.println("Message of wrong type: "</w:t>
-      </w:r>
-    </w:p>
-    <w:p>
-      <w:pPr>
-        <w:pStyle w:val="ListParagraph"/>
-        <w:pBdr>
-          <w:top w:val="single" w:sz="4" w:space="1" w:color="auto"/>
-          <w:left w:val="single" w:sz="4" w:space="4" w:color="auto"/>
-          <w:bottom w:val="single" w:sz="4" w:space="1" w:color="auto"/>
-          <w:right w:val="single" w:sz="4" w:space="4" w:color="auto"/>
-        </w:pBdr>
-        <w:spacing w:after="0" w:line="360" w:lineRule="auto"/>
-        <w:ind w:left="792"/>
-        <w:jc w:val="both"/>
-        <w:rPr>
-          <w:rFonts w:asciiTheme="majorHAnsi" w:hAnsiTheme="majorHAnsi"/>
-          <w:sz w:val="20"/>
-          <w:szCs w:val="24"/>
-        </w:rPr>
-      </w:pPr>
-      <w:r>
-        <w:rPr>
-          <w:rFonts w:asciiTheme="majorHAnsi" w:hAnsiTheme="majorHAnsi"/>
-          <w:sz w:val="20"/>
-          <w:szCs w:val="24"/>
-        </w:rPr>
-        <w:t xml:space="preserve">                                            + </w:t>
-      </w:r>
-      <w:proofErr w:type="gramStart"/>
-      <w:r>
-        <w:rPr>
-          <w:rFonts w:asciiTheme="majorHAnsi" w:hAnsiTheme="majorHAnsi"/>
-          <w:sz w:val="20"/>
-          <w:szCs w:val="24"/>
-        </w:rPr>
-        <w:t>message.getClass</w:t>
-      </w:r>
-      <w:proofErr w:type="gramEnd"/>
-      <w:r>
-        <w:rPr>
-          <w:rFonts w:asciiTheme="majorHAnsi" w:hAnsiTheme="majorHAnsi"/>
-          <w:sz w:val="20"/>
-          <w:szCs w:val="24"/>
-        </w:rPr>
-        <w:t>(</w:t>
-      </w:r>
-      <w:proofErr w:type="gramStart"/>
-      <w:r>
-        <w:rPr>
-          <w:rFonts w:asciiTheme="majorHAnsi" w:hAnsiTheme="majorHAnsi"/>
-          <w:sz w:val="20"/>
-          <w:szCs w:val="24"/>
-        </w:rPr>
-        <w:t>).getName</w:t>
-      </w:r>
-      <w:proofErr w:type="gramEnd"/>
-      <w:r>
-        <w:rPr>
-          <w:rFonts w:asciiTheme="majorHAnsi" w:hAnsiTheme="majorHAnsi"/>
-          <w:sz w:val="20"/>
-          <w:szCs w:val="24"/>
-        </w:rPr>
-        <w:t>()</w:t>
-      </w:r>
-      <w:proofErr w:type="gramStart"/>
-      <w:r>
-        <w:rPr>
-          <w:rFonts w:asciiTheme="majorHAnsi" w:hAnsiTheme="majorHAnsi"/>
-          <w:sz w:val="20"/>
-          <w:szCs w:val="24"/>
-        </w:rPr>
-        <w:t>);</w:t>
-      </w:r>
-      <w:proofErr w:type="gramEnd"/>
-    </w:p>
-    <w:p>
-      <w:pPr>
-        <w:pStyle w:val="ListParagraph"/>
-        <w:pBdr>
-          <w:top w:val="single" w:sz="4" w:space="1" w:color="auto"/>
-          <w:left w:val="single" w:sz="4" w:space="4" w:color="auto"/>
-          <w:bottom w:val="single" w:sz="4" w:space="1" w:color="auto"/>
-          <w:right w:val="single" w:sz="4" w:space="4" w:color="auto"/>
-        </w:pBdr>
-        <w:spacing w:after="0" w:line="360" w:lineRule="auto"/>
-        <w:ind w:left="792"/>
-        <w:jc w:val="both"/>
-        <w:rPr>
-          <w:rFonts w:asciiTheme="majorHAnsi" w:hAnsiTheme="majorHAnsi"/>
-          <w:sz w:val="20"/>
-          <w:szCs w:val="24"/>
-        </w:rPr>
-      </w:pPr>
-      <w:r>
-        <w:rPr>
-          <w:rFonts w:asciiTheme="majorHAnsi" w:hAnsiTheme="majorHAnsi"/>
-          <w:sz w:val="20"/>
-          <w:szCs w:val="24"/>
-        </w:rPr>
-        <w:t xml:space="preserve">            }</w:t>
-      </w:r>
-    </w:p>
-    <w:p>
-      <w:pPr>
-        <w:pStyle w:val="ListParagraph"/>
-        <w:pBdr>
-          <w:top w:val="single" w:sz="4" w:space="1" w:color="auto"/>
-          <w:left w:val="single" w:sz="4" w:space="4" w:color="auto"/>
-          <w:bottom w:val="single" w:sz="4" w:space="1" w:color="auto"/>
-          <w:right w:val="single" w:sz="4" w:space="4" w:color="auto"/>
-        </w:pBdr>
-        <w:spacing w:after="0" w:line="360" w:lineRule="auto"/>
-        <w:ind w:left="792"/>
-        <w:jc w:val="both"/>
-        <w:rPr>
-          <w:rFonts w:asciiTheme="majorHAnsi" w:hAnsiTheme="majorHAnsi"/>
-          <w:sz w:val="20"/>
-          <w:szCs w:val="24"/>
-        </w:rPr>
-      </w:pPr>
-      <w:r>
-        <w:rPr>
-          <w:rFonts w:asciiTheme="majorHAnsi" w:hAnsiTheme="majorHAnsi"/>
-          <w:sz w:val="20"/>
-          <w:szCs w:val="24"/>
-        </w:rPr>
-        <w:t xml:space="preserve">        } catch (JMSException e) {</w:t>
-      </w:r>
-    </w:p>
-    <w:p>
-      <w:pPr>
-        <w:pStyle w:val="ListParagraph"/>
-        <w:pBdr>
-          <w:top w:val="single" w:sz="4" w:space="1" w:color="auto"/>
-          <w:left w:val="single" w:sz="4" w:space="4" w:color="auto"/>
-          <w:bottom w:val="single" w:sz="4" w:space="1" w:color="auto"/>
-          <w:right w:val="single" w:sz="4" w:space="4" w:color="auto"/>
-        </w:pBdr>
-        <w:spacing w:after="0" w:line="360" w:lineRule="auto"/>
-        <w:ind w:left="792"/>
-        <w:jc w:val="both"/>
-        <w:rPr>
-          <w:rFonts w:asciiTheme="majorHAnsi" w:hAnsiTheme="majorHAnsi"/>
-          <w:sz w:val="20"/>
-          <w:szCs w:val="24"/>
-        </w:rPr>
-      </w:pPr>
-      <w:r>
-        <w:rPr>
-          <w:rFonts w:asciiTheme="majorHAnsi" w:hAnsiTheme="majorHAnsi"/>
-          <w:sz w:val="20"/>
-          <w:szCs w:val="24"/>
-        </w:rPr>
-        <w:t xml:space="preserve">            </w:t>
-      </w:r>
-      <w:proofErr w:type="gramStart"/>
-      <w:r>
-        <w:rPr>
-          <w:rFonts w:asciiTheme="majorHAnsi" w:hAnsiTheme="majorHAnsi"/>
-          <w:sz w:val="20"/>
-          <w:szCs w:val="24"/>
-        </w:rPr>
-        <w:t>e.printStackTrace</w:t>
-      </w:r>
-      <w:proofErr w:type="gramEnd"/>
-      <w:r>
-        <w:rPr>
-          <w:rFonts w:asciiTheme="majorHAnsi" w:hAnsiTheme="majorHAnsi"/>
-          <w:sz w:val="20"/>
-          <w:szCs w:val="24"/>
-        </w:rPr>
-        <w:t>(</w:t>
-      </w:r>
-      <w:proofErr w:type="gramStart"/>
-      <w:r>
-        <w:rPr>
-          <w:rFonts w:asciiTheme="majorHAnsi" w:hAnsiTheme="majorHAnsi"/>
-          <w:sz w:val="20"/>
-          <w:szCs w:val="24"/>
-        </w:rPr>
-        <w:t>);</w:t>
-      </w:r>
-      <w:proofErr w:type="gramEnd"/>
-    </w:p>
-    <w:p>
-      <w:pPr>
-        <w:pStyle w:val="ListParagraph"/>
-        <w:pBdr>
-          <w:top w:val="single" w:sz="4" w:space="1" w:color="auto"/>
-          <w:left w:val="single" w:sz="4" w:space="4" w:color="auto"/>
-          <w:bottom w:val="single" w:sz="4" w:space="1" w:color="auto"/>
-          <w:right w:val="single" w:sz="4" w:space="4" w:color="auto"/>
-        </w:pBdr>
-        <w:spacing w:after="0" w:line="360" w:lineRule="auto"/>
-        <w:ind w:left="792"/>
-        <w:jc w:val="both"/>
-        <w:rPr>
-          <w:rFonts w:asciiTheme="majorHAnsi" w:hAnsiTheme="majorHAnsi"/>
-          <w:sz w:val="20"/>
-          <w:szCs w:val="24"/>
-        </w:rPr>
-      </w:pPr>
-      <w:r>
-        <w:rPr>
-          <w:rFonts w:asciiTheme="majorHAnsi" w:hAnsiTheme="majorHAnsi"/>
-          <w:sz w:val="20"/>
-          <w:szCs w:val="24"/>
-        </w:rPr>
-        <w:t xml:space="preserve">            mdc.</w:t>
-      </w:r>
-      <w:proofErr w:type="gramStart"/>
-      <w:r>
-        <w:rPr>
-          <w:rFonts w:asciiTheme="majorHAnsi" w:hAnsiTheme="majorHAnsi"/>
-          <w:sz w:val="20"/>
-          <w:szCs w:val="24"/>
-        </w:rPr>
-        <w:t>setRollbackOnly();</w:t>
-      </w:r>
-      <w:proofErr w:type="gramEnd"/>
-    </w:p>
-    <w:p>
-      <w:pPr>
-        <w:pStyle w:val="ListParagraph"/>
-        <w:pBdr>
-          <w:top w:val="single" w:sz="4" w:space="1" w:color="auto"/>
-          <w:left w:val="single" w:sz="4" w:space="4" w:color="auto"/>
-          <w:bottom w:val="single" w:sz="4" w:space="1" w:color="auto"/>
-          <w:right w:val="single" w:sz="4" w:space="4" w:color="auto"/>
-        </w:pBdr>
-        <w:spacing w:after="0" w:line="360" w:lineRule="auto"/>
-        <w:ind w:left="792"/>
-        <w:jc w:val="both"/>
-        <w:rPr>
-          <w:rFonts w:asciiTheme="majorHAnsi" w:hAnsiTheme="majorHAnsi"/>
-          <w:sz w:val="20"/>
-          <w:szCs w:val="24"/>
-        </w:rPr>
-      </w:pPr>
-      <w:r>
-        <w:rPr>
-          <w:rFonts w:asciiTheme="majorHAnsi" w:hAnsiTheme="majorHAnsi"/>
-          <w:sz w:val="20"/>
-          <w:szCs w:val="24"/>
-        </w:rPr>
-        <w:t xml:space="preserve">        } catch (Throwable te) {</w:t>
-      </w:r>
-    </w:p>
-    <w:p>
-      <w:pPr>
-        <w:pStyle w:val="ListParagraph"/>
-        <w:pBdr>
-          <w:top w:val="single" w:sz="4" w:space="1" w:color="auto"/>
-          <w:left w:val="single" w:sz="4" w:space="4" w:color="auto"/>
-          <w:bottom w:val="single" w:sz="4" w:space="1" w:color="auto"/>
-          <w:right w:val="single" w:sz="4" w:space="4" w:color="auto"/>
-        </w:pBdr>
-        <w:spacing w:after="0" w:line="360" w:lineRule="auto"/>
-        <w:ind w:left="792"/>
-        <w:jc w:val="both"/>
-        <w:rPr>
-          <w:rFonts w:asciiTheme="majorHAnsi" w:hAnsiTheme="majorHAnsi"/>
-          <w:sz w:val="20"/>
-          <w:szCs w:val="24"/>
-        </w:rPr>
-      </w:pPr>
-      <w:r>
-        <w:rPr>
-          <w:rFonts w:asciiTheme="majorHAnsi" w:hAnsiTheme="majorHAnsi"/>
-          <w:sz w:val="20"/>
-          <w:szCs w:val="24"/>
-        </w:rPr>
-        <w:t xml:space="preserve">            </w:t>
-      </w:r>
-      <w:proofErr w:type="gramStart"/>
-      <w:r>
-        <w:rPr>
-          <w:rFonts w:asciiTheme="majorHAnsi" w:hAnsiTheme="majorHAnsi"/>
-          <w:sz w:val="20"/>
-          <w:szCs w:val="24"/>
-        </w:rPr>
-        <w:t>te.printStackTrace</w:t>
-      </w:r>
-      <w:proofErr w:type="gramEnd"/>
-      <w:r>
-        <w:rPr>
-          <w:rFonts w:asciiTheme="majorHAnsi" w:hAnsiTheme="majorHAnsi"/>
-          <w:sz w:val="20"/>
-          <w:szCs w:val="24"/>
-        </w:rPr>
-        <w:t>(</w:t>
-      </w:r>
-      <w:proofErr w:type="gramStart"/>
-      <w:r>
-        <w:rPr>
-          <w:rFonts w:asciiTheme="majorHAnsi" w:hAnsiTheme="majorHAnsi"/>
-          <w:sz w:val="20"/>
-          <w:szCs w:val="24"/>
-        </w:rPr>
-        <w:t>);</w:t>
-      </w:r>
-      <w:proofErr w:type="gramEnd"/>
-    </w:p>
-    <w:p>
-      <w:pPr>
-        <w:pStyle w:val="ListParagraph"/>
-        <w:pBdr>
-          <w:top w:val="single" w:sz="4" w:space="1" w:color="auto"/>
-          <w:left w:val="single" w:sz="4" w:space="4" w:color="auto"/>
-          <w:bottom w:val="single" w:sz="4" w:space="1" w:color="auto"/>
-          <w:right w:val="single" w:sz="4" w:space="4" w:color="auto"/>
-        </w:pBdr>
-        <w:spacing w:after="0" w:line="360" w:lineRule="auto"/>
-        <w:ind w:left="792"/>
-        <w:jc w:val="both"/>
-        <w:rPr>
-          <w:rFonts w:asciiTheme="majorHAnsi" w:hAnsiTheme="majorHAnsi"/>
-          <w:sz w:val="20"/>
-          <w:szCs w:val="24"/>
-        </w:rPr>
-      </w:pPr>
-      <w:r>
-        <w:rPr>
-          <w:rFonts w:asciiTheme="majorHAnsi" w:hAnsiTheme="majorHAnsi"/>
-          <w:sz w:val="20"/>
-          <w:szCs w:val="24"/>
-        </w:rPr>
-        <w:t xml:space="preserve">        }</w:t>
-      </w:r>
-    </w:p>
-    <w:p>
-      <w:pPr>
-        <w:pStyle w:val="ListParagraph"/>
-        <w:pBdr>
-          <w:top w:val="single" w:sz="4" w:space="1" w:color="auto"/>
-          <w:left w:val="single" w:sz="4" w:space="4" w:color="auto"/>
-          <w:bottom w:val="single" w:sz="4" w:space="1" w:color="auto"/>
-          <w:right w:val="single" w:sz="4" w:space="4" w:color="auto"/>
-        </w:pBdr>
-        <w:spacing w:after="0" w:line="360" w:lineRule="auto"/>
-        <w:ind w:left="792"/>
-        <w:jc w:val="both"/>
-        <w:rPr>
-          <w:rFonts w:asciiTheme="majorHAnsi" w:hAnsiTheme="majorHAnsi"/>
-          <w:sz w:val="20"/>
-          <w:szCs w:val="24"/>
-        </w:rPr>
-      </w:pPr>
-      <w:r>
-        <w:rPr>
-          <w:rFonts w:asciiTheme="majorHAnsi" w:hAnsiTheme="majorHAnsi"/>
-          <w:sz w:val="20"/>
-          <w:szCs w:val="24"/>
-        </w:rPr>
-        <w:t>…</w:t>
-      </w:r>
-    </w:p>
-    <w:p>
-      <w:pPr>
-        <w:pStyle w:val="ListParagraph"/>
-        <w:spacing w:after="0" w:line="360" w:lineRule="auto"/>
-        <w:ind w:left="792"/>
-        <w:jc w:val="both"/>
-        <w:rPr>
           <w:sz w:val="24"/>
           <w:szCs w:val="24"/>
         </w:rPr>
       </w:pPr>
-      <w:r>
+    </w:p>
+    <w:p>
+      <w:pPr>
+        <w:spacing w:after="0" w:line="360" w:lineRule="auto"/>
+        <w:jc w:val="both"/>
         <w:rPr>
           <w:sz w:val="24"/>
           <w:szCs w:val="24"/>
         </w:rPr>
-        <w:t xml:space="preserve">   </w:t>
-      </w:r>
-    </w:p>
-    <w:p>
-      <w:pPr>
-        <w:pStyle w:val="Caption"/>
-        <w:rPr>
-          <w:szCs w:val="24"/>
-        </w:rPr>
-      </w:pPr>
-      <w:bookmarkStart w:id="23" w:name="_Toc429428842"/>
-      <w:r>
-        <w:t xml:space="preserve">Code Listing </w:t>
-      </w:r>
-      <w:r>
-        <w:rPr>
-          <w:noProof/>
-        </w:rPr>
-        <w:fldChar w:fldCharType="begin"/>
-      </w:r>
-      <w:r>
-        <w:rPr>
-          <w:noProof/>
-        </w:rPr>
-        <w:instrText xml:space="preserve"> SEQ Code_Listing \* ARABIC </w:instrText>
-      </w:r>
-      <w:r>
-        <w:rPr>
-          <w:noProof/>
-        </w:rPr>
-        <w:fldChar w:fldCharType="separate"/>
-      </w:r>
-      <w:r>
-        <w:rPr>
-          <w:noProof/>
-        </w:rPr>
-        <w:t>1</w:t>
-      </w:r>
-      <w:r>
-        <w:rPr>
-          <w:noProof/>
-        </w:rPr>
-        <w:fldChar w:fldCharType="end"/>
-      </w:r>
-      <w:r>
-        <w:t xml:space="preserve"> MDBean Message Handling</w:t>
-      </w:r>
-      <w:bookmarkEnd w:id="23"/>
-    </w:p>
-    <w:p>
-      <w:pPr>
-        <w:spacing w:after="0" w:line="360" w:lineRule="auto"/>
-        <w:jc w:val="both"/>
+      </w:pPr>
+      <w:r>
         <w:rPr>
           <w:sz w:val="24"/>
           <w:szCs w:val="24"/>
         </w:rPr>
-      </w:pPr>
-    </w:p>
-    <w:p>
-      <w:pPr>
-        <w:spacing w:after="0" w:line="360" w:lineRule="auto"/>
-        <w:jc w:val="both"/>
-        <w:rPr>
-          <w:sz w:val="24"/>
-          <w:szCs w:val="24"/>
-        </w:rPr>
-      </w:pPr>
-      <w:r>
-        <w:rPr>
-          <w:sz w:val="24"/>
-          <w:szCs w:val="24"/>
-        </w:rPr>
-        <w:t xml:space="preserve">Notice that only minimal commenting is provided within the text.  The code is shown in Cambria, 10 </w:t>
-      </w:r>
-      <w:proofErr w:type="gramStart"/>
-      <w:r>
-        <w:rPr>
-          <w:sz w:val="24"/>
-          <w:szCs w:val="24"/>
-        </w:rPr>
-        <w:t>point</w:t>
-      </w:r>
-      <w:proofErr w:type="gramEnd"/>
-      <w:r>
-        <w:rPr>
-          <w:sz w:val="24"/>
-          <w:szCs w:val="24"/>
-        </w:rPr>
-        <w:t xml:space="preserve">. This reduces the overall text size and clearly distinguishes it from the main text. </w:t>
-      </w:r>
-    </w:p>
-    <w:p>
-      <w:pPr>
-        <w:pStyle w:val="ListParagraph"/>
-        <w:spacing w:after="0" w:line="360" w:lineRule="auto"/>
-        <w:ind w:left="792"/>
-        <w:jc w:val="both"/>
-        <w:rPr>
-          <w:sz w:val="24"/>
-          <w:szCs w:val="24"/>
-        </w:rPr>
-      </w:pPr>
-    </w:p>
-    <w:p>
-      <w:pPr>
-        <w:spacing w:after="0" w:line="360" w:lineRule="auto"/>
-        <w:jc w:val="both"/>
-        <w:rPr>
-          <w:sz w:val="24"/>
-          <w:szCs w:val="24"/>
-        </w:rPr>
-      </w:pPr>
-      <w:r>
-        <w:rPr>
-          <w:sz w:val="24"/>
-          <w:szCs w:val="24"/>
-        </w:rPr>
-        <w:t xml:space="preserve">If a single line of formula is </w:t>
-      </w:r>
-      <w:proofErr w:type="gramStart"/>
-      <w:r>
-        <w:rPr>
-          <w:sz w:val="24"/>
-          <w:szCs w:val="24"/>
-        </w:rPr>
-        <w:t>required</w:t>
-      </w:r>
-      <w:proofErr w:type="gramEnd"/>
-      <w:r>
-        <w:rPr>
-          <w:sz w:val="24"/>
-          <w:szCs w:val="24"/>
-        </w:rPr>
-        <w:t xml:space="preserve"> it can be referred to within the text as formula (</w:t>
-      </w:r>
-      <w:r>
-        <w:rPr>
-          <w:sz w:val="24"/>
-          <w:szCs w:val="24"/>
-        </w:rPr>
-        <w:t xml:space="preserve">Equation </w:t>
-      </w:r>
-      <w:r>
-        <w:rPr>
-          <w:sz w:val="24"/>
-          <w:szCs w:val="24"/>
-        </w:rPr>
-        <w:t>1) for example with the formula example shown slightly indented and with the formula number to the far right.</w:t>
-      </w:r>
-    </w:p>
-    <w:p>
-      <w:pPr>
-        <w:pStyle w:val="ListParagraph"/>
-        <w:tabs>
-          <w:tab w:val="left" w:pos="6439"/>
-        </w:tabs>
-        <w:spacing w:after="0" w:line="360" w:lineRule="auto"/>
-        <w:ind w:left="792"/>
-        <w:jc w:val="both"/>
-        <w:rPr>
-          <w:sz w:val="24"/>
-          <w:szCs w:val="24"/>
-        </w:rPr>
-      </w:pPr>
-      <w:r>
-        <w:rPr>
-          <w:sz w:val="24"/>
-          <w:szCs w:val="24"/>
-        </w:rPr>
-        <w:tab/>
-      </w:r>
-    </w:p>
-    <w:p>
-      <w:pPr>
-        <w:pStyle w:val="Caption"/>
-        <w:jc w:val="both"/>
-      </w:pPr>
-      <w:r>
-        <w:t xml:space="preserve">Equation </w:t>
-      </w:r>
-      <w:r>
-        <w:rPr>
-          <w:noProof/>
-        </w:rPr>
-        <w:fldChar w:fldCharType="begin"/>
-      </w:r>
-      <w:r>
-        <w:rPr>
-          <w:noProof/>
-        </w:rPr>
-        <w:instrText xml:space="preserve"> SEQ Equation \* ARABIC </w:instrText>
-      </w:r>
-      <w:r>
-        <w:rPr>
-          <w:noProof/>
-        </w:rPr>
-        <w:fldChar w:fldCharType="separate"/>
-      </w:r>
-      <w:r>
-        <w:rPr>
-          <w:noProof/>
-        </w:rPr>
-        <w:t>1</w:t>
-      </w:r>
-      <w:r>
-        <w:rPr>
-          <w:noProof/>
-        </w:rPr>
-        <w:fldChar w:fldCharType="end"/>
-      </w:r>
-    </w:p>
-    <w:p>
-      <w:pPr>
-        <w:pStyle w:val="ListParagraph"/>
-        <w:tabs>
-          <w:tab w:val="right" w:pos="9026"/>
-        </w:tabs>
-        <w:spacing w:after="0" w:line="360" w:lineRule="auto"/>
-        <w:ind w:left="1701"/>
-        <w:jc w:val="both"/>
-        <w:rPr>
-          <w:sz w:val="24"/>
-          <w:szCs w:val="24"/>
-        </w:rPr>
-      </w:pPr>
-      <m:oMath>
-        <m:r>
-          <w:rPr>
-            <w:rFonts w:ascii="Cambria Math" w:hAnsi="Cambria Math"/>
-            <w:sz w:val="28"/>
-            <w:szCs w:val="24"/>
-          </w:rPr>
-          <m:t>∆v=</m:t>
-        </m:r>
-        <m:sSub>
-          <m:sSubPr>
-            <m:ctrlPr>
-              <w:rPr>
-                <w:rFonts w:ascii="Cambria Math" w:hAnsi="Cambria Math"/>
-                <w:i/>
-                <w:sz w:val="28"/>
-                <w:szCs w:val="24"/>
-              </w:rPr>
-            </m:ctrlPr>
-          </m:sSubPr>
-          <m:e>
-            <m:r>
-              <w:rPr>
-                <w:rFonts w:ascii="Cambria Math" w:hAnsi="Cambria Math"/>
-                <w:sz w:val="28"/>
-                <w:szCs w:val="24"/>
-              </w:rPr>
-              <m:t>v</m:t>
-            </m:r>
-          </m:e>
-          <m:sub>
-            <m:r>
-              <w:rPr>
-                <w:rFonts w:ascii="Cambria Math" w:hAnsi="Cambria Math"/>
-                <w:sz w:val="28"/>
-                <w:szCs w:val="24"/>
-              </w:rPr>
-              <m:t>e</m:t>
-            </m:r>
-          </m:sub>
-        </m:sSub>
-        <m:r>
-          <w:rPr>
-            <w:rFonts w:ascii="Cambria Math" w:hAnsi="Cambria Math"/>
-            <w:sz w:val="28"/>
-            <w:szCs w:val="24"/>
-          </w:rPr>
-          <m:t>ln</m:t>
-        </m:r>
-        <m:f>
-          <m:fPr>
-            <m:ctrlPr>
-              <w:rPr>
-                <w:rFonts w:ascii="Cambria Math" w:hAnsi="Cambria Math"/>
-                <w:i/>
-                <w:sz w:val="28"/>
-                <w:szCs w:val="24"/>
-              </w:rPr>
-            </m:ctrlPr>
-          </m:fPr>
-          <m:num>
-            <m:sSub>
-              <m:sSubPr>
-                <m:ctrlPr>
-                  <w:rPr>
-                    <w:rFonts w:ascii="Cambria Math" w:hAnsi="Cambria Math"/>
-                    <w:i/>
-                    <w:sz w:val="28"/>
-                    <w:szCs w:val="24"/>
-                  </w:rPr>
-                </m:ctrlPr>
-              </m:sSubPr>
-              <m:e>
-                <m:r>
-                  <w:rPr>
-                    <w:rFonts w:ascii="Cambria Math" w:hAnsi="Cambria Math"/>
-                    <w:sz w:val="28"/>
-                    <w:szCs w:val="24"/>
-                  </w:rPr>
-                  <m:t>m</m:t>
-                </m:r>
-              </m:e>
-              <m:sub>
-                <m:r>
-                  <w:rPr>
-                    <w:rFonts w:ascii="Cambria Math" w:hAnsi="Cambria Math"/>
-                    <w:sz w:val="28"/>
-                    <w:szCs w:val="24"/>
-                  </w:rPr>
-                  <m:t>0</m:t>
-                </m:r>
-              </m:sub>
-            </m:sSub>
-          </m:num>
-          <m:den>
-            <m:sSub>
-              <m:sSubPr>
-                <m:ctrlPr>
-                  <w:rPr>
-                    <w:rFonts w:ascii="Cambria Math" w:hAnsi="Cambria Math"/>
-                    <w:i/>
-                    <w:sz w:val="28"/>
-                    <w:szCs w:val="24"/>
-                  </w:rPr>
-                </m:ctrlPr>
-              </m:sSubPr>
-              <m:e>
-                <m:r>
-                  <w:rPr>
-                    <w:rFonts w:ascii="Cambria Math" w:hAnsi="Cambria Math"/>
-                    <w:sz w:val="28"/>
-                    <w:szCs w:val="24"/>
-                  </w:rPr>
-                  <m:t>m</m:t>
-                </m:r>
-              </m:e>
-              <m:sub>
-                <m:r>
-                  <w:rPr>
-                    <w:rFonts w:ascii="Cambria Math" w:hAnsi="Cambria Math"/>
-                    <w:sz w:val="28"/>
-                    <w:szCs w:val="24"/>
-                  </w:rPr>
-                  <m:t>1</m:t>
-                </m:r>
-              </m:sub>
-            </m:sSub>
-          </m:den>
-        </m:f>
-      </m:oMath>
-      <w:r>
-        <w:rPr>
-          <w:sz w:val="24"/>
-          <w:szCs w:val="24"/>
-        </w:rPr>
-        <w:tab/>
-      </w:r>
-    </w:p>
-    <w:p>
-      <w:pPr>
-        <w:pStyle w:val="ListParagraph"/>
-        <w:spacing w:after="0" w:line="360" w:lineRule="auto"/>
-        <w:ind w:left="792"/>
-        <w:jc w:val="both"/>
-        <w:rPr>
-          <w:sz w:val="24"/>
-          <w:szCs w:val="24"/>
-        </w:rPr>
-      </w:pPr>
-    </w:p>
-    <w:p>
-      <w:pPr>
-        <w:spacing w:after="0" w:line="360" w:lineRule="auto"/>
-        <w:jc w:val="both"/>
-        <w:rPr>
-          <w:sz w:val="24"/>
-          <w:szCs w:val="24"/>
-        </w:rPr>
-      </w:pPr>
-      <w:r>
-        <w:rPr>
-          <w:sz w:val="24"/>
-          <w:szCs w:val="24"/>
-        </w:rPr>
-        <w:t>A single line space above and below the formula (Tsiolkovsky, 2000) also aids legibility. Note also that the font size</w:t>
-      </w:r>
-      <w:r>
-        <w:rPr>
-          <w:sz w:val="24"/>
-          <w:szCs w:val="24"/>
-        </w:rPr>
-        <w:t xml:space="preserve"> is increased</w:t>
-      </w:r>
-      <w:r>
-        <w:rPr>
-          <w:sz w:val="24"/>
-          <w:szCs w:val="24"/>
-        </w:rPr>
-        <w:t xml:space="preserve"> by one point. A further item to note is that equations may also be referenced.</w:t>
-      </w:r>
-    </w:p>
-    <w:p>
-      <w:pPr>
-        <w:pStyle w:val="ListParagraph"/>
-        <w:spacing w:after="0" w:line="360" w:lineRule="auto"/>
-        <w:ind w:left="792"/>
-        <w:jc w:val="both"/>
-        <w:rPr>
-          <w:sz w:val="24"/>
-          <w:szCs w:val="24"/>
-        </w:rPr>
-      </w:pPr>
-    </w:p>
-    <w:p>
-      <w:pPr>
-        <w:pStyle w:val="ListParagraph"/>
-        <w:spacing w:after="0" w:line="360" w:lineRule="auto"/>
-        <w:ind w:left="792"/>
-        <w:jc w:val="both"/>
-        <w:rPr>
-          <w:sz w:val="24"/>
-          <w:szCs w:val="24"/>
-        </w:rPr>
-      </w:pPr>
-    </w:p>
-    <w:p>
-      <w:pPr>
-        <w:spacing w:after="0" w:line="360" w:lineRule="auto"/>
-        <w:jc w:val="both"/>
-        <w:rPr>
-          <w:sz w:val="24"/>
-          <w:szCs w:val="24"/>
-        </w:rPr>
-      </w:pPr>
-      <w:r>
-        <w:rPr>
-          <w:sz w:val="24"/>
-          <w:szCs w:val="24"/>
-        </w:rPr>
         <w:br w:type="page"/>
       </w:r>
     </w:p>
@@ -5303,7 +3312,7 @@
       <w:pPr>
         <w:ind w:left="1701" w:hanging="1701"/>
         <w:sectPr>
-          <w:footerReference w:type="default" r:id="rId12"/>
+          <w:footerReference w:type="default" r:id="rId10"/>
           <w:pgSz w:w="11906" w:h="16838"/>
           <w:pgMar w:top="1440" w:right="1440" w:bottom="1440" w:left="1440" w:header="708" w:footer="708" w:gutter="0"/>
           <w:pgNumType w:start="1"/>
@@ -5318,14 +3327,14 @@
         <w:spacing w:before="0" w:line="360" w:lineRule="auto"/>
         <w:ind w:left="567" w:hanging="567"/>
       </w:pPr>
-      <w:bookmarkStart w:id="24" w:name="_Toc101374253"/>
-      <w:bookmarkStart w:id="25" w:name="_Toc193990932"/>
+      <w:bookmarkStart w:id="10" w:name="_Toc101374253"/>
+      <w:bookmarkStart w:id="11" w:name="_Toc216371233"/>
       <w:r>
         <w:lastRenderedPageBreak/>
         <w:t>References</w:t>
       </w:r>
-      <w:bookmarkEnd w:id="24"/>
-      <w:bookmarkEnd w:id="25"/>
+      <w:bookmarkEnd w:id="10"/>
+      <w:bookmarkEnd w:id="11"/>
     </w:p>
     <w:p>
       <w:pPr>
@@ -5413,23 +3422,7 @@
           <w:sz w:val="24"/>
           <w:szCs w:val="24"/>
         </w:rPr>
-        <w:t xml:space="preserve">a), Another Article, Proceedings of </w:t>
-      </w:r>
-      <w:proofErr w:type="gramStart"/>
-      <w:r>
-        <w:rPr>
-          <w:sz w:val="24"/>
-          <w:szCs w:val="24"/>
-        </w:rPr>
-        <w:t>The</w:t>
-      </w:r>
-      <w:proofErr w:type="gramEnd"/>
-      <w:r>
-        <w:rPr>
-          <w:sz w:val="24"/>
-          <w:szCs w:val="24"/>
-        </w:rPr>
-        <w:t xml:space="preserve"> 5th Conference on Computing, ACM, Paris, pp. 123-132.</w:t>
+        <w:t>a), Another Article, Proceedings of The 5th Conference on Computing, ACM, Paris, pp. 123-132.</w:t>
       </w:r>
     </w:p>
     <w:p>
@@ -5522,12 +3515,12 @@
       <w:pPr>
         <w:pStyle w:val="Heading1"/>
       </w:pPr>
-      <w:bookmarkStart w:id="26" w:name="_Toc193990933"/>
+      <w:bookmarkStart w:id="12" w:name="_Toc216371234"/>
       <w:r>
         <w:lastRenderedPageBreak/>
         <w:t>Appendix A: Report Structure Example</w:t>
       </w:r>
-      <w:bookmarkEnd w:id="26"/>
+      <w:bookmarkEnd w:id="12"/>
     </w:p>
     <w:p/>
     <w:p>
@@ -6246,8 +4239,8 @@
       <w:pPr>
         <w:pStyle w:val="Heading1"/>
       </w:pPr>
-      <w:bookmarkStart w:id="27" w:name="_Toc101374255"/>
-      <w:bookmarkStart w:id="28" w:name="_Toc193990934"/>
+      <w:bookmarkStart w:id="13" w:name="_Toc101374255"/>
+      <w:bookmarkStart w:id="14" w:name="_Toc216371235"/>
       <w:r>
         <w:lastRenderedPageBreak/>
         <w:t xml:space="preserve">Appendix </w:t>
@@ -6258,11 +4251,11 @@
       <w:r>
         <w:t>:  Code Listing</w:t>
       </w:r>
-      <w:bookmarkEnd w:id="27"/>
+      <w:bookmarkEnd w:id="13"/>
       <w:r>
         <w:t xml:space="preserve"> / GitHub Project Link</w:t>
       </w:r>
-      <w:bookmarkEnd w:id="28"/>
+      <w:bookmarkEnd w:id="14"/>
     </w:p>
     <w:p>
       <w:pPr>
@@ -6271,7 +4264,7 @@
     </w:p>
     <w:p/>
     <w:sectPr>
-      <w:footerReference w:type="default" r:id="rId13"/>
+      <w:footerReference w:type="default" r:id="rId11"/>
       <w:pgSz w:w="11906" w:h="16838"/>
       <w:pgMar w:top="1440" w:right="1440" w:bottom="1440" w:left="1440" w:header="708" w:footer="708" w:gutter="0"/>
       <w:pgNumType w:fmt="lowerRoman" w:start="1"/>
@@ -7361,6 +5354,119 @@
     </w:lvl>
   </w:abstractNum>
   <w:abstractNum w:abstractNumId="8" w15:restartNumberingAfterBreak="0">
+    <w:nsid w:val="292E78DF"/>
+    <w:multiLevelType w:val="multilevel"/>
+    <w:tmpl w:val="C3D20C84"/>
+    <w:lvl w:ilvl="0">
+      <w:start w:val="3"/>
+      <w:numFmt w:val="decimal"/>
+      <w:lvlText w:val="%1"/>
+      <w:lvlJc w:val="left"/>
+      <w:pPr>
+        <w:ind w:left="410" w:hanging="410"/>
+      </w:pPr>
+      <w:rPr>
+        <w:rFonts w:hint="default"/>
+      </w:rPr>
+    </w:lvl>
+    <w:lvl w:ilvl="1">
+      <w:start w:val="3"/>
+      <w:numFmt w:val="decimal"/>
+      <w:lvlText w:val="%1.%2"/>
+      <w:lvlJc w:val="left"/>
+      <w:pPr>
+        <w:ind w:left="1080" w:hanging="720"/>
+      </w:pPr>
+      <w:rPr>
+        <w:rFonts w:hint="default"/>
+      </w:rPr>
+    </w:lvl>
+    <w:lvl w:ilvl="2">
+      <w:start w:val="1"/>
+      <w:numFmt w:val="decimal"/>
+      <w:lvlText w:val="%1.%2.%3"/>
+      <w:lvlJc w:val="left"/>
+      <w:pPr>
+        <w:ind w:left="1440" w:hanging="720"/>
+      </w:pPr>
+      <w:rPr>
+        <w:rFonts w:hint="default"/>
+      </w:rPr>
+    </w:lvl>
+    <w:lvl w:ilvl="3">
+      <w:start w:val="1"/>
+      <w:numFmt w:val="decimal"/>
+      <w:lvlText w:val="%1.%2.%3.%4"/>
+      <w:lvlJc w:val="left"/>
+      <w:pPr>
+        <w:ind w:left="2160" w:hanging="1080"/>
+      </w:pPr>
+      <w:rPr>
+        <w:rFonts w:hint="default"/>
+      </w:rPr>
+    </w:lvl>
+    <w:lvl w:ilvl="4">
+      <w:start w:val="1"/>
+      <w:numFmt w:val="decimal"/>
+      <w:lvlText w:val="%1.%2.%3.%4.%5"/>
+      <w:lvlJc w:val="left"/>
+      <w:pPr>
+        <w:ind w:left="2880" w:hanging="1440"/>
+      </w:pPr>
+      <w:rPr>
+        <w:rFonts w:hint="default"/>
+      </w:rPr>
+    </w:lvl>
+    <w:lvl w:ilvl="5">
+      <w:start w:val="1"/>
+      <w:numFmt w:val="decimal"/>
+      <w:lvlText w:val="%1.%2.%3.%4.%5.%6"/>
+      <w:lvlJc w:val="left"/>
+      <w:pPr>
+        <w:ind w:left="3240" w:hanging="1440"/>
+      </w:pPr>
+      <w:rPr>
+        <w:rFonts w:hint="default"/>
+      </w:rPr>
+    </w:lvl>
+    <w:lvl w:ilvl="6">
+      <w:start w:val="1"/>
+      <w:numFmt w:val="decimal"/>
+      <w:lvlText w:val="%1.%2.%3.%4.%5.%6.%7"/>
+      <w:lvlJc w:val="left"/>
+      <w:pPr>
+        <w:ind w:left="3960" w:hanging="1800"/>
+      </w:pPr>
+      <w:rPr>
+        <w:rFonts w:hint="default"/>
+      </w:rPr>
+    </w:lvl>
+    <w:lvl w:ilvl="7">
+      <w:start w:val="1"/>
+      <w:numFmt w:val="decimal"/>
+      <w:lvlText w:val="%1.%2.%3.%4.%5.%6.%7.%8"/>
+      <w:lvlJc w:val="left"/>
+      <w:pPr>
+        <w:ind w:left="4680" w:hanging="2160"/>
+      </w:pPr>
+      <w:rPr>
+        <w:rFonts w:hint="default"/>
+      </w:rPr>
+    </w:lvl>
+    <w:lvl w:ilvl="8">
+      <w:start w:val="1"/>
+      <w:numFmt w:val="decimal"/>
+      <w:lvlText w:val="%1.%2.%3.%4.%5.%6.%7.%8.%9"/>
+      <w:lvlJc w:val="left"/>
+      <w:pPr>
+        <w:ind w:left="5040" w:hanging="2160"/>
+      </w:pPr>
+      <w:rPr>
+        <w:rFonts w:hint="default"/>
+      </w:rPr>
+    </w:lvl>
+  </w:abstractNum>
+  <w:abstractNum w:abstractNumId="9" w15:restartNumberingAfterBreak="0">
     <w:nsid w:val="2B3B2E35"/>
     <w:multiLevelType w:val="multilevel"/>
     <w:tmpl w:val="C0A88470"/>
@@ -7509,7 +5615,233 @@
       </w:rPr>
     </w:lvl>
   </w:abstractNum>
-  <w:abstractNum w:abstractNumId="9" w15:restartNumberingAfterBreak="0">
+  <w:abstractNum w:abstractNumId="10" w15:restartNumberingAfterBreak="0">
+    <w:nsid w:val="2E745C02"/>
+    <w:multiLevelType w:val="hybridMultilevel"/>
+    <w:tmpl w:val="34F62234"/>
+    <w:lvl w:ilvl="0" w:tplc="18090001">
+      <w:start w:val="1"/>
+      <w:numFmt w:val="bullet"/>
+      <w:lvlText w:val=""/>
+      <w:lvlJc w:val="left"/>
+      <w:pPr>
+        <w:ind w:left="720" w:hanging="360"/>
+      </w:pPr>
+      <w:rPr>
+        <w:rFonts w:ascii="Symbol" w:hAnsi="Symbol" w:hint="default"/>
+      </w:rPr>
+    </w:lvl>
+    <w:lvl w:ilvl="1" w:tplc="18090003" w:tentative="1">
+      <w:start w:val="1"/>
+      <w:numFmt w:val="bullet"/>
+      <w:lvlText w:val="o"/>
+      <w:lvlJc w:val="left"/>
+      <w:pPr>
+        <w:ind w:left="1440" w:hanging="360"/>
+      </w:pPr>
+      <w:rPr>
+        <w:rFonts w:ascii="Courier New" w:hAnsi="Courier New" w:cs="Courier New" w:hint="default"/>
+      </w:rPr>
+    </w:lvl>
+    <w:lvl w:ilvl="2" w:tplc="18090005" w:tentative="1">
+      <w:start w:val="1"/>
+      <w:numFmt w:val="bullet"/>
+      <w:lvlText w:val=""/>
+      <w:lvlJc w:val="left"/>
+      <w:pPr>
+        <w:ind w:left="2160" w:hanging="360"/>
+      </w:pPr>
+      <w:rPr>
+        <w:rFonts w:ascii="Wingdings" w:hAnsi="Wingdings" w:hint="default"/>
+      </w:rPr>
+    </w:lvl>
+    <w:lvl w:ilvl="3" w:tplc="18090001" w:tentative="1">
+      <w:start w:val="1"/>
+      <w:numFmt w:val="bullet"/>
+      <w:lvlText w:val=""/>
+      <w:lvlJc w:val="left"/>
+      <w:pPr>
+        <w:ind w:left="2880" w:hanging="360"/>
+      </w:pPr>
+      <w:rPr>
+        <w:rFonts w:ascii="Symbol" w:hAnsi="Symbol" w:hint="default"/>
+      </w:rPr>
+    </w:lvl>
+    <w:lvl w:ilvl="4" w:tplc="18090003" w:tentative="1">
+      <w:start w:val="1"/>
+      <w:numFmt w:val="bullet"/>
+      <w:lvlText w:val="o"/>
+      <w:lvlJc w:val="left"/>
+      <w:pPr>
+        <w:ind w:left="3600" w:hanging="360"/>
+      </w:pPr>
+      <w:rPr>
+        <w:rFonts w:ascii="Courier New" w:hAnsi="Courier New" w:cs="Courier New" w:hint="default"/>
+      </w:rPr>
+    </w:lvl>
+    <w:lvl w:ilvl="5" w:tplc="18090005" w:tentative="1">
+      <w:start w:val="1"/>
+      <w:numFmt w:val="bullet"/>
+      <w:lvlText w:val=""/>
+      <w:lvlJc w:val="left"/>
+      <w:pPr>
+        <w:ind w:left="4320" w:hanging="360"/>
+      </w:pPr>
+      <w:rPr>
+        <w:rFonts w:ascii="Wingdings" w:hAnsi="Wingdings" w:hint="default"/>
+      </w:rPr>
+    </w:lvl>
+    <w:lvl w:ilvl="6" w:tplc="18090001" w:tentative="1">
+      <w:start w:val="1"/>
+      <w:numFmt w:val="bullet"/>
+      <w:lvlText w:val=""/>
+      <w:lvlJc w:val="left"/>
+      <w:pPr>
+        <w:ind w:left="5040" w:hanging="360"/>
+      </w:pPr>
+      <w:rPr>
+        <w:rFonts w:ascii="Symbol" w:hAnsi="Symbol" w:hint="default"/>
+      </w:rPr>
+    </w:lvl>
+    <w:lvl w:ilvl="7" w:tplc="18090003" w:tentative="1">
+      <w:start w:val="1"/>
+      <w:numFmt w:val="bullet"/>
+      <w:lvlText w:val="o"/>
+      <w:lvlJc w:val="left"/>
+      <w:pPr>
+        <w:ind w:left="5760" w:hanging="360"/>
+      </w:pPr>
+      <w:rPr>
+        <w:rFonts w:ascii="Courier New" w:hAnsi="Courier New" w:cs="Courier New" w:hint="default"/>
+      </w:rPr>
+    </w:lvl>
+    <w:lvl w:ilvl="8" w:tplc="18090005" w:tentative="1">
+      <w:start w:val="1"/>
+      <w:numFmt w:val="bullet"/>
+      <w:lvlText w:val=""/>
+      <w:lvlJc w:val="left"/>
+      <w:pPr>
+        <w:ind w:left="6480" w:hanging="360"/>
+      </w:pPr>
+      <w:rPr>
+        <w:rFonts w:ascii="Wingdings" w:hAnsi="Wingdings" w:hint="default"/>
+      </w:rPr>
+    </w:lvl>
+  </w:abstractNum>
+  <w:abstractNum w:abstractNumId="11" w15:restartNumberingAfterBreak="0">
+    <w:nsid w:val="2FEE6E93"/>
+    <w:multiLevelType w:val="hybridMultilevel"/>
+    <w:tmpl w:val="9CB67FC2"/>
+    <w:lvl w:ilvl="0" w:tplc="18090001">
+      <w:start w:val="1"/>
+      <w:numFmt w:val="bullet"/>
+      <w:lvlText w:val=""/>
+      <w:lvlJc w:val="left"/>
+      <w:pPr>
+        <w:ind w:left="720" w:hanging="360"/>
+      </w:pPr>
+      <w:rPr>
+        <w:rFonts w:ascii="Symbol" w:hAnsi="Symbol" w:hint="default"/>
+      </w:rPr>
+    </w:lvl>
+    <w:lvl w:ilvl="1" w:tplc="18090003" w:tentative="1">
+      <w:start w:val="1"/>
+      <w:numFmt w:val="bullet"/>
+      <w:lvlText w:val="o"/>
+      <w:lvlJc w:val="left"/>
+      <w:pPr>
+        <w:ind w:left="1440" w:hanging="360"/>
+      </w:pPr>
+      <w:rPr>
+        <w:rFonts w:ascii="Courier New" w:hAnsi="Courier New" w:cs="Courier New" w:hint="default"/>
+      </w:rPr>
+    </w:lvl>
+    <w:lvl w:ilvl="2" w:tplc="18090005" w:tentative="1">
+      <w:start w:val="1"/>
+      <w:numFmt w:val="bullet"/>
+      <w:lvlText w:val=""/>
+      <w:lvlJc w:val="left"/>
+      <w:pPr>
+        <w:ind w:left="2160" w:hanging="360"/>
+      </w:pPr>
+      <w:rPr>
+        <w:rFonts w:ascii="Wingdings" w:hAnsi="Wingdings" w:hint="default"/>
+      </w:rPr>
+    </w:lvl>
+    <w:lvl w:ilvl="3" w:tplc="18090001" w:tentative="1">
+      <w:start w:val="1"/>
+      <w:numFmt w:val="bullet"/>
+      <w:lvlText w:val=""/>
+      <w:lvlJc w:val="left"/>
+      <w:pPr>
+        <w:ind w:left="2880" w:hanging="360"/>
+      </w:pPr>
+      <w:rPr>
+        <w:rFonts w:ascii="Symbol" w:hAnsi="Symbol" w:hint="default"/>
+      </w:rPr>
+    </w:lvl>
+    <w:lvl w:ilvl="4" w:tplc="18090003" w:tentative="1">
+      <w:start w:val="1"/>
+      <w:numFmt w:val="bullet"/>
+      <w:lvlText w:val="o"/>
+      <w:lvlJc w:val="left"/>
+      <w:pPr>
+        <w:ind w:left="3600" w:hanging="360"/>
+      </w:pPr>
+      <w:rPr>
+        <w:rFonts w:ascii="Courier New" w:hAnsi="Courier New" w:cs="Courier New" w:hint="default"/>
+      </w:rPr>
+    </w:lvl>
+    <w:lvl w:ilvl="5" w:tplc="18090005" w:tentative="1">
+      <w:start w:val="1"/>
+      <w:numFmt w:val="bullet"/>
+      <w:lvlText w:val=""/>
+      <w:lvlJc w:val="left"/>
+      <w:pPr>
+        <w:ind w:left="4320" w:hanging="360"/>
+      </w:pPr>
+      <w:rPr>
+        <w:rFonts w:ascii="Wingdings" w:hAnsi="Wingdings" w:hint="default"/>
+      </w:rPr>
+    </w:lvl>
+    <w:lvl w:ilvl="6" w:tplc="18090001" w:tentative="1">
+      <w:start w:val="1"/>
+      <w:numFmt w:val="bullet"/>
+      <w:lvlText w:val=""/>
+      <w:lvlJc w:val="left"/>
+      <w:pPr>
+        <w:ind w:left="5040" w:hanging="360"/>
+      </w:pPr>
+      <w:rPr>
+        <w:rFonts w:ascii="Symbol" w:hAnsi="Symbol" w:hint="default"/>
+      </w:rPr>
+    </w:lvl>
+    <w:lvl w:ilvl="7" w:tplc="18090003" w:tentative="1">
+      <w:start w:val="1"/>
+      <w:numFmt w:val="bullet"/>
+      <w:lvlText w:val="o"/>
+      <w:lvlJc w:val="left"/>
+      <w:pPr>
+        <w:ind w:left="5760" w:hanging="360"/>
+      </w:pPr>
+      <w:rPr>
+        <w:rFonts w:ascii="Courier New" w:hAnsi="Courier New" w:cs="Courier New" w:hint="default"/>
+      </w:rPr>
+    </w:lvl>
+    <w:lvl w:ilvl="8" w:tplc="18090005" w:tentative="1">
+      <w:start w:val="1"/>
+      <w:numFmt w:val="bullet"/>
+      <w:lvlText w:val=""/>
+      <w:lvlJc w:val="left"/>
+      <w:pPr>
+        <w:ind w:left="6480" w:hanging="360"/>
+      </w:pPr>
+      <w:rPr>
+        <w:rFonts w:ascii="Wingdings" w:hAnsi="Wingdings" w:hint="default"/>
+      </w:rPr>
+    </w:lvl>
+  </w:abstractNum>
+  <w:abstractNum w:abstractNumId="12" w15:restartNumberingAfterBreak="0">
     <w:nsid w:val="31C20F72"/>
     <w:multiLevelType w:val="multilevel"/>
     <w:tmpl w:val="42A63998"/>
@@ -7622,7 +5954,7 @@
       </w:rPr>
     </w:lvl>
   </w:abstractNum>
-  <w:abstractNum w:abstractNumId="10" w15:restartNumberingAfterBreak="0">
+  <w:abstractNum w:abstractNumId="13" w15:restartNumberingAfterBreak="0">
     <w:nsid w:val="387E67BF"/>
     <w:multiLevelType w:val="hybridMultilevel"/>
     <w:tmpl w:val="9D3A5CA4"/>
@@ -7735,7 +6067,7 @@
       </w:rPr>
     </w:lvl>
   </w:abstractNum>
-  <w:abstractNum w:abstractNumId="11" w15:restartNumberingAfterBreak="0">
+  <w:abstractNum w:abstractNumId="14" w15:restartNumberingAfterBreak="0">
     <w:nsid w:val="3C27653E"/>
     <w:multiLevelType w:val="multilevel"/>
     <w:tmpl w:val="1809001F"/>
@@ -7821,7 +6153,7 @@
       </w:pPr>
     </w:lvl>
   </w:abstractNum>
-  <w:abstractNum w:abstractNumId="12" w15:restartNumberingAfterBreak="0">
+  <w:abstractNum w:abstractNumId="15" w15:restartNumberingAfterBreak="0">
     <w:nsid w:val="400839C3"/>
     <w:multiLevelType w:val="multilevel"/>
     <w:tmpl w:val="4E98AE18"/>
@@ -7970,7 +6302,7 @@
       </w:rPr>
     </w:lvl>
   </w:abstractNum>
-  <w:abstractNum w:abstractNumId="13" w15:restartNumberingAfterBreak="0">
+  <w:abstractNum w:abstractNumId="16" w15:restartNumberingAfterBreak="0">
     <w:nsid w:val="425E5319"/>
     <w:multiLevelType w:val="hybridMultilevel"/>
     <w:tmpl w:val="573AE2DC"/>
@@ -8083,7 +6415,7 @@
       </w:rPr>
     </w:lvl>
   </w:abstractNum>
-  <w:abstractNum w:abstractNumId="14" w15:restartNumberingAfterBreak="0">
+  <w:abstractNum w:abstractNumId="17" w15:restartNumberingAfterBreak="0">
     <w:nsid w:val="43A432CC"/>
     <w:multiLevelType w:val="hybridMultilevel"/>
     <w:tmpl w:val="4C386A08"/>
@@ -8195,7 +6527,7 @@
       </w:rPr>
     </w:lvl>
   </w:abstractNum>
-  <w:abstractNum w:abstractNumId="15" w15:restartNumberingAfterBreak="0">
+  <w:abstractNum w:abstractNumId="18" w15:restartNumberingAfterBreak="0">
     <w:nsid w:val="483F539D"/>
     <w:multiLevelType w:val="multilevel"/>
     <w:tmpl w:val="1809001F"/>
@@ -8281,7 +6613,120 @@
       </w:pPr>
     </w:lvl>
   </w:abstractNum>
-  <w:abstractNum w:abstractNumId="16" w15:restartNumberingAfterBreak="0">
+  <w:abstractNum w:abstractNumId="19" w15:restartNumberingAfterBreak="0">
+    <w:nsid w:val="517B15A5"/>
+    <w:multiLevelType w:val="hybridMultilevel"/>
+    <w:tmpl w:val="24D2F4E4"/>
+    <w:lvl w:ilvl="0" w:tplc="18090001">
+      <w:start w:val="1"/>
+      <w:numFmt w:val="bullet"/>
+      <w:lvlText w:val=""/>
+      <w:lvlJc w:val="left"/>
+      <w:pPr>
+        <w:ind w:left="720" w:hanging="360"/>
+      </w:pPr>
+      <w:rPr>
+        <w:rFonts w:ascii="Symbol" w:hAnsi="Symbol" w:hint="default"/>
+      </w:rPr>
+    </w:lvl>
+    <w:lvl w:ilvl="1" w:tplc="18090003" w:tentative="1">
+      <w:start w:val="1"/>
+      <w:numFmt w:val="bullet"/>
+      <w:lvlText w:val="o"/>
+      <w:lvlJc w:val="left"/>
+      <w:pPr>
+        <w:ind w:left="1440" w:hanging="360"/>
+      </w:pPr>
+      <w:rPr>
+        <w:rFonts w:ascii="Courier New" w:hAnsi="Courier New" w:cs="Courier New" w:hint="default"/>
+      </w:rPr>
+    </w:lvl>
+    <w:lvl w:ilvl="2" w:tplc="18090005" w:tentative="1">
+      <w:start w:val="1"/>
+      <w:numFmt w:val="bullet"/>
+      <w:lvlText w:val=""/>
+      <w:lvlJc w:val="left"/>
+      <w:pPr>
+        <w:ind w:left="2160" w:hanging="360"/>
+      </w:pPr>
+      <w:rPr>
+        <w:rFonts w:ascii="Wingdings" w:hAnsi="Wingdings" w:hint="default"/>
+      </w:rPr>
+    </w:lvl>
+    <w:lvl w:ilvl="3" w:tplc="18090001" w:tentative="1">
+      <w:start w:val="1"/>
+      <w:numFmt w:val="bullet"/>
+      <w:lvlText w:val=""/>
+      <w:lvlJc w:val="left"/>
+      <w:pPr>
+        <w:ind w:left="2880" w:hanging="360"/>
+      </w:pPr>
+      <w:rPr>
+        <w:rFonts w:ascii="Symbol" w:hAnsi="Symbol" w:hint="default"/>
+      </w:rPr>
+    </w:lvl>
+    <w:lvl w:ilvl="4" w:tplc="18090003" w:tentative="1">
+      <w:start w:val="1"/>
+      <w:numFmt w:val="bullet"/>
+      <w:lvlText w:val="o"/>
+      <w:lvlJc w:val="left"/>
+      <w:pPr>
+        <w:ind w:left="3600" w:hanging="360"/>
+      </w:pPr>
+      <w:rPr>
+        <w:rFonts w:ascii="Courier New" w:hAnsi="Courier New" w:cs="Courier New" w:hint="default"/>
+      </w:rPr>
+    </w:lvl>
+    <w:lvl w:ilvl="5" w:tplc="18090005" w:tentative="1">
+      <w:start w:val="1"/>
+      <w:numFmt w:val="bullet"/>
+      <w:lvlText w:val=""/>
+      <w:lvlJc w:val="left"/>
+      <w:pPr>
+        <w:ind w:left="4320" w:hanging="360"/>
+      </w:pPr>
+      <w:rPr>
+        <w:rFonts w:ascii="Wingdings" w:hAnsi="Wingdings" w:hint="default"/>
+      </w:rPr>
+    </w:lvl>
+    <w:lvl w:ilvl="6" w:tplc="18090001" w:tentative="1">
+      <w:start w:val="1"/>
+      <w:numFmt w:val="bullet"/>
+      <w:lvlText w:val=""/>
+      <w:lvlJc w:val="left"/>
+      <w:pPr>
+        <w:ind w:left="5040" w:hanging="360"/>
+      </w:pPr>
+      <w:rPr>
+        <w:rFonts w:ascii="Symbol" w:hAnsi="Symbol" w:hint="default"/>
+      </w:rPr>
+    </w:lvl>
+    <w:lvl w:ilvl="7" w:tplc="18090003" w:tentative="1">
+      <w:start w:val="1"/>
+      <w:numFmt w:val="bullet"/>
+      <w:lvlText w:val="o"/>
+      <w:lvlJc w:val="left"/>
+      <w:pPr>
+        <w:ind w:left="5760" w:hanging="360"/>
+      </w:pPr>
+      <w:rPr>
+        <w:rFonts w:ascii="Courier New" w:hAnsi="Courier New" w:cs="Courier New" w:hint="default"/>
+      </w:rPr>
+    </w:lvl>
+    <w:lvl w:ilvl="8" w:tplc="18090005" w:tentative="1">
+      <w:start w:val="1"/>
+      <w:numFmt w:val="bullet"/>
+      <w:lvlText w:val=""/>
+      <w:lvlJc w:val="left"/>
+      <w:pPr>
+        <w:ind w:left="6480" w:hanging="360"/>
+      </w:pPr>
+      <w:rPr>
+        <w:rFonts w:ascii="Wingdings" w:hAnsi="Wingdings" w:hint="default"/>
+      </w:rPr>
+    </w:lvl>
+  </w:abstractNum>
+  <w:abstractNum w:abstractNumId="20" w15:restartNumberingAfterBreak="0">
     <w:nsid w:val="546864F5"/>
     <w:multiLevelType w:val="hybridMultilevel"/>
     <w:tmpl w:val="0FC4495C"/>
@@ -8393,7 +6838,7 @@
       </w:rPr>
     </w:lvl>
   </w:abstractNum>
-  <w:abstractNum w:abstractNumId="17" w15:restartNumberingAfterBreak="0">
+  <w:abstractNum w:abstractNumId="21" w15:restartNumberingAfterBreak="0">
     <w:nsid w:val="57D843FE"/>
     <w:multiLevelType w:val="multilevel"/>
     <w:tmpl w:val="1809001F"/>
@@ -8479,7 +6924,7 @@
       </w:pPr>
     </w:lvl>
   </w:abstractNum>
-  <w:abstractNum w:abstractNumId="18" w15:restartNumberingAfterBreak="0">
+  <w:abstractNum w:abstractNumId="22" w15:restartNumberingAfterBreak="0">
     <w:nsid w:val="596E17BB"/>
     <w:multiLevelType w:val="multilevel"/>
     <w:tmpl w:val="1809001F"/>
@@ -8565,7 +7010,96 @@
       </w:pPr>
     </w:lvl>
   </w:abstractNum>
-  <w:abstractNum w:abstractNumId="19" w15:restartNumberingAfterBreak="0">
+  <w:abstractNum w:abstractNumId="23" w15:restartNumberingAfterBreak="0">
+    <w:nsid w:val="5B190D61"/>
+    <w:multiLevelType w:val="hybridMultilevel"/>
+    <w:tmpl w:val="94B8EC10"/>
+    <w:lvl w:ilvl="0" w:tplc="D3E0DB16">
+      <w:start w:val="4"/>
+      <w:numFmt w:val="decimal"/>
+      <w:lvlText w:val="%1"/>
+      <w:lvlJc w:val="left"/>
+      <w:pPr>
+        <w:ind w:left="720" w:hanging="360"/>
+      </w:pPr>
+      <w:rPr>
+        <w:rFonts w:hint="default"/>
+      </w:rPr>
+    </w:lvl>
+    <w:lvl w:ilvl="1" w:tplc="18090019" w:tentative="1">
+      <w:start w:val="1"/>
+      <w:numFmt w:val="lowerLetter"/>
+      <w:lvlText w:val="%2."/>
+      <w:lvlJc w:val="left"/>
+      <w:pPr>
+        <w:ind w:left="1440" w:hanging="360"/>
+      </w:pPr>
+    </w:lvl>
+    <w:lvl w:ilvl="2" w:tplc="1809001B" w:tentative="1">
+      <w:start w:val="1"/>
+      <w:numFmt w:val="lowerRoman"/>
+      <w:lvlText w:val="%3."/>
+      <w:lvlJc w:val="right"/>
+      <w:pPr>
+        <w:ind w:left="2160" w:hanging="180"/>
+      </w:pPr>
+    </w:lvl>
+    <w:lvl w:ilvl="3" w:tplc="1809000F" w:tentative="1">
+      <w:start w:val="1"/>
+      <w:numFmt w:val="decimal"/>
+      <w:lvlText w:val="%4."/>
+      <w:lvlJc w:val="left"/>
+      <w:pPr>
+        <w:ind w:left="2880" w:hanging="360"/>
+      </w:pPr>
+    </w:lvl>
+    <w:lvl w:ilvl="4" w:tplc="18090019" w:tentative="1">
+      <w:start w:val="1"/>
+      <w:numFmt w:val="lowerLetter"/>
+      <w:lvlText w:val="%5."/>
+      <w:lvlJc w:val="left"/>
+      <w:pPr>
+        <w:ind w:left="3600" w:hanging="360"/>
+      </w:pPr>
+    </w:lvl>
+    <w:lvl w:ilvl="5" w:tplc="1809001B" w:tentative="1">
+      <w:start w:val="1"/>
+      <w:numFmt w:val="lowerRoman"/>
+      <w:lvlText w:val="%6."/>
+      <w:lvlJc w:val="right"/>
+      <w:pPr>
+        <w:ind w:left="4320" w:hanging="180"/>
+      </w:pPr>
+    </w:lvl>
+    <w:lvl w:ilvl="6" w:tplc="1809000F" w:tentative="1">
+      <w:start w:val="1"/>
+      <w:numFmt w:val="decimal"/>
+      <w:lvlText w:val="%7."/>
+      <w:lvlJc w:val="left"/>
+      <w:pPr>
+        <w:ind w:left="5040" w:hanging="360"/>
+      </w:pPr>
+    </w:lvl>
+    <w:lvl w:ilvl="7" w:tplc="18090019" w:tentative="1">
+      <w:start w:val="1"/>
+      <w:numFmt w:val="lowerLetter"/>
+      <w:lvlText w:val="%8."/>
+      <w:lvlJc w:val="left"/>
+      <w:pPr>
+        <w:ind w:left="5760" w:hanging="360"/>
+      </w:pPr>
+    </w:lvl>
+    <w:lvl w:ilvl="8" w:tplc="1809001B" w:tentative="1">
+      <w:start w:val="1"/>
+      <w:numFmt w:val="lowerRoman"/>
+      <w:lvlText w:val="%9."/>
+      <w:lvlJc w:val="right"/>
+      <w:pPr>
+        <w:ind w:left="6480" w:hanging="180"/>
+      </w:pPr>
+    </w:lvl>
+  </w:abstractNum>
+  <w:abstractNum w:abstractNumId="24" w15:restartNumberingAfterBreak="0">
     <w:nsid w:val="62FF0E61"/>
     <w:multiLevelType w:val="multilevel"/>
     <w:tmpl w:val="1809001F"/>
@@ -8651,7 +7185,7 @@
       </w:pPr>
     </w:lvl>
   </w:abstractNum>
-  <w:abstractNum w:abstractNumId="20" w15:restartNumberingAfterBreak="0">
+  <w:abstractNum w:abstractNumId="25" w15:restartNumberingAfterBreak="0">
     <w:nsid w:val="65B35916"/>
     <w:multiLevelType w:val="multilevel"/>
     <w:tmpl w:val="C1FED04A"/>
@@ -8800,7 +7334,7 @@
       </w:rPr>
     </w:lvl>
   </w:abstractNum>
-  <w:abstractNum w:abstractNumId="21" w15:restartNumberingAfterBreak="0">
+  <w:abstractNum w:abstractNumId="26" w15:restartNumberingAfterBreak="0">
     <w:nsid w:val="76E157EA"/>
     <w:multiLevelType w:val="multilevel"/>
     <w:tmpl w:val="42A63998"/>
@@ -8913,7 +7447,7 @@
       </w:rPr>
     </w:lvl>
   </w:abstractNum>
-  <w:abstractNum w:abstractNumId="22" w15:restartNumberingAfterBreak="0">
+  <w:abstractNum w:abstractNumId="27" w15:restartNumberingAfterBreak="0">
     <w:nsid w:val="76F72D90"/>
     <w:multiLevelType w:val="multilevel"/>
     <w:tmpl w:val="1809001F"/>
@@ -8999,26 +7533,139 @@
       </w:pPr>
     </w:lvl>
   </w:abstractNum>
+  <w:abstractNum w:abstractNumId="28" w15:restartNumberingAfterBreak="0">
+    <w:nsid w:val="7CE70C90"/>
+    <w:multiLevelType w:val="hybridMultilevel"/>
+    <w:tmpl w:val="3A82EAE8"/>
+    <w:lvl w:ilvl="0" w:tplc="18090001">
+      <w:start w:val="1"/>
+      <w:numFmt w:val="bullet"/>
+      <w:lvlText w:val=""/>
+      <w:lvlJc w:val="left"/>
+      <w:pPr>
+        <w:ind w:left="720" w:hanging="360"/>
+      </w:pPr>
+      <w:rPr>
+        <w:rFonts w:ascii="Symbol" w:hAnsi="Symbol" w:hint="default"/>
+      </w:rPr>
+    </w:lvl>
+    <w:lvl w:ilvl="1" w:tplc="18090003" w:tentative="1">
+      <w:start w:val="1"/>
+      <w:numFmt w:val="bullet"/>
+      <w:lvlText w:val="o"/>
+      <w:lvlJc w:val="left"/>
+      <w:pPr>
+        <w:ind w:left="1440" w:hanging="360"/>
+      </w:pPr>
+      <w:rPr>
+        <w:rFonts w:ascii="Courier New" w:hAnsi="Courier New" w:cs="Courier New" w:hint="default"/>
+      </w:rPr>
+    </w:lvl>
+    <w:lvl w:ilvl="2" w:tplc="18090005" w:tentative="1">
+      <w:start w:val="1"/>
+      <w:numFmt w:val="bullet"/>
+      <w:lvlText w:val=""/>
+      <w:lvlJc w:val="left"/>
+      <w:pPr>
+        <w:ind w:left="2160" w:hanging="360"/>
+      </w:pPr>
+      <w:rPr>
+        <w:rFonts w:ascii="Wingdings" w:hAnsi="Wingdings" w:hint="default"/>
+      </w:rPr>
+    </w:lvl>
+    <w:lvl w:ilvl="3" w:tplc="18090001" w:tentative="1">
+      <w:start w:val="1"/>
+      <w:numFmt w:val="bullet"/>
+      <w:lvlText w:val=""/>
+      <w:lvlJc w:val="left"/>
+      <w:pPr>
+        <w:ind w:left="2880" w:hanging="360"/>
+      </w:pPr>
+      <w:rPr>
+        <w:rFonts w:ascii="Symbol" w:hAnsi="Symbol" w:hint="default"/>
+      </w:rPr>
+    </w:lvl>
+    <w:lvl w:ilvl="4" w:tplc="18090003" w:tentative="1">
+      <w:start w:val="1"/>
+      <w:numFmt w:val="bullet"/>
+      <w:lvlText w:val="o"/>
+      <w:lvlJc w:val="left"/>
+      <w:pPr>
+        <w:ind w:left="3600" w:hanging="360"/>
+      </w:pPr>
+      <w:rPr>
+        <w:rFonts w:ascii="Courier New" w:hAnsi="Courier New" w:cs="Courier New" w:hint="default"/>
+      </w:rPr>
+    </w:lvl>
+    <w:lvl w:ilvl="5" w:tplc="18090005" w:tentative="1">
+      <w:start w:val="1"/>
+      <w:numFmt w:val="bullet"/>
+      <w:lvlText w:val=""/>
+      <w:lvlJc w:val="left"/>
+      <w:pPr>
+        <w:ind w:left="4320" w:hanging="360"/>
+      </w:pPr>
+      <w:rPr>
+        <w:rFonts w:ascii="Wingdings" w:hAnsi="Wingdings" w:hint="default"/>
+      </w:rPr>
+    </w:lvl>
+    <w:lvl w:ilvl="6" w:tplc="18090001" w:tentative="1">
+      <w:start w:val="1"/>
+      <w:numFmt w:val="bullet"/>
+      <w:lvlText w:val=""/>
+      <w:lvlJc w:val="left"/>
+      <w:pPr>
+        <w:ind w:left="5040" w:hanging="360"/>
+      </w:pPr>
+      <w:rPr>
+        <w:rFonts w:ascii="Symbol" w:hAnsi="Symbol" w:hint="default"/>
+      </w:rPr>
+    </w:lvl>
+    <w:lvl w:ilvl="7" w:tplc="18090003" w:tentative="1">
+      <w:start w:val="1"/>
+      <w:numFmt w:val="bullet"/>
+      <w:lvlText w:val="o"/>
+      <w:lvlJc w:val="left"/>
+      <w:pPr>
+        <w:ind w:left="5760" w:hanging="360"/>
+      </w:pPr>
+      <w:rPr>
+        <w:rFonts w:ascii="Courier New" w:hAnsi="Courier New" w:cs="Courier New" w:hint="default"/>
+      </w:rPr>
+    </w:lvl>
+    <w:lvl w:ilvl="8" w:tplc="18090005" w:tentative="1">
+      <w:start w:val="1"/>
+      <w:numFmt w:val="bullet"/>
+      <w:lvlText w:val=""/>
+      <w:lvlJc w:val="left"/>
+      <w:pPr>
+        <w:ind w:left="6480" w:hanging="360"/>
+      </w:pPr>
+      <w:rPr>
+        <w:rFonts w:ascii="Wingdings" w:hAnsi="Wingdings" w:hint="default"/>
+      </w:rPr>
+    </w:lvl>
+  </w:abstractNum>
   <w:num w:numId="1" w16cid:durableId="164783103">
-    <w:abstractNumId w:val="9"/>
+    <w:abstractNumId w:val="12"/>
   </w:num>
   <w:num w:numId="2" w16cid:durableId="1974363537">
     <w:abstractNumId w:val="5"/>
   </w:num>
   <w:num w:numId="3" w16cid:durableId="1154569728">
-    <w:abstractNumId w:val="17"/>
+    <w:abstractNumId w:val="21"/>
   </w:num>
   <w:num w:numId="4" w16cid:durableId="2124879464">
-    <w:abstractNumId w:val="19"/>
+    <w:abstractNumId w:val="24"/>
   </w:num>
   <w:num w:numId="5" w16cid:durableId="498275244">
+    <w:abstractNumId w:val="22"/>
+  </w:num>
+  <w:num w:numId="6" w16cid:durableId="1466855395">
     <w:abstractNumId w:val="18"/>
   </w:num>
-  <w:num w:numId="6" w16cid:durableId="1466855395">
-    <w:abstractNumId w:val="15"/>
-  </w:num>
   <w:num w:numId="7" w16cid:durableId="158809926">
-    <w:abstractNumId w:val="22"/>
+    <w:abstractNumId w:val="27"/>
   </w:num>
   <w:num w:numId="8" w16cid:durableId="689723603">
     <w:abstractNumId w:val="7"/>
@@ -9027,13 +7674,13 @@
     <w:abstractNumId w:val="3"/>
   </w:num>
   <w:num w:numId="10" w16cid:durableId="417095995">
-    <w:abstractNumId w:val="21"/>
+    <w:abstractNumId w:val="26"/>
   </w:num>
   <w:num w:numId="11" w16cid:durableId="996961976">
     <w:abstractNumId w:val="1"/>
   </w:num>
   <w:num w:numId="12" w16cid:durableId="374893155">
-    <w:abstractNumId w:val="11"/>
+    <w:abstractNumId w:val="14"/>
   </w:num>
   <w:num w:numId="13" w16cid:durableId="691999202">
     <w:abstractNumId w:val="4"/>
@@ -9042,10 +7689,10 @@
     <w:abstractNumId w:val="2"/>
   </w:num>
   <w:num w:numId="15" w16cid:durableId="875894764">
-    <w:abstractNumId w:val="12"/>
+    <w:abstractNumId w:val="15"/>
   </w:num>
   <w:num w:numId="16" w16cid:durableId="589235824">
-    <w:abstractNumId w:val="20"/>
+    <w:abstractNumId w:val="25"/>
   </w:num>
   <w:num w:numId="17" w16cid:durableId="1602565703">
     <w:abstractNumId w:val="6"/>
@@ -9054,19 +7701,37 @@
     <w:abstractNumId w:val="0"/>
   </w:num>
   <w:num w:numId="19" w16cid:durableId="725033526">
+    <w:abstractNumId w:val="9"/>
+  </w:num>
+  <w:num w:numId="20" w16cid:durableId="1298686657">
+    <w:abstractNumId w:val="16"/>
+  </w:num>
+  <w:num w:numId="21" w16cid:durableId="299459585">
+    <w:abstractNumId w:val="13"/>
+  </w:num>
+  <w:num w:numId="22" w16cid:durableId="931208807">
+    <w:abstractNumId w:val="17"/>
+  </w:num>
+  <w:num w:numId="23" w16cid:durableId="1628928432">
+    <w:abstractNumId w:val="20"/>
+  </w:num>
+  <w:num w:numId="24" w16cid:durableId="1399591902">
+    <w:abstractNumId w:val="23"/>
+  </w:num>
+  <w:num w:numId="25" w16cid:durableId="1084110129">
     <w:abstractNumId w:val="8"/>
   </w:num>
-  <w:num w:numId="20" w16cid:durableId="1298686657">
-    <w:abstractNumId w:val="13"/>
-  </w:num>
-  <w:num w:numId="21" w16cid:durableId="299459585">
+  <w:num w:numId="26" w16cid:durableId="210508442">
     <w:abstractNumId w:val="10"/>
   </w:num>
-  <w:num w:numId="22" w16cid:durableId="931208807">
-    <w:abstractNumId w:val="14"/>
+  <w:num w:numId="27" w16cid:durableId="1784110418">
+    <w:abstractNumId w:val="19"/>
   </w:num>
-  <w:num w:numId="23" w16cid:durableId="1628928432">
-    <w:abstractNumId w:val="16"/>
+  <w:num w:numId="28" w16cid:durableId="1667324119">
+    <w:abstractNumId w:val="28"/>
+  </w:num>
+  <w:num w:numId="29" w16cid:durableId="1068311371">
+    <w:abstractNumId w:val="11"/>
   </w:num>
 </w:numbering>
 </file>

</xml_diff>